<commit_message>
v1.4: Módulo de Productividad Urbana en Frente XII
- Agenda de productividad/competitividad sobre la economía existente
- Recualificación, extensionismo pyme, fin del enano fiscal, competencia, clústeres urbanos
- Métricas de productividad (valor agregado por trabajador, graduación de firmas)
</commit_message>
<xml_diff>
--- a/dist/estado-en-el-territorio.docx
+++ b/dist/estado-en-el-territorio.docx
@@ -15784,7 +15784,7 @@
     </w:p>
     <w:bookmarkEnd w:id="76"/>
     <w:bookmarkEnd w:id="77"/>
-    <w:bookmarkStart w:id="82" w:name="X4f62eec2f5b561c9a3006ff1624de90841123b4"/>
+    <w:bookmarkStart w:id="91" w:name="X4f62eec2f5b561c9a3006ff1624de90841123b4"/>
     <w:p>
       <w:pPr>
         <w:pStyle w:val="Heading1"/>
@@ -16398,13 +16398,1723 @@
       </w:r>
     </w:p>
     <w:bookmarkEnd w:id="79"/>
-    <w:bookmarkStart w:id="80" w:name="X1bba574aa25410650f7841df1158dd6ea3828c5"/>
+    <w:bookmarkStart w:id="88" w:name="X3bb78ace0de402ec778ca3bbacad90ae0c7952d"/>
     <w:p>
       <w:pPr>
         <w:pStyle w:val="Heading2"/>
       </w:pPr>
       <w:r>
-        <w:t xml:space="preserve">12.3 El turismo — estrategia de alto impacto dentro del presupuesto</w:t>
+        <w:t xml:space="preserve">12.3 Módulo de Productividad Urbana — activar la economía que ya existe</w:t>
+      </w:r>
+    </w:p>
+    <w:p>
+      <w:pPr>
+        <w:pStyle w:val="FirstParagraph"/>
+      </w:pPr>
+      <w:r>
+        <w:t xml:space="preserve">Este módulo responde a una incoherencia del propio plan: el principio rector</w:t>
+      </w:r>
+      <w:r>
+        <w:t xml:space="preserve"> </w:t>
+      </w:r>
+      <w:r>
+        <w:t xml:space="preserve">“</w:t>
+      </w:r>
+      <w:r>
+        <w:t xml:space="preserve">activar lo que ya se pagó</w:t>
+      </w:r>
+      <w:r>
+        <w:t xml:space="preserve">”</w:t>
+      </w:r>
+      <w:r>
+        <w:t xml:space="preserve"> </w:t>
+      </w:r>
+      <w:r>
+        <w:t xml:space="preserve">se aplicaba solo a la infraestructura (terminar el puerto, dragar el río), no al tejido productivo. Aplicado a las empresas y los trabajadores que ya existen, ese mismo principio dice:</w:t>
+      </w:r>
+      <w:r>
+        <w:t xml:space="preserve"> </w:t>
+      </w:r>
+      <w:r>
+        <w:rPr>
+          <w:bCs/>
+          <w:b/>
+        </w:rPr>
+        <w:t xml:space="preserve">subir la productividad del stock productivo actual rinde más que crear empleo nuevo en la periferia.</w:t>
+      </w:r>
+      <w:r>
+        <w:t xml:space="preserve"> </w:t>
+      </w:r>
+      <w:r>
+        <w:t xml:space="preserve">Es la pieza que faltaba para que el plan sirva a la</w:t>
+      </w:r>
+      <w:r>
+        <w:t xml:space="preserve"> </w:t>
+      </w:r>
+      <w:r>
+        <w:rPr>
+          <w:iCs/>
+          <w:i/>
+        </w:rPr>
+        <w:t xml:space="preserve">competitividad nacional</w:t>
+      </w:r>
+      <w:r>
+        <w:t xml:space="preserve">, no solo a la justicia territorial.</w:t>
+      </w:r>
+    </w:p>
+    <w:p>
+      <w:pPr>
+        <w:pStyle w:val="BlockText"/>
+      </w:pPr>
+      <w:r>
+        <w:rPr>
+          <w:bCs/>
+          <w:b/>
+        </w:rPr>
+        <w:t xml:space="preserve">Por qué es necesario (diagnóstico 2025–2026):</w:t>
+      </w:r>
+      <w:r>
+        <w:t xml:space="preserve"> </w:t>
+      </w:r>
+      <w:r>
+        <w:t xml:space="preserve">Colombia logró el desempleo más bajo del siglo mientras la productividad por trabajador</w:t>
+      </w:r>
+      <w:r>
+        <w:t xml:space="preserve"> </w:t>
+      </w:r>
+      <w:r>
+        <w:rPr>
+          <w:iCs/>
+          <w:i/>
+        </w:rPr>
+        <w:t xml:space="preserve">cayó</w:t>
+      </w:r>
+      <w:r>
+        <w:t xml:space="preserve"> </w:t>
+      </w:r>
+      <w:r>
+        <w:t xml:space="preserve">~3,1% (2022–2025) y la PTF apenas creció ~0,9%. El empleo crece en servicios de baja productividad; la transformación estructural se redujo a la mitad en una década. El país demuestra que crear empleo formal y subir la productividad</w:t>
+      </w:r>
+      <w:r>
+        <w:t xml:space="preserve"> </w:t>
+      </w:r>
+      <w:r>
+        <w:rPr>
+          <w:bCs/>
+          <w:b/>
+        </w:rPr>
+        <w:t xml:space="preserve">no son lo mismo</w:t>
+      </w:r>
+      <w:r>
+        <w:t xml:space="preserve">. Este módulo ataca lo segundo, donde vive el 80% urbano y el grueso de las firmas formales.</w:t>
+      </w:r>
+    </w:p>
+    <w:p>
+      <w:pPr>
+        <w:pStyle w:val="FirstParagraph"/>
+      </w:pPr>
+      <w:r>
+        <w:rPr>
+          <w:bCs/>
+          <w:b/>
+        </w:rPr>
+        <w:t xml:space="preserve">Distinción honesta:</w:t>
+      </w:r>
+      <w:r>
+        <w:t xml:space="preserve"> </w:t>
+      </w:r>
+      <w:r>
+        <w:t xml:space="preserve">los nodos persiguen seguridad, equidad y control territorial (las dos raíces). Este módulo persigue productividad y competitividad. Son objetivos distintos que viven en lugares distintos; el módulo corre</w:t>
+      </w:r>
+      <w:r>
+        <w:t xml:space="preserve"> </w:t>
+      </w:r>
+      <w:r>
+        <w:rPr>
+          <w:bCs/>
+          <w:b/>
+        </w:rPr>
+        <w:t xml:space="preserve">en paralelo</w:t>
+      </w:r>
+      <w:r>
+        <w:t xml:space="preserve"> </w:t>
+      </w:r>
+      <w:r>
+        <w:t xml:space="preserve">a los nodos, no los reemplaza.</w:t>
+      </w:r>
+    </w:p>
+    <w:bookmarkStart w:id="80" w:name="X341be06a04fa5cc37ba2f7ed5953662c8f247e0"/>
+    <w:p>
+      <w:pPr>
+        <w:pStyle w:val="Heading3"/>
+      </w:pPr>
+      <w:r>
+        <w:t xml:space="preserve">A. Recualificación del trabajador en activo</w:t>
+      </w:r>
+    </w:p>
+    <w:p>
+      <w:pPr>
+        <w:pStyle w:val="FirstParagraph"/>
+      </w:pPr>
+      <w:r>
+        <w:t xml:space="preserve">El plan vuelca su capital humano en jóvenes y en el Servicio, y deja desatendido al trabajador adulto urbano ya empleado —cuya productividad es la que cuenta hoy—.</w:t>
+      </w:r>
+    </w:p>
+    <w:tbl>
+      <w:tblPr>
+        <w:tblStyle w:val="Table"/>
+        <w:tblW w:type="pct" w:w="5000"/>
+        <w:tblLook w:firstRow="1" w:lastRow="0" w:firstColumn="0" w:lastColumn="0" w:noHBand="0" w:noVBand="0" w:val="0020"/>
+        <w:jc w:val="start"/>
+      </w:tblPr>
+      <w:tblGrid>
+        <w:gridCol w:w="1980"/>
+        <w:gridCol w:w="1980"/>
+        <w:gridCol w:w="1980"/>
+        <w:gridCol w:w="1980"/>
+      </w:tblGrid>
+      <w:tr>
+        <w:trPr>
+          <w:tblHeader w:val="true"/>
+        </w:trPr>
+        <w:tc>
+          <w:tcPr/>
+          <w:p>
+            <w:pPr>
+              <w:pStyle w:val="Compact"/>
+              <w:jc w:val="left"/>
+            </w:pPr>
+            <w:r>
+              <w:t xml:space="preserve">Medida</w:t>
+            </w:r>
+          </w:p>
+        </w:tc>
+        <w:tc>
+          <w:tcPr/>
+          <w:p>
+            <w:pPr>
+              <w:pStyle w:val="Compact"/>
+              <w:jc w:val="left"/>
+            </w:pPr>
+            <w:r>
+              <w:t xml:space="preserve">Concreción</w:t>
+            </w:r>
+          </w:p>
+        </w:tc>
+        <w:tc>
+          <w:tcPr/>
+          <w:p>
+            <w:pPr>
+              <w:pStyle w:val="Compact"/>
+              <w:jc w:val="left"/>
+            </w:pPr>
+            <w:r>
+              <w:t xml:space="preserve">Vía jurídica</w:t>
+            </w:r>
+          </w:p>
+        </w:tc>
+        <w:tc>
+          <w:tcPr/>
+          <w:p>
+            <w:pPr>
+              <w:pStyle w:val="Compact"/>
+              <w:jc w:val="left"/>
+            </w:pPr>
+            <w:r>
+              <w:t xml:space="preserve">Plazo</w:t>
+            </w:r>
+          </w:p>
+        </w:tc>
+      </w:tr>
+      <w:tr>
+        <w:tc>
+          <w:tcPr/>
+          <w:p>
+            <w:pPr>
+              <w:pStyle w:val="Compact"/>
+              <w:jc w:val="left"/>
+            </w:pPr>
+            <w:r>
+              <w:t xml:space="preserve">Formación continua con incentivo</w:t>
+            </w:r>
+          </w:p>
+        </w:tc>
+        <w:tc>
+          <w:tcPr/>
+          <w:p>
+            <w:pPr>
+              <w:pStyle w:val="Compact"/>
+              <w:jc w:val="left"/>
+            </w:pPr>
+            <w:r>
+              <w:t xml:space="preserve">Deducción tributaria a la empresa que recualifica a su nómina en competencias verificables (digitales, gestión, técnicas); certificación SENA</w:t>
+            </w:r>
+          </w:p>
+        </w:tc>
+        <w:tc>
+          <w:tcPr/>
+          <w:p>
+            <w:pPr>
+              <w:pStyle w:val="Compact"/>
+              <w:jc w:val="left"/>
+            </w:pPr>
+            <w:r>
+              <w:t xml:space="preserve">Ley ordinaria (incentivo) + reglamento</w:t>
+            </w:r>
+          </w:p>
+        </w:tc>
+        <w:tc>
+          <w:tcPr/>
+          <w:p>
+            <w:pPr>
+              <w:pStyle w:val="Compact"/>
+              <w:jc w:val="left"/>
+            </w:pPr>
+            <w:r>
+              <w:t xml:space="preserve">Año 1–2</w:t>
+            </w:r>
+          </w:p>
+        </w:tc>
+      </w:tr>
+      <w:tr>
+        <w:tc>
+          <w:tcPr/>
+          <w:p>
+            <w:pPr>
+              <w:pStyle w:val="Compact"/>
+              <w:jc w:val="left"/>
+            </w:pPr>
+            <w:r>
+              <w:t xml:space="preserve">Reconocimiento de aprendizajes previos (RPL)</w:t>
+            </w:r>
+          </w:p>
+        </w:tc>
+        <w:tc>
+          <w:tcPr/>
+          <w:p>
+            <w:pPr>
+              <w:pStyle w:val="Compact"/>
+              <w:jc w:val="left"/>
+            </w:pPr>
+            <w:r>
+              <w:t xml:space="preserve">Certificar por evaluación lo que el trabajador informal ya sabe hacer, sin repetir cursos; convierte experiencia en credencial portable</w:t>
+            </w:r>
+          </w:p>
+        </w:tc>
+        <w:tc>
+          <w:tcPr/>
+          <w:p>
+            <w:pPr>
+              <w:pStyle w:val="Compact"/>
+              <w:jc w:val="left"/>
+            </w:pPr>
+            <w:r>
+              <w:t xml:space="preserve">Decreto + SENA</w:t>
+            </w:r>
+          </w:p>
+        </w:tc>
+        <w:tc>
+          <w:tcPr/>
+          <w:p>
+            <w:pPr>
+              <w:pStyle w:val="Compact"/>
+              <w:jc w:val="left"/>
+            </w:pPr>
+            <w:r>
+              <w:t xml:space="preserve">Año 1</w:t>
+            </w:r>
+          </w:p>
+        </w:tc>
+      </w:tr>
+      <w:tr>
+        <w:tc>
+          <w:tcPr/>
+          <w:p>
+            <w:pPr>
+              <w:pStyle w:val="Compact"/>
+              <w:jc w:val="left"/>
+            </w:pPr>
+            <w:r>
+              <w:t xml:space="preserve">Reconversión de sectores en transición</w:t>
+            </w:r>
+          </w:p>
+        </w:tc>
+        <w:tc>
+          <w:tcPr/>
+          <w:p>
+            <w:pPr>
+              <w:pStyle w:val="Compact"/>
+              <w:jc w:val="left"/>
+            </w:pPr>
+            <w:r>
+              <w:t xml:space="preserve">Rutas de reentrenamiento para trabajadores de sectores que se contraen (p. ej. transición energética) hacia ocupaciones de mayor productividad</w:t>
+            </w:r>
+          </w:p>
+        </w:tc>
+        <w:tc>
+          <w:tcPr/>
+          <w:p>
+            <w:pPr>
+              <w:pStyle w:val="Compact"/>
+              <w:jc w:val="left"/>
+            </w:pPr>
+            <w:r>
+              <w:t xml:space="preserve">Decreto + SENA + Min. Trabajo</w:t>
+            </w:r>
+          </w:p>
+        </w:tc>
+        <w:tc>
+          <w:tcPr/>
+          <w:p>
+            <w:pPr>
+              <w:pStyle w:val="Compact"/>
+              <w:jc w:val="left"/>
+            </w:pPr>
+            <w:r>
+              <w:t xml:space="preserve">Años 1–4</w:t>
+            </w:r>
+          </w:p>
+        </w:tc>
+      </w:tr>
+    </w:tbl>
+    <w:bookmarkEnd w:id="80"/>
+    <w:bookmarkStart w:id="81" w:name="X3a26c1fbb94e9c58c15e5ffc2bc14e60aa837a2"/>
+    <w:p>
+      <w:pPr>
+        <w:pStyle w:val="Heading3"/>
+      </w:pPr>
+      <w:r>
+        <w:t xml:space="preserve">B. Extensionismo tecnológico y de gestión para pymes — difusión, no invención</w:t>
+      </w:r>
+    </w:p>
+    <w:p>
+      <w:pPr>
+        <w:pStyle w:val="FirstParagraph"/>
+      </w:pPr>
+      <w:r>
+        <w:t xml:space="preserve">La mayor ganancia de productividad no está en inventar, sino en que la firma promedio adopte lo que ya existe. La brecha entre la pyme media y la buena es, casi siempre, de gestión y tecnología disponible.</w:t>
+      </w:r>
+    </w:p>
+    <w:tbl>
+      <w:tblPr>
+        <w:tblStyle w:val="Table"/>
+        <w:tblW w:type="pct" w:w="5000"/>
+        <w:tblLook w:firstRow="1" w:lastRow="0" w:firstColumn="0" w:lastColumn="0" w:noHBand="0" w:noVBand="0" w:val="0020"/>
+        <w:jc w:val="start"/>
+      </w:tblPr>
+      <w:tblGrid>
+        <w:gridCol w:w="1980"/>
+        <w:gridCol w:w="1980"/>
+        <w:gridCol w:w="1980"/>
+        <w:gridCol w:w="1980"/>
+      </w:tblGrid>
+      <w:tr>
+        <w:trPr>
+          <w:tblHeader w:val="true"/>
+        </w:trPr>
+        <w:tc>
+          <w:tcPr/>
+          <w:p>
+            <w:pPr>
+              <w:pStyle w:val="Compact"/>
+              <w:jc w:val="left"/>
+            </w:pPr>
+            <w:r>
+              <w:t xml:space="preserve">Medida</w:t>
+            </w:r>
+          </w:p>
+        </w:tc>
+        <w:tc>
+          <w:tcPr/>
+          <w:p>
+            <w:pPr>
+              <w:pStyle w:val="Compact"/>
+              <w:jc w:val="left"/>
+            </w:pPr>
+            <w:r>
+              <w:t xml:space="preserve">Concreción</w:t>
+            </w:r>
+          </w:p>
+        </w:tc>
+        <w:tc>
+          <w:tcPr/>
+          <w:p>
+            <w:pPr>
+              <w:pStyle w:val="Compact"/>
+              <w:jc w:val="left"/>
+            </w:pPr>
+            <w:r>
+              <w:t xml:space="preserve">Vía jurídica</w:t>
+            </w:r>
+          </w:p>
+        </w:tc>
+        <w:tc>
+          <w:tcPr/>
+          <w:p>
+            <w:pPr>
+              <w:pStyle w:val="Compact"/>
+              <w:jc w:val="left"/>
+            </w:pPr>
+            <w:r>
+              <w:t xml:space="preserve">Plazo</w:t>
+            </w:r>
+          </w:p>
+        </w:tc>
+      </w:tr>
+      <w:tr>
+        <w:tc>
+          <w:tcPr/>
+          <w:p>
+            <w:pPr>
+              <w:pStyle w:val="Compact"/>
+              <w:jc w:val="left"/>
+            </w:pPr>
+            <w:r>
+              <w:t xml:space="preserve">Red de extensionismo para pymes (modelo MEP de EE.UU.)</w:t>
+            </w:r>
+          </w:p>
+        </w:tc>
+        <w:tc>
+          <w:tcPr/>
+          <w:p>
+            <w:pPr>
+              <w:pStyle w:val="Compact"/>
+              <w:jc w:val="left"/>
+            </w:pPr>
+            <w:r>
+              <w:t xml:space="preserve">Asesores que entran a la pyme y mejoran procesos, calidad, costos y adopción digital; cofinanciado, con metas de productividad verificadas</w:t>
+            </w:r>
+          </w:p>
+        </w:tc>
+        <w:tc>
+          <w:tcPr/>
+          <w:p>
+            <w:pPr>
+              <w:pStyle w:val="Compact"/>
+              <w:jc w:val="left"/>
+            </w:pPr>
+            <w:r>
+              <w:t xml:space="preserve">Decreto + presupuesto (vía administrativa)</w:t>
+            </w:r>
+          </w:p>
+        </w:tc>
+        <w:tc>
+          <w:tcPr/>
+          <w:p>
+            <w:pPr>
+              <w:pStyle w:val="Compact"/>
+              <w:jc w:val="left"/>
+            </w:pPr>
+            <w:r>
+              <w:t xml:space="preserve">Año 1 (piloto), 2–4 (escala)</w:t>
+            </w:r>
+          </w:p>
+        </w:tc>
+      </w:tr>
+      <w:tr>
+        <w:tc>
+          <w:tcPr/>
+          <w:p>
+            <w:pPr>
+              <w:pStyle w:val="Compact"/>
+              <w:jc w:val="left"/>
+            </w:pPr>
+            <w:r>
+              <w:t xml:space="preserve">Adopción digital básica</w:t>
+            </w:r>
+          </w:p>
+        </w:tc>
+        <w:tc>
+          <w:tcPr/>
+          <w:p>
+            <w:pPr>
+              <w:pStyle w:val="Compact"/>
+              <w:jc w:val="left"/>
+            </w:pPr>
+            <w:r>
+              <w:t xml:space="preserve">Facturación electrónica, inventarios, pagos digitales, presencia en marketplace;</w:t>
+            </w:r>
+            <w:r>
+              <w:t xml:space="preserve"> </w:t>
+            </w:r>
+            <w:r>
+              <w:t xml:space="preserve">“</w:t>
+            </w:r>
+            <w:r>
+              <w:t xml:space="preserve">kit digital</w:t>
+            </w:r>
+            <w:r>
+              <w:t xml:space="preserve">”</w:t>
+            </w:r>
+            <w:r>
+              <w:t xml:space="preserve"> </w:t>
+            </w:r>
+            <w:r>
+              <w:t xml:space="preserve">subsidiado para microempresa formal</w:t>
+            </w:r>
+          </w:p>
+        </w:tc>
+        <w:tc>
+          <w:tcPr/>
+          <w:p>
+            <w:pPr>
+              <w:pStyle w:val="Compact"/>
+              <w:jc w:val="left"/>
+            </w:pPr>
+            <w:r>
+              <w:t xml:space="preserve">Decreto + Min. TIC</w:t>
+            </w:r>
+          </w:p>
+        </w:tc>
+        <w:tc>
+          <w:tcPr/>
+          <w:p>
+            <w:pPr>
+              <w:pStyle w:val="Compact"/>
+              <w:jc w:val="left"/>
+            </w:pPr>
+            <w:r>
+              <w:t xml:space="preserve">Año 1</w:t>
+            </w:r>
+          </w:p>
+        </w:tc>
+      </w:tr>
+      <w:tr>
+        <w:tc>
+          <w:tcPr/>
+          <w:p>
+            <w:pPr>
+              <w:pStyle w:val="Compact"/>
+              <w:jc w:val="left"/>
+            </w:pPr>
+            <w:r>
+              <w:t xml:space="preserve">Compras públicas como jalonador de calidad</w:t>
+            </w:r>
+          </w:p>
+        </w:tc>
+        <w:tc>
+          <w:tcPr/>
+          <w:p>
+            <w:pPr>
+              <w:pStyle w:val="Compact"/>
+              <w:jc w:val="left"/>
+            </w:pPr>
+            <w:r>
+              <w:t xml:space="preserve">El Estado premia en sus compras a la pyme que adopta estándares de calidad/productividad verificables (no solo precio)</w:t>
+            </w:r>
+          </w:p>
+        </w:tc>
+        <w:tc>
+          <w:tcPr/>
+          <w:p>
+            <w:pPr>
+              <w:pStyle w:val="Compact"/>
+              <w:jc w:val="left"/>
+            </w:pPr>
+            <w:r>
+              <w:t xml:space="preserve">Reglamento de contratación</w:t>
+            </w:r>
+          </w:p>
+        </w:tc>
+        <w:tc>
+          <w:tcPr/>
+          <w:p>
+            <w:pPr>
+              <w:pStyle w:val="Compact"/>
+              <w:jc w:val="left"/>
+            </w:pPr>
+            <w:r>
+              <w:t xml:space="preserve">Año 2</w:t>
+            </w:r>
+          </w:p>
+        </w:tc>
+      </w:tr>
+    </w:tbl>
+    <w:bookmarkEnd w:id="81"/>
+    <w:bookmarkStart w:id="82" w:name="X5826c0a2fdfb3dc8e5e521d287a14b0893cfbf6"/>
+    <w:p>
+      <w:pPr>
+        <w:pStyle w:val="Heading3"/>
+      </w:pPr>
+      <w:r>
+        <w:t xml:space="preserve">C. Fin del castigo al crecimiento — el</w:t>
+      </w:r>
+      <w:r>
+        <w:t xml:space="preserve"> </w:t>
+      </w:r>
+      <w:r>
+        <w:t xml:space="preserve">“</w:t>
+      </w:r>
+      <w:r>
+        <w:t xml:space="preserve">enano fiscal</w:t>
+      </w:r>
+      <w:r>
+        <w:t xml:space="preserve">”</w:t>
+      </w:r>
+    </w:p>
+    <w:p>
+      <w:pPr>
+        <w:pStyle w:val="FirstParagraph"/>
+      </w:pPr>
+      <w:r>
+        <w:t xml:space="preserve">Muchas firmas se quedan pequeñas a propósito para no cruzar los umbrales que disparan costos regulatorios y tributarios. Esa es pérdida de productividad pura: la</w:t>
+      </w:r>
+      <w:r>
+        <w:t xml:space="preserve"> </w:t>
+      </w:r>
+      <w:r>
+        <w:t xml:space="preserve">“</w:t>
+      </w:r>
+      <w:r>
+        <w:t xml:space="preserve">mitad faltante</w:t>
+      </w:r>
+      <w:r>
+        <w:t xml:space="preserve">”</w:t>
+      </w:r>
+      <w:r>
+        <w:t xml:space="preserve"> </w:t>
+      </w:r>
+      <w:r>
+        <w:t xml:space="preserve">no aparece. Corregirlo es ganancia de reasignación, casi sin gasto.</w:t>
+      </w:r>
+    </w:p>
+    <w:tbl>
+      <w:tblPr>
+        <w:tblStyle w:val="Table"/>
+        <w:tblW w:type="pct" w:w="5000"/>
+        <w:tblLook w:firstRow="1" w:lastRow="0" w:firstColumn="0" w:lastColumn="0" w:noHBand="0" w:noVBand="0" w:val="0020"/>
+        <w:jc w:val="start"/>
+      </w:tblPr>
+      <w:tblGrid>
+        <w:gridCol w:w="1980"/>
+        <w:gridCol w:w="1980"/>
+        <w:gridCol w:w="1980"/>
+        <w:gridCol w:w="1980"/>
+      </w:tblGrid>
+      <w:tr>
+        <w:trPr>
+          <w:tblHeader w:val="true"/>
+        </w:trPr>
+        <w:tc>
+          <w:tcPr/>
+          <w:p>
+            <w:pPr>
+              <w:pStyle w:val="Compact"/>
+              <w:jc w:val="left"/>
+            </w:pPr>
+            <w:r>
+              <w:t xml:space="preserve">Medida</w:t>
+            </w:r>
+          </w:p>
+        </w:tc>
+        <w:tc>
+          <w:tcPr/>
+          <w:p>
+            <w:pPr>
+              <w:pStyle w:val="Compact"/>
+              <w:jc w:val="left"/>
+            </w:pPr>
+            <w:r>
+              <w:t xml:space="preserve">Concreción</w:t>
+            </w:r>
+          </w:p>
+        </w:tc>
+        <w:tc>
+          <w:tcPr/>
+          <w:p>
+            <w:pPr>
+              <w:pStyle w:val="Compact"/>
+              <w:jc w:val="left"/>
+            </w:pPr>
+            <w:r>
+              <w:t xml:space="preserve">Vía jurídica</w:t>
+            </w:r>
+          </w:p>
+        </w:tc>
+        <w:tc>
+          <w:tcPr/>
+          <w:p>
+            <w:pPr>
+              <w:pStyle w:val="Compact"/>
+              <w:jc w:val="left"/>
+            </w:pPr>
+            <w:r>
+              <w:t xml:space="preserve">Plazo</w:t>
+            </w:r>
+          </w:p>
+        </w:tc>
+      </w:tr>
+      <w:tr>
+        <w:tc>
+          <w:tcPr/>
+          <w:p>
+            <w:pPr>
+              <w:pStyle w:val="Compact"/>
+              <w:jc w:val="left"/>
+            </w:pPr>
+            <w:r>
+              <w:t xml:space="preserve">Transición suave de obligaciones por tamaño</w:t>
+            </w:r>
+          </w:p>
+        </w:tc>
+        <w:tc>
+          <w:tcPr/>
+          <w:p>
+            <w:pPr>
+              <w:pStyle w:val="Compact"/>
+              <w:jc w:val="left"/>
+            </w:pPr>
+            <w:r>
+              <w:t xml:space="preserve">Que cruzar un umbral de tamaño no dispare costos de golpe: rampa gradual en vez de salto, para que crecer no se castigue</w:t>
+            </w:r>
+          </w:p>
+        </w:tc>
+        <w:tc>
+          <w:tcPr/>
+          <w:p>
+            <w:pPr>
+              <w:pStyle w:val="Compact"/>
+              <w:jc w:val="left"/>
+            </w:pPr>
+            <w:r>
+              <w:t xml:space="preserve">Ley ordinaria (tributaria/laboral)</w:t>
+            </w:r>
+          </w:p>
+        </w:tc>
+        <w:tc>
+          <w:tcPr/>
+          <w:p>
+            <w:pPr>
+              <w:pStyle w:val="Compact"/>
+              <w:jc w:val="left"/>
+            </w:pPr>
+            <w:r>
+              <w:t xml:space="preserve">Años 1–2</w:t>
+            </w:r>
+          </w:p>
+        </w:tc>
+      </w:tr>
+      <w:tr>
+        <w:tc>
+          <w:tcPr/>
+          <w:p>
+            <w:pPr>
+              <w:pStyle w:val="Compact"/>
+              <w:jc w:val="left"/>
+            </w:pPr>
+            <w:r>
+              <w:t xml:space="preserve">Programa de graduación de firmas</w:t>
+            </w:r>
+          </w:p>
+        </w:tc>
+        <w:tc>
+          <w:tcPr/>
+          <w:p>
+            <w:pPr>
+              <w:pStyle w:val="Compact"/>
+              <w:jc w:val="left"/>
+            </w:pPr>
+            <w:r>
+              <w:t xml:space="preserve">Acompañar a la pequeña formal con potencial para que escale a mediana (crédito, mercados, gestión); meta de tasa de graduación</w:t>
+            </w:r>
+          </w:p>
+        </w:tc>
+        <w:tc>
+          <w:tcPr/>
+          <w:p>
+            <w:pPr>
+              <w:pStyle w:val="Compact"/>
+              <w:jc w:val="left"/>
+            </w:pPr>
+            <w:r>
+              <w:t xml:space="preserve">Decreto + Bancóldex + iNNpulsa</w:t>
+            </w:r>
+          </w:p>
+        </w:tc>
+        <w:tc>
+          <w:tcPr/>
+          <w:p>
+            <w:pPr>
+              <w:pStyle w:val="Compact"/>
+              <w:jc w:val="left"/>
+            </w:pPr>
+            <w:r>
+              <w:t xml:space="preserve">Años 1–4</w:t>
+            </w:r>
+          </w:p>
+        </w:tc>
+      </w:tr>
+      <w:tr>
+        <w:tc>
+          <w:tcPr/>
+          <w:p>
+            <w:pPr>
+              <w:pStyle w:val="Compact"/>
+              <w:jc w:val="left"/>
+            </w:pPr>
+            <w:r>
+              <w:t xml:space="preserve">Régimen simple ampliado</w:t>
+            </w:r>
+          </w:p>
+        </w:tc>
+        <w:tc>
+          <w:tcPr/>
+          <w:p>
+            <w:pPr>
+              <w:pStyle w:val="Compact"/>
+              <w:jc w:val="left"/>
+            </w:pPr>
+            <w:r>
+              <w:t xml:space="preserve">Simplificar y unificar el cumplimiento para la pyme que crece, reduciendo el costo de ser más grande</w:t>
+            </w:r>
+          </w:p>
+        </w:tc>
+        <w:tc>
+          <w:tcPr/>
+          <w:p>
+            <w:pPr>
+              <w:pStyle w:val="Compact"/>
+              <w:jc w:val="left"/>
+            </w:pPr>
+            <w:r>
+              <w:t xml:space="preserve">Ley ordinaria</w:t>
+            </w:r>
+          </w:p>
+        </w:tc>
+        <w:tc>
+          <w:tcPr/>
+          <w:p>
+            <w:pPr>
+              <w:pStyle w:val="Compact"/>
+              <w:jc w:val="left"/>
+            </w:pPr>
+            <w:r>
+              <w:t xml:space="preserve">Año 2</w:t>
+            </w:r>
+          </w:p>
+        </w:tc>
+      </w:tr>
+    </w:tbl>
+    <w:bookmarkEnd w:id="82"/>
+    <w:bookmarkStart w:id="83" w:name="X12441944bc318c15c36eface9a40d0d7ffe3aed"/>
+    <w:p>
+      <w:pPr>
+        <w:pStyle w:val="Heading3"/>
+      </w:pPr>
+      <w:r>
+        <w:t xml:space="preserve">D. Competencia con dientes y costos de insumos</w:t>
+      </w:r>
+    </w:p>
+    <w:p>
+      <w:pPr>
+        <w:pStyle w:val="FirstParagraph"/>
+      </w:pPr>
+      <w:r>
+        <w:t xml:space="preserve">La productividad sube cuando las firmas compiten y cuando sus insumos cuestan menos. Toca a</w:t>
+      </w:r>
+      <w:r>
+        <w:t xml:space="preserve"> </w:t>
+      </w:r>
+      <w:r>
+        <w:rPr>
+          <w:iCs/>
+          <w:i/>
+        </w:rPr>
+        <w:t xml:space="preserve">toda</w:t>
+      </w:r>
+      <w:r>
+        <w:t xml:space="preserve"> </w:t>
+      </w:r>
+      <w:r>
+        <w:t xml:space="preserve">firma existente a la vez.</w:t>
+      </w:r>
+    </w:p>
+    <w:tbl>
+      <w:tblPr>
+        <w:tblStyle w:val="Table"/>
+        <w:tblW w:type="pct" w:w="5000"/>
+        <w:tblLook w:firstRow="1" w:lastRow="0" w:firstColumn="0" w:lastColumn="0" w:noHBand="0" w:noVBand="0" w:val="0020"/>
+        <w:jc w:val="start"/>
+      </w:tblPr>
+      <w:tblGrid>
+        <w:gridCol w:w="1980"/>
+        <w:gridCol w:w="1980"/>
+        <w:gridCol w:w="1980"/>
+        <w:gridCol w:w="1980"/>
+      </w:tblGrid>
+      <w:tr>
+        <w:trPr>
+          <w:tblHeader w:val="true"/>
+        </w:trPr>
+        <w:tc>
+          <w:tcPr/>
+          <w:p>
+            <w:pPr>
+              <w:pStyle w:val="Compact"/>
+              <w:jc w:val="left"/>
+            </w:pPr>
+            <w:r>
+              <w:t xml:space="preserve">Medida</w:t>
+            </w:r>
+          </w:p>
+        </w:tc>
+        <w:tc>
+          <w:tcPr/>
+          <w:p>
+            <w:pPr>
+              <w:pStyle w:val="Compact"/>
+              <w:jc w:val="left"/>
+            </w:pPr>
+            <w:r>
+              <w:t xml:space="preserve">Concreción</w:t>
+            </w:r>
+          </w:p>
+        </w:tc>
+        <w:tc>
+          <w:tcPr/>
+          <w:p>
+            <w:pPr>
+              <w:pStyle w:val="Compact"/>
+              <w:jc w:val="left"/>
+            </w:pPr>
+            <w:r>
+              <w:t xml:space="preserve">Vía jurídica</w:t>
+            </w:r>
+          </w:p>
+        </w:tc>
+        <w:tc>
+          <w:tcPr/>
+          <w:p>
+            <w:pPr>
+              <w:pStyle w:val="Compact"/>
+              <w:jc w:val="left"/>
+            </w:pPr>
+            <w:r>
+              <w:t xml:space="preserve">Plazo</w:t>
+            </w:r>
+          </w:p>
+        </w:tc>
+      </w:tr>
+      <w:tr>
+        <w:tc>
+          <w:tcPr/>
+          <w:p>
+            <w:pPr>
+              <w:pStyle w:val="Compact"/>
+              <w:jc w:val="left"/>
+            </w:pPr>
+            <w:r>
+              <w:t xml:space="preserve">Autoridad de competencia fortalecida</w:t>
+            </w:r>
+          </w:p>
+        </w:tc>
+        <w:tc>
+          <w:tcPr/>
+          <w:p>
+            <w:pPr>
+              <w:pStyle w:val="Compact"/>
+              <w:jc w:val="left"/>
+            </w:pPr>
+            <w:r>
+              <w:t xml:space="preserve">Más capacidad de la SIC contra carteles y abuso de posición dominante; sanciones disuasivas; abogacía de la competencia en la regulación</w:t>
+            </w:r>
+          </w:p>
+        </w:tc>
+        <w:tc>
+          <w:tcPr/>
+          <w:p>
+            <w:pPr>
+              <w:pStyle w:val="Compact"/>
+              <w:jc w:val="left"/>
+            </w:pPr>
+            <w:r>
+              <w:t xml:space="preserve">Ley ordinaria (refuerzo) + acto administrativo</w:t>
+            </w:r>
+          </w:p>
+        </w:tc>
+        <w:tc>
+          <w:tcPr/>
+          <w:p>
+            <w:pPr>
+              <w:pStyle w:val="Compact"/>
+              <w:jc w:val="left"/>
+            </w:pPr>
+            <w:r>
+              <w:t xml:space="preserve">Años 1–2</w:t>
+            </w:r>
+          </w:p>
+        </w:tc>
+      </w:tr>
+      <w:tr>
+        <w:tc>
+          <w:tcPr/>
+          <w:p>
+            <w:pPr>
+              <w:pStyle w:val="Compact"/>
+              <w:jc w:val="left"/>
+            </w:pPr>
+            <w:r>
+              <w:t xml:space="preserve">Bajar el costo de insumos transversales</w:t>
+            </w:r>
+          </w:p>
+        </w:tc>
+        <w:tc>
+          <w:tcPr/>
+          <w:p>
+            <w:pPr>
+              <w:pStyle w:val="Compact"/>
+              <w:jc w:val="left"/>
+            </w:pPr>
+            <w:r>
+              <w:t xml:space="preserve">Energía (red de transmisión, Frente IX), logística (multimodal, Frente IX), crédito (ancla fiscal, Frente V), trámite (ventanilla única, Frente VIII): el plan ya los tiene; aquí se orientan explícitamente a la firma existente</w:t>
+            </w:r>
+          </w:p>
+        </w:tc>
+        <w:tc>
+          <w:tcPr/>
+          <w:p>
+            <w:pPr>
+              <w:pStyle w:val="Compact"/>
+              <w:jc w:val="left"/>
+            </w:pPr>
+            <w:r>
+              <w:t xml:space="preserve">Mayormente decreto/ya en curso</w:t>
+            </w:r>
+          </w:p>
+        </w:tc>
+        <w:tc>
+          <w:tcPr/>
+          <w:p>
+            <w:pPr>
+              <w:pStyle w:val="Compact"/>
+              <w:jc w:val="left"/>
+            </w:pPr>
+            <w:r>
+              <w:t xml:space="preserve">Continuo</w:t>
+            </w:r>
+          </w:p>
+        </w:tc>
+      </w:tr>
+      <w:tr>
+        <w:tc>
+          <w:tcPr/>
+          <w:p>
+            <w:pPr>
+              <w:pStyle w:val="Compact"/>
+              <w:jc w:val="left"/>
+            </w:pPr>
+            <w:r>
+              <w:t xml:space="preserve">Protección siempre temporal</w:t>
+            </w:r>
+          </w:p>
+        </w:tc>
+        <w:tc>
+          <w:tcPr/>
+          <w:p>
+            <w:pPr>
+              <w:pStyle w:val="Compact"/>
+              <w:jc w:val="left"/>
+            </w:pPr>
+            <w:r>
+              <w:t xml:space="preserve">Coherente con la disciplina por exportación (Frente X): ningún apoyo a una firma o sector es permanente; vence y se condiciona a desempeño</w:t>
+            </w:r>
+          </w:p>
+        </w:tc>
+        <w:tc>
+          <w:tcPr/>
+          <w:p>
+            <w:pPr>
+              <w:pStyle w:val="Compact"/>
+              <w:jc w:val="left"/>
+            </w:pPr>
+            <w:r>
+              <w:t xml:space="preserve">Reglamento</w:t>
+            </w:r>
+          </w:p>
+        </w:tc>
+        <w:tc>
+          <w:tcPr/>
+          <w:p>
+            <w:pPr>
+              <w:pStyle w:val="Compact"/>
+              <w:jc w:val="left"/>
+            </w:pPr>
+            <w:r>
+              <w:t xml:space="preserve">Continuo</w:t>
+            </w:r>
+          </w:p>
+        </w:tc>
+      </w:tr>
+    </w:tbl>
+    <w:bookmarkEnd w:id="83"/>
+    <w:bookmarkStart w:id="84" w:name="Xfc0331b83edd36c564078cedb0f8608d2c60049"/>
+    <w:p>
+      <w:pPr>
+        <w:pStyle w:val="Heading3"/>
+      </w:pPr>
+      <w:r>
+        <w:t xml:space="preserve">E. Doblar la apuesta sobre los clústeres urbanos que ya existen</w:t>
+      </w:r>
+    </w:p>
+    <w:p>
+      <w:pPr>
+        <w:pStyle w:val="FirstParagraph"/>
+      </w:pPr>
+      <w:r>
+        <w:t xml:space="preserve">Bogotá y Medellín ya tienen clústeres de alta productividad y exportables —software, BPO, salud, industrias creativas, servicios profesionales—. Fortalecer lo que ya funciona rinde más que fundar lo nuevo. Es</w:t>
+      </w:r>
+      <w:r>
+        <w:t xml:space="preserve"> </w:t>
+      </w:r>
+      <w:r>
+        <w:t xml:space="preserve">“</w:t>
+      </w:r>
+      <w:r>
+        <w:t xml:space="preserve">activar lo que ya se pagó</w:t>
+      </w:r>
+      <w:r>
+        <w:t xml:space="preserve">”</w:t>
+      </w:r>
+      <w:r>
+        <w:t xml:space="preserve"> </w:t>
+      </w:r>
+      <w:r>
+        <w:t xml:space="preserve">aplicado al talento urbano.</w:t>
+      </w:r>
+    </w:p>
+    <w:tbl>
+      <w:tblPr>
+        <w:tblStyle w:val="Table"/>
+        <w:tblW w:type="pct" w:w="5000"/>
+        <w:tblLook w:firstRow="1" w:lastRow="0" w:firstColumn="0" w:lastColumn="0" w:noHBand="0" w:noVBand="0" w:val="0020"/>
+        <w:jc w:val="start"/>
+      </w:tblPr>
+      <w:tblGrid>
+        <w:gridCol w:w="1980"/>
+        <w:gridCol w:w="1980"/>
+        <w:gridCol w:w="1980"/>
+        <w:gridCol w:w="1980"/>
+      </w:tblGrid>
+      <w:tr>
+        <w:trPr>
+          <w:tblHeader w:val="true"/>
+        </w:trPr>
+        <w:tc>
+          <w:tcPr/>
+          <w:p>
+            <w:pPr>
+              <w:pStyle w:val="Compact"/>
+              <w:jc w:val="left"/>
+            </w:pPr>
+            <w:r>
+              <w:t xml:space="preserve">Medida</w:t>
+            </w:r>
+          </w:p>
+        </w:tc>
+        <w:tc>
+          <w:tcPr/>
+          <w:p>
+            <w:pPr>
+              <w:pStyle w:val="Compact"/>
+              <w:jc w:val="left"/>
+            </w:pPr>
+            <w:r>
+              <w:t xml:space="preserve">Concreción</w:t>
+            </w:r>
+          </w:p>
+        </w:tc>
+        <w:tc>
+          <w:tcPr/>
+          <w:p>
+            <w:pPr>
+              <w:pStyle w:val="Compact"/>
+              <w:jc w:val="left"/>
+            </w:pPr>
+            <w:r>
+              <w:t xml:space="preserve">Vía jurídica</w:t>
+            </w:r>
+          </w:p>
+        </w:tc>
+        <w:tc>
+          <w:tcPr/>
+          <w:p>
+            <w:pPr>
+              <w:pStyle w:val="Compact"/>
+              <w:jc w:val="left"/>
+            </w:pPr>
+            <w:r>
+              <w:t xml:space="preserve">Plazo</w:t>
+            </w:r>
+          </w:p>
+        </w:tc>
+      </w:tr>
+      <w:tr>
+        <w:tc>
+          <w:tcPr/>
+          <w:p>
+            <w:pPr>
+              <w:pStyle w:val="Compact"/>
+              <w:jc w:val="left"/>
+            </w:pPr>
+            <w:r>
+              <w:t xml:space="preserve">Servicios transables como apuesta exportadora</w:t>
+            </w:r>
+          </w:p>
+        </w:tc>
+        <w:tc>
+          <w:tcPr/>
+          <w:p>
+            <w:pPr>
+              <w:pStyle w:val="Compact"/>
+              <w:jc w:val="left"/>
+            </w:pPr>
+            <w:r>
+              <w:t xml:space="preserve">Software, BPO/KPO, servicios profesionales y de salud; misiones comerciales de ProColombia; la visa de nómada digital (12.4) como imán de talento</w:t>
+            </w:r>
+          </w:p>
+        </w:tc>
+        <w:tc>
+          <w:tcPr/>
+          <w:p>
+            <w:pPr>
+              <w:pStyle w:val="Compact"/>
+              <w:jc w:val="left"/>
+            </w:pPr>
+            <w:r>
+              <w:t xml:space="preserve">Decreto + ProColombia</w:t>
+            </w:r>
+          </w:p>
+        </w:tc>
+        <w:tc>
+          <w:tcPr/>
+          <w:p>
+            <w:pPr>
+              <w:pStyle w:val="Compact"/>
+              <w:jc w:val="left"/>
+            </w:pPr>
+            <w:r>
+              <w:t xml:space="preserve">Años 1–4</w:t>
+            </w:r>
+          </w:p>
+        </w:tc>
+      </w:tr>
+      <w:tr>
+        <w:tc>
+          <w:tcPr/>
+          <w:p>
+            <w:pPr>
+              <w:pStyle w:val="Compact"/>
+              <w:jc w:val="left"/>
+            </w:pPr>
+            <w:r>
+              <w:t xml:space="preserve">Profundizar clústeres existentes</w:t>
+            </w:r>
+          </w:p>
+        </w:tc>
+        <w:tc>
+          <w:tcPr/>
+          <w:p>
+            <w:pPr>
+              <w:pStyle w:val="Compact"/>
+              <w:jc w:val="left"/>
+            </w:pPr>
+            <w:r>
+              <w:t xml:space="preserve">Vincular universidad–empresa, capital de riesgo y compra pública alrededor de los clústeres ya formados, en vez de dispersar recursos</w:t>
+            </w:r>
+          </w:p>
+        </w:tc>
+        <w:tc>
+          <w:tcPr/>
+          <w:p>
+            <w:pPr>
+              <w:pStyle w:val="Compact"/>
+              <w:jc w:val="left"/>
+            </w:pPr>
+            <w:r>
+              <w:t xml:space="preserve">Decreto + iNNpulsa + Minciencias</w:t>
+            </w:r>
+          </w:p>
+        </w:tc>
+        <w:tc>
+          <w:tcPr/>
+          <w:p>
+            <w:pPr>
+              <w:pStyle w:val="Compact"/>
+              <w:jc w:val="left"/>
+            </w:pPr>
+            <w:r>
+              <w:t xml:space="preserve">Años 1–4</w:t>
+            </w:r>
+          </w:p>
+        </w:tc>
+      </w:tr>
+      <w:tr>
+        <w:tc>
+          <w:tcPr/>
+          <w:p>
+            <w:pPr>
+              <w:pStyle w:val="Compact"/>
+              <w:jc w:val="left"/>
+            </w:pPr>
+            <w:r>
+              <w:t xml:space="preserve">Ciudades secundarias como nuevos polos de servicios</w:t>
+            </w:r>
+          </w:p>
+        </w:tc>
+        <w:tc>
+          <w:tcPr/>
+          <w:p>
+            <w:pPr>
+              <w:pStyle w:val="Compact"/>
+              <w:jc w:val="left"/>
+            </w:pPr>
+            <w:r>
+              <w:t xml:space="preserve">Llevar el modelo de clúster de servicios a Bucaramanga, Pereira, Manizales, donde el costo es menor y el talento existe</w:t>
+            </w:r>
+          </w:p>
+        </w:tc>
+        <w:tc>
+          <w:tcPr/>
+          <w:p>
+            <w:pPr>
+              <w:pStyle w:val="Compact"/>
+              <w:jc w:val="left"/>
+            </w:pPr>
+            <w:r>
+              <w:t xml:space="preserve">Decreto + alcaldías</w:t>
+            </w:r>
+          </w:p>
+        </w:tc>
+        <w:tc>
+          <w:tcPr/>
+          <w:p>
+            <w:pPr>
+              <w:pStyle w:val="Compact"/>
+              <w:jc w:val="left"/>
+            </w:pPr>
+            <w:r>
+              <w:t xml:space="preserve">Años 2–4</w:t>
+            </w:r>
+          </w:p>
+        </w:tc>
+      </w:tr>
+    </w:tbl>
+    <w:bookmarkEnd w:id="84"/>
+    <w:bookmarkStart w:id="85" w:name="f.-la-ciudad-que-funciona"/>
+    <w:p>
+      <w:pPr>
+        <w:pStyle w:val="Heading3"/>
+      </w:pPr>
+      <w:r>
+        <w:t xml:space="preserve">F. La ciudad que funciona</w:t>
+      </w:r>
+    </w:p>
+    <w:p>
+      <w:pPr>
+        <w:pStyle w:val="FirstParagraph"/>
+      </w:pPr>
+      <w:r>
+        <w:t xml:space="preserve">La congestión y la fricción urbana son un impuesto directo a la productividad de quien ya trabaja. Las palancas ya están en 12.2 (interoperabilidad del transporte, teletrabajo, formalización urbana); este módulo las reconoce explícitamente como política de productividad, no solo de movilidad.</w:t>
+      </w:r>
+    </w:p>
+    <w:bookmarkEnd w:id="85"/>
+    <w:bookmarkStart w:id="86" w:name="Xd443673e4132f70adfc516fc7bc8560ee242af9"/>
+    <w:p>
+      <w:pPr>
+        <w:pStyle w:val="Heading3"/>
+      </w:pPr>
+      <w:r>
+        <w:t xml:space="preserve">Métricas de productividad (no solo de empleo)</w:t>
+      </w:r>
+    </w:p>
+    <w:p>
+      <w:pPr>
+        <w:pStyle w:val="FirstParagraph"/>
+      </w:pPr>
+      <w:r>
+        <w:t xml:space="preserve">Para que el módulo no caiga en la trampa nacional de</w:t>
+      </w:r>
+      <w:r>
+        <w:t xml:space="preserve"> </w:t>
+      </w:r>
+      <w:r>
+        <w:t xml:space="preserve">“</w:t>
+      </w:r>
+      <w:r>
+        <w:t xml:space="preserve">más empleo, menos productividad</w:t>
+      </w:r>
+      <w:r>
+        <w:t xml:space="preserve">”</w:t>
+      </w:r>
+      <w:r>
+        <w:t xml:space="preserve">, se mide por:</w:t>
+      </w:r>
+    </w:p>
+    <w:tbl>
+      <w:tblPr>
+        <w:tblStyle w:val="Table"/>
+        <w:tblW w:type="pct" w:w="5000"/>
+        <w:tblLook w:firstRow="1" w:lastRow="0" w:firstColumn="0" w:lastColumn="0" w:noHBand="0" w:noVBand="0" w:val="0020"/>
+        <w:jc w:val="start"/>
+      </w:tblPr>
+      <w:tblGrid>
+        <w:gridCol w:w="2640"/>
+        <w:gridCol w:w="2640"/>
+        <w:gridCol w:w="2640"/>
+      </w:tblGrid>
+      <w:tr>
+        <w:trPr>
+          <w:tblHeader w:val="true"/>
+        </w:trPr>
+        <w:tc>
+          <w:tcPr/>
+          <w:p>
+            <w:pPr>
+              <w:pStyle w:val="Compact"/>
+              <w:jc w:val="left"/>
+            </w:pPr>
+            <w:r>
+              <w:t xml:space="preserve">Indicador</w:t>
+            </w:r>
+          </w:p>
+        </w:tc>
+        <w:tc>
+          <w:tcPr/>
+          <w:p>
+            <w:pPr>
+              <w:pStyle w:val="Compact"/>
+              <w:jc w:val="left"/>
+            </w:pPr>
+            <w:r>
+              <w:t xml:space="preserve">Qué mide</w:t>
+            </w:r>
+          </w:p>
+        </w:tc>
+        <w:tc>
+          <w:tcPr/>
+          <w:p>
+            <w:pPr>
+              <w:pStyle w:val="Compact"/>
+              <w:jc w:val="left"/>
+            </w:pPr>
+            <w:r>
+              <w:t xml:space="preserve">Fuente</w:t>
+            </w:r>
+          </w:p>
+        </w:tc>
+      </w:tr>
+      <w:tr>
+        <w:tc>
+          <w:tcPr/>
+          <w:p>
+            <w:pPr>
+              <w:pStyle w:val="Compact"/>
+              <w:jc w:val="left"/>
+            </w:pPr>
+            <w:r>
+              <w:t xml:space="preserve">Valor agregado por trabajador en firmas atendidas</w:t>
+            </w:r>
+          </w:p>
+        </w:tc>
+        <w:tc>
+          <w:tcPr/>
+          <w:p>
+            <w:pPr>
+              <w:pStyle w:val="Compact"/>
+              <w:jc w:val="left"/>
+            </w:pPr>
+            <w:r>
+              <w:t xml:space="preserve">Productividad laboral real, no headcount</w:t>
+            </w:r>
+          </w:p>
+        </w:tc>
+        <w:tc>
+          <w:tcPr/>
+          <w:p>
+            <w:pPr>
+              <w:pStyle w:val="Compact"/>
+              <w:jc w:val="left"/>
+            </w:pPr>
+            <w:r>
+              <w:t xml:space="preserve">DANE + registros</w:t>
+            </w:r>
+          </w:p>
+        </w:tc>
+      </w:tr>
+      <w:tr>
+        <w:tc>
+          <w:tcPr/>
+          <w:p>
+            <w:pPr>
+              <w:pStyle w:val="Compact"/>
+              <w:jc w:val="left"/>
+            </w:pPr>
+            <w:r>
+              <w:t xml:space="preserve">Tasa de graduación de firmas (micro→pequeña→mediana)</w:t>
+            </w:r>
+          </w:p>
+        </w:tc>
+        <w:tc>
+          <w:tcPr/>
+          <w:p>
+            <w:pPr>
+              <w:pStyle w:val="Compact"/>
+              <w:jc w:val="left"/>
+            </w:pPr>
+            <w:r>
+              <w:t xml:space="preserve">Dinamismo y fin del enano fiscal</w:t>
+            </w:r>
+          </w:p>
+        </w:tc>
+        <w:tc>
+          <w:tcPr/>
+          <w:p>
+            <w:pPr>
+              <w:pStyle w:val="Compact"/>
+              <w:jc w:val="left"/>
+            </w:pPr>
+            <w:r>
+              <w:t xml:space="preserve">Confecámaras + DIAN</w:t>
+            </w:r>
+          </w:p>
+        </w:tc>
+      </w:tr>
+      <w:tr>
+        <w:tc>
+          <w:tcPr/>
+          <w:p>
+            <w:pPr>
+              <w:pStyle w:val="Compact"/>
+              <w:jc w:val="left"/>
+            </w:pPr>
+            <w:r>
+              <w:t xml:space="preserve">Adopción tecnológica/digital en pymes atendidas</w:t>
+            </w:r>
+          </w:p>
+        </w:tc>
+        <w:tc>
+          <w:tcPr/>
+          <w:p>
+            <w:pPr>
+              <w:pStyle w:val="Compact"/>
+              <w:jc w:val="left"/>
+            </w:pPr>
+            <w:r>
+              <w:t xml:space="preserve">Difusión efectiva</w:t>
+            </w:r>
+          </w:p>
+        </w:tc>
+        <w:tc>
+          <w:tcPr/>
+          <w:p>
+            <w:pPr>
+              <w:pStyle w:val="Compact"/>
+              <w:jc w:val="left"/>
+            </w:pPr>
+            <w:r>
+              <w:t xml:space="preserve">Min. TIC + encuesta</w:t>
+            </w:r>
+          </w:p>
+        </w:tc>
+      </w:tr>
+      <w:tr>
+        <w:tc>
+          <w:tcPr/>
+          <w:p>
+            <w:pPr>
+              <w:pStyle w:val="Compact"/>
+              <w:jc w:val="left"/>
+            </w:pPr>
+            <w:r>
+              <w:t xml:space="preserve">Exportaciones de servicios</w:t>
+            </w:r>
+          </w:p>
+        </w:tc>
+        <w:tc>
+          <w:tcPr/>
+          <w:p>
+            <w:pPr>
+              <w:pStyle w:val="Compact"/>
+              <w:jc w:val="left"/>
+            </w:pPr>
+            <w:r>
+              <w:t xml:space="preserve">Competitividad de los clústeres</w:t>
+            </w:r>
+          </w:p>
+        </w:tc>
+        <w:tc>
+          <w:tcPr/>
+          <w:p>
+            <w:pPr>
+              <w:pStyle w:val="Compact"/>
+              <w:jc w:val="left"/>
+            </w:pPr>
+            <w:r>
+              <w:t xml:space="preserve">DANE + Banco de la República</w:t>
+            </w:r>
+          </w:p>
+        </w:tc>
+      </w:tr>
+    </w:tbl>
+    <w:bookmarkEnd w:id="86"/>
+    <w:bookmarkStart w:id="87" w:name="una-advertencia-honesta"/>
+    <w:p>
+      <w:pPr>
+        <w:pStyle w:val="Heading3"/>
+      </w:pPr>
+      <w:r>
+        <w:t xml:space="preserve">Una advertencia honesta</w:t>
+      </w:r>
+    </w:p>
+    <w:p>
+      <w:pPr>
+        <w:pStyle w:val="FirstParagraph"/>
+      </w:pPr>
+      <w:r>
+        <w:t xml:space="preserve">Concentrar esfuerzo en las firmas urbanas que ya existen puede afianzar a los incumbentes y ensanchar la desigualdad —justo lo que el sesgo hacia la periferia busca corregir—. Por eso el módulo prioriza la</w:t>
+      </w:r>
+      <w:r>
+        <w:t xml:space="preserve"> </w:t>
+      </w:r>
+      <w:r>
+        <w:rPr>
+          <w:iCs/>
+          <w:i/>
+        </w:rPr>
+        <w:t xml:space="preserve">pyme</w:t>
+      </w:r>
+      <w:r>
+        <w:t xml:space="preserve"> </w:t>
+      </w:r>
+      <w:r>
+        <w:t xml:space="preserve">y al</w:t>
+      </w:r>
+      <w:r>
+        <w:t xml:space="preserve"> </w:t>
+      </w:r>
+      <w:r>
+        <w:rPr>
+          <w:iCs/>
+          <w:i/>
+        </w:rPr>
+        <w:t xml:space="preserve">trabajador en activo</w:t>
+      </w:r>
+      <w:r>
+        <w:t xml:space="preserve"> </w:t>
+      </w:r>
+      <w:r>
+        <w:t xml:space="preserve">(no a las grandes), ata todo apoyo a competencia y desempeño, y corre en paralelo a los nodos, no en su lugar. La tensión entre competitividad nacional y justicia territorial es real; el plan la asume con los ojos abiertos en vez de fingir que no existe.</w:t>
+      </w:r>
+    </w:p>
+    <w:bookmarkEnd w:id="87"/>
+    <w:bookmarkEnd w:id="88"/>
+    <w:bookmarkStart w:id="89" w:name="X1bba574aa25410650f7841df1158dd6ea3828c5"/>
+    <w:p>
+      <w:pPr>
+        <w:pStyle w:val="Heading2"/>
+      </w:pPr>
+      <w:r>
+        <w:t xml:space="preserve">12.4 El turismo — estrategia de alto impacto dentro del presupuesto</w:t>
       </w:r>
     </w:p>
     <w:p>
@@ -16863,14 +18573,14 @@
         </w:tc>
       </w:tr>
     </w:tbl>
-    <w:bookmarkEnd w:id="80"/>
-    <w:bookmarkStart w:id="81" w:name="Xf79264da502ae9ac5a1795ed90ae6eedd6d1f37"/>
+    <w:bookmarkEnd w:id="89"/>
+    <w:bookmarkStart w:id="90" w:name="Xf79264da502ae9ac5a1795ed90ae6eedd6d1f37"/>
     <w:p>
       <w:pPr>
         <w:pStyle w:val="Heading2"/>
       </w:pPr>
       <w:r>
-        <w:t xml:space="preserve">12.4 El turismo como puente entre los nodos y las ciudades</w:t>
+        <w:t xml:space="preserve">12.5 El turismo como puente entre los nodos y las ciudades</w:t>
       </w:r>
     </w:p>
     <w:p>
@@ -16969,9 +18679,9 @@
         <w:t xml:space="preserve">.</w:t>
       </w:r>
     </w:p>
-    <w:bookmarkEnd w:id="81"/>
-    <w:bookmarkEnd w:id="82"/>
-    <w:bookmarkStart w:id="93" w:name="X3356fa1ebf2d69c2684f142fc61bec6de18686a"/>
+    <w:bookmarkEnd w:id="90"/>
+    <w:bookmarkEnd w:id="91"/>
+    <w:bookmarkStart w:id="102" w:name="X3356fa1ebf2d69c2684f142fc61bec6de18686a"/>
     <w:p>
       <w:pPr>
         <w:pStyle w:val="Heading1"/>
@@ -17000,7 +18710,7 @@
         <w:t xml:space="preserve">Este frente no es sobre valores declarados — es sobre la arquitectura institucional que los convierte en práctica verificable. La ética no cambia con campañas: cambia cuando se rediseña qué se premia y qué se castiga. El antirracismo y el anticlasismo no avanzan con discursos: avanzan cuando las brechas se miden, se publican y se vuelven indicadores de gestión.</w:t>
       </w:r>
     </w:p>
-    <w:bookmarkStart w:id="83" w:name="austeridad-republicana"/>
+    <w:bookmarkStart w:id="92" w:name="austeridad-republicana"/>
     <w:p>
       <w:pPr>
         <w:pStyle w:val="Heading2"/>
@@ -17276,8 +18986,8 @@
         </w:tc>
       </w:tr>
     </w:tbl>
-    <w:bookmarkEnd w:id="83"/>
-    <w:bookmarkStart w:id="84" w:name="Xbe1bc1ffe34ded2f92eda4082bd128705780a83"/>
+    <w:bookmarkEnd w:id="92"/>
+    <w:bookmarkStart w:id="93" w:name="Xbe1bc1ffe34ded2f92eda4082bd128705780a83"/>
     <w:p>
       <w:pPr>
         <w:pStyle w:val="Heading2"/>
@@ -17646,8 +19356,8 @@
         <w:t xml:space="preserve">del escenario base, no como la fuente que financia compromisos duros (ver Cuadro Fiscal). Los ahorros de eficiencia son históricamente difíciles de capturar a la escala proyectada; no se construye sobre ellos ningún gasto que no pueda sostenerse sin ellos.</w:t>
       </w:r>
     </w:p>
-    <w:bookmarkEnd w:id="84"/>
-    <w:bookmarkStart w:id="85" w:name="Xfebf870c2c394019a95ecc0180aa7025eb2a4af"/>
+    <w:bookmarkEnd w:id="93"/>
+    <w:bookmarkStart w:id="94" w:name="Xfebf870c2c394019a95ecc0180aa7025eb2a4af"/>
     <w:p>
       <w:pPr>
         <w:pStyle w:val="Heading2"/>
@@ -17981,8 +19691,8 @@
         </w:tc>
       </w:tr>
     </w:tbl>
-    <w:bookmarkEnd w:id="85"/>
-    <w:bookmarkStart w:id="86" w:name="X021ffd85052d4393a2d0f56afd4a3ff51f9fae0"/>
+    <w:bookmarkEnd w:id="94"/>
+    <w:bookmarkStart w:id="95" w:name="X021ffd85052d4393a2d0f56afd4a3ff51f9fae0"/>
     <w:p>
       <w:pPr>
         <w:pStyle w:val="Heading2"/>
@@ -18290,8 +20000,8 @@
         </w:tc>
       </w:tr>
     </w:tbl>
-    <w:bookmarkEnd w:id="86"/>
-    <w:bookmarkStart w:id="87" w:name="Xf5b4c686dba9c5577ecb87553f8f18292bc15b9"/>
+    <w:bookmarkEnd w:id="95"/>
+    <w:bookmarkStart w:id="96" w:name="Xf5b4c686dba9c5577ecb87553f8f18292bc15b9"/>
     <w:p>
       <w:pPr>
         <w:pStyle w:val="Heading2"/>
@@ -18567,8 +20277,8 @@
         </w:tc>
       </w:tr>
     </w:tbl>
-    <w:bookmarkEnd w:id="87"/>
-    <w:bookmarkStart w:id="88" w:name="X6089359649d7a4a7f1dd461f2e4ee211200a0d9"/>
+    <w:bookmarkEnd w:id="96"/>
+    <w:bookmarkStart w:id="97" w:name="X6089359649d7a4a7f1dd461f2e4ee211200a0d9"/>
     <w:p>
       <w:pPr>
         <w:pStyle w:val="Heading2"/>
@@ -19015,8 +20725,8 @@
         <w:t xml:space="preserve">en el período, por reasignación, corrección de brechas y formalización — no por nueva deuda.</w:t>
       </w:r>
     </w:p>
-    <w:bookmarkEnd w:id="88"/>
-    <w:bookmarkStart w:id="89" w:name="X380695f0c27088be8e420774f4e23f7c12a3c46"/>
+    <w:bookmarkEnd w:id="97"/>
+    <w:bookmarkStart w:id="98" w:name="X380695f0c27088be8e420774f4e23f7c12a3c46"/>
     <w:p>
       <w:pPr>
         <w:pStyle w:val="Heading2"/>
@@ -19338,8 +21048,8 @@
         </w:tc>
       </w:tr>
     </w:tbl>
-    <w:bookmarkEnd w:id="89"/>
-    <w:bookmarkStart w:id="90" w:name="los-ocho-mecanismos-de-diseño"/>
+    <w:bookmarkEnd w:id="98"/>
+    <w:bookmarkStart w:id="99" w:name="los-ocho-mecanismos-de-diseño"/>
     <w:p>
       <w:pPr>
         <w:pStyle w:val="Heading2"/>
@@ -19732,8 +21442,8 @@
         <w:t xml:space="preserve">. Una regla binaria robusta (alerta roja → congela desembolso) resiste la captura mejor que una fórmula elegante de siete variables con pesos exactos. Donde un mecanismo sea fino y gameable, se simplifica. La elegancia no es el objetivo — la resistencia a la captura sí.</w:t>
       </w:r>
     </w:p>
-    <w:bookmarkEnd w:id="90"/>
-    <w:bookmarkStart w:id="91" w:name="X48788df1506cb0a5518aa91f8d345153bda9c42"/>
+    <w:bookmarkEnd w:id="99"/>
+    <w:bookmarkStart w:id="100" w:name="X48788df1506cb0a5518aa91f8d345153bda9c42"/>
     <w:p>
       <w:pPr>
         <w:pStyle w:val="Heading2"/>
@@ -20124,8 +21834,8 @@
         </w:tc>
       </w:tr>
     </w:tbl>
-    <w:bookmarkEnd w:id="91"/>
-    <w:bookmarkStart w:id="92" w:name="X3427fda87ec4dbe2d4edb93053a5ae465351199"/>
+    <w:bookmarkEnd w:id="100"/>
+    <w:bookmarkStart w:id="101" w:name="X3427fda87ec4dbe2d4edb93053a5ae465351199"/>
     <w:p>
       <w:pPr>
         <w:pStyle w:val="Heading2"/>
@@ -20409,9 +22119,9 @@
         <w:t xml:space="preserve">El mecanismo más poderoso no es el castigo después del robo — es hacer que robar sea más difícil y costoso que cumplir. Cuando el alcalde sabe que la rendición en vivo tiene audiencia, que el interventor no lo eligió él, que el veedor tiene protección, y que perder los recursos del nodo destruye su capital político, el cálculo cambia. Eso es diseño de mecanismos: cambiar el cálculo sin cambiar a las personas.</w:t>
       </w:r>
     </w:p>
-    <w:bookmarkEnd w:id="92"/>
-    <w:bookmarkEnd w:id="93"/>
-    <w:bookmarkStart w:id="103" w:name="Xbc642ba39422177b7a477569c28a5373a2663f2"/>
+    <w:bookmarkEnd w:id="101"/>
+    <w:bookmarkEnd w:id="102"/>
+    <w:bookmarkStart w:id="112" w:name="Xbc642ba39422177b7a477569c28a5373a2663f2"/>
     <w:p>
       <w:pPr>
         <w:pStyle w:val="Heading1"/>
@@ -20451,7 +22161,7 @@
         <w:t xml:space="preserve">. Es: ¿podemos diseñar una institución tan valiosa que no querer servir sea la excepción? Si el servicio da competencias reales, conecta clases y contribuye a algo que importa, la voluntariedad emerge del valor — y la universalidad garantiza que eso ocurra para todos.</w:t>
       </w:r>
     </w:p>
-    <w:bookmarkStart w:id="94" w:name="por-qué-el-modelo-actual-falla"/>
+    <w:bookmarkStart w:id="103" w:name="por-qué-el-modelo-actual-falla"/>
     <w:p>
       <w:pPr>
         <w:pStyle w:val="Heading2"/>
@@ -20704,8 +22414,8 @@
         </w:tc>
       </w:tr>
     </w:tbl>
-    <w:bookmarkEnd w:id="94"/>
-    <w:bookmarkStart w:id="95" w:name="X8f4dbd14b20fbf0212aedf6d78669c95af2197b"/>
+    <w:bookmarkEnd w:id="103"/>
+    <w:bookmarkStart w:id="104" w:name="X8f4dbd14b20fbf0212aedf6d78669c95af2197b"/>
     <w:p>
       <w:pPr>
         <w:pStyle w:val="Heading2"/>
@@ -20988,8 +22698,8 @@
         </w:tc>
       </w:tr>
     </w:tbl>
-    <w:bookmarkEnd w:id="95"/>
-    <w:bookmarkStart w:id="96" w:name="X2ab33b8e26a824172e96759dd37ec715d0bd7d5"/>
+    <w:bookmarkEnd w:id="104"/>
+    <w:bookmarkStart w:id="105" w:name="X2ab33b8e26a824172e96759dd37ec715d0bd7d5"/>
     <w:p>
       <w:pPr>
         <w:pStyle w:val="Heading2"/>
@@ -21400,8 +23110,8 @@
         </w:tc>
       </w:tr>
     </w:tbl>
-    <w:bookmarkEnd w:id="96"/>
-    <w:bookmarkStart w:id="97" w:name="los-cuatro-mecanismos-de-diseño"/>
+    <w:bookmarkEnd w:id="105"/>
+    <w:bookmarkStart w:id="106" w:name="los-cuatro-mecanismos-de-diseño"/>
     <w:p>
       <w:pPr>
         <w:pStyle w:val="Heading2"/>
@@ -21482,8 +23192,8 @@
         <w:t xml:space="preserve">Además de la certificación SENA: 5 puntos en concursos de la Alta Dirección Pública, puntaje adicional en becas del Icetex y acceso prioritario al crédito del Banco Agrario. Beneficios atados a la credencial (emitida por el SENA, entidad de carrera autónoma), no al gobierno que la otorgó.</w:t>
       </w:r>
     </w:p>
-    <w:bookmarkEnd w:id="97"/>
-    <w:bookmarkStart w:id="98" w:name="X73188e79240bf31e3872e4b857e6e02a31de94f"/>
+    <w:bookmarkEnd w:id="106"/>
+    <w:bookmarkStart w:id="107" w:name="X73188e79240bf31e3872e4b857e6e02a31de94f"/>
     <w:p>
       <w:pPr>
         <w:pStyle w:val="Heading2"/>
@@ -21727,8 +23437,8 @@
         <w:t xml:space="preserve">si en el Año 2 la participación voluntaria supera el 80% de la meta, la universalidad obligatoria entra sin resistencia. Si no, la meta del Año 2 se recorre — pero no se abandona la universalidad: se revisa el valor del servicio, no la ambición.</w:t>
       </w:r>
     </w:p>
-    <w:bookmarkEnd w:id="98"/>
-    <w:bookmarkStart w:id="99" w:name="lo-que-produce-el-triple-resultado"/>
+    <w:bookmarkEnd w:id="107"/>
+    <w:bookmarkStart w:id="108" w:name="lo-que-produce-el-triple-resultado"/>
     <w:p>
       <w:pPr>
         <w:pStyle w:val="Heading2"/>
@@ -21954,8 +23664,8 @@
         </w:tc>
       </w:tr>
     </w:tbl>
-    <w:bookmarkEnd w:id="99"/>
-    <w:bookmarkStart w:id="100" w:name="dih-y-ética-no-negociable"/>
+    <w:bookmarkEnd w:id="108"/>
+    <w:bookmarkStart w:id="109" w:name="dih-y-ética-no-negociable"/>
     <w:p>
       <w:pPr>
         <w:pStyle w:val="Heading2"/>
@@ -21972,8 +23682,8 @@
         <w:t xml:space="preserve">80 horas obligatorias de DIH y ética militar (modalidad de defensa) y 40 de derechos fundamentales (ambiental y comunitaria), con peso igual al desempeño técnico. Una calificación deficiente bloquea el ascenso. Toda denuncia de violación de derechos tiene canal expedito (respuesta máx. 10 días) y protección al denunciante. La responsabilidad de mando aplica desde el primer día.</w:t>
       </w:r>
     </w:p>
-    <w:bookmarkEnd w:id="100"/>
-    <w:bookmarkStart w:id="101" w:name="costo-fiscal-con-honestidad"/>
+    <w:bookmarkEnd w:id="109"/>
+    <w:bookmarkStart w:id="110" w:name="costo-fiscal-con-honestidad"/>
     <w:p>
       <w:pPr>
         <w:pStyle w:val="Heading2"/>
@@ -22654,8 +24364,8 @@
         <w:t xml:space="preserve">se materializan, pero el programa no asume que se materializan. Las dos descargas (valor producido por brigadas y subsidios desplazados) son verificables y se mantienen como compensación; la optimización del Estado se trata como margen adicional, no como supuesto que cierra la cuenta.</w:t>
       </w:r>
     </w:p>
-    <w:bookmarkEnd w:id="101"/>
-    <w:bookmarkStart w:id="102" w:name="X520263755f37ebc0e296910b9442e90a6499dff"/>
+    <w:bookmarkEnd w:id="110"/>
+    <w:bookmarkStart w:id="111" w:name="X520263755f37ebc0e296910b9442e90a6499dff"/>
     <w:p>
       <w:pPr>
         <w:pStyle w:val="Heading2"/>
@@ -22886,9 +24596,9 @@
         </w:pict>
       </w:r>
     </w:p>
-    <w:bookmarkEnd w:id="102"/>
-    <w:bookmarkEnd w:id="103"/>
-    <w:bookmarkStart w:id="104" w:name="X3faac5e722218683f840905436c1ce8f1f456b4"/>
+    <w:bookmarkEnd w:id="111"/>
+    <w:bookmarkEnd w:id="112"/>
+    <w:bookmarkStart w:id="113" w:name="X3faac5e722218683f840905436c1ce8f1f456b4"/>
     <w:p>
       <w:pPr>
         <w:pStyle w:val="Heading1"/>
@@ -23265,8 +24975,8 @@
         </w:pict>
       </w:r>
     </w:p>
-    <w:bookmarkEnd w:id="104"/>
-    <w:bookmarkStart w:id="108" w:name="viabilidad-jurídica-de-los-mecanismos"/>
+    <w:bookmarkEnd w:id="113"/>
+    <w:bookmarkStart w:id="117" w:name="viabilidad-jurídica-de-los-mecanismos"/>
     <w:p>
       <w:pPr>
         <w:pStyle w:val="Heading1"/>
@@ -23321,7 +25031,7 @@
         <w:t xml:space="preserve">Verificación (junio 2026): esta clasificación se contrastó con el estado actual del derecho colombiano. Hallazgos: (a) la Jurisdicción Agraria y Rural ya está creada (AL 03/2023 + Ley Estatutaria 2570/2026) — el plan la implementa, no la crea; (b) el catastro multipropósito ya es servicio público (Ley 1955/2019, Decreto 148/2020) — ejecutable por vía administrativa; (c) la objeción de conciencia exige ley estatutaria y su diseño es constitucionalmente discutible; (d) la interventoría nacional sobre territorios y la condicionalidad de transferencias constitucionales (SGP/regalías) no se logran por decreto/circular. Las filas afectadas están marcadas.</w:t>
       </w:r>
     </w:p>
-    <w:bookmarkStart w:id="105" w:name="qué-puede-cada-instrumento"/>
+    <w:bookmarkStart w:id="114" w:name="qué-puede-cada-instrumento"/>
     <w:p>
       <w:pPr>
         <w:pStyle w:val="Heading2"/>
@@ -23705,8 +25415,8 @@
         </w:tc>
       </w:tr>
     </w:tbl>
-    <w:bookmarkEnd w:id="105"/>
-    <w:bookmarkStart w:id="106" w:name="Xe6c0699dc55585295c7afbed3421e73e8534581"/>
+    <w:bookmarkEnd w:id="114"/>
+    <w:bookmarkStart w:id="115" w:name="Xe6c0699dc55585295c7afbed3421e73e8534581"/>
     <w:p>
       <w:pPr>
         <w:pStyle w:val="Heading2"/>
@@ -24729,8 +26439,8 @@
         </w:tc>
       </w:tr>
     </w:tbl>
-    <w:bookmarkEnd w:id="106"/>
-    <w:bookmarkStart w:id="107" w:name="la-estrategia-de-secuencia-legislativa"/>
+    <w:bookmarkEnd w:id="115"/>
+    <w:bookmarkStart w:id="116" w:name="la-estrategia-de-secuencia-legislativa"/>
     <w:p>
       <w:pPr>
         <w:pStyle w:val="Heading2"/>
@@ -24786,9 +26496,9 @@
         </w:pict>
       </w:r>
     </w:p>
-    <w:bookmarkEnd w:id="107"/>
-    <w:bookmarkEnd w:id="108"/>
-    <w:bookmarkStart w:id="114" w:name="cuadro-fiscal-de-dos-escenarios"/>
+    <w:bookmarkEnd w:id="116"/>
+    <w:bookmarkEnd w:id="117"/>
+    <w:bookmarkStart w:id="123" w:name="cuadro-fiscal-de-dos-escenarios"/>
     <w:p>
       <w:pPr>
         <w:pStyle w:val="Heading1"/>
@@ -24818,7 +26528,7 @@
         <w:t xml:space="preserve">.</w:t>
       </w:r>
     </w:p>
-    <w:bookmarkStart w:id="109" w:name="punto-de-partida"/>
+    <w:bookmarkStart w:id="118" w:name="punto-de-partida"/>
     <w:p>
       <w:pPr>
         <w:pStyle w:val="Heading2"/>
@@ -24835,8 +26545,8 @@
         <w:t xml:space="preserve">Déficit ~6.4–7% del PIB; deuda hacia el 70%; calificación BB; 1 de cada 3 pesos del presupuesto en intereses.</w:t>
       </w:r>
     </w:p>
-    <w:bookmarkEnd w:id="109"/>
-    <w:bookmarkStart w:id="110" w:name="escenario-base-sin-reforma-tributaria"/>
+    <w:bookmarkEnd w:id="118"/>
+    <w:bookmarkStart w:id="119" w:name="escenario-base-sin-reforma-tributaria"/>
     <w:p>
       <w:pPr>
         <w:pStyle w:val="Heading2"/>
@@ -25144,8 +26854,8 @@
         <w:t xml:space="preserve">Ningún compromiso duro del núcleo se construye sobre el dividendo ético ni sobre la reforma tributaria.</w:t>
       </w:r>
     </w:p>
-    <w:bookmarkEnd w:id="110"/>
-    <w:bookmarkStart w:id="111" w:name="X469a5fa7720b6041b511ba7c856f00452ca54b6"/>
+    <w:bookmarkEnd w:id="119"/>
+    <w:bookmarkStart w:id="120" w:name="X469a5fa7720b6041b511ba7c856f00452ca54b6"/>
     <w:p>
       <w:pPr>
         <w:pStyle w:val="Heading2"/>
@@ -25270,8 +26980,8 @@
         <w:t xml:space="preserve">y adelanta la universalidad del Servicio — no habilita el núcleo, lo expande.</w:t>
       </w:r>
     </w:p>
-    <w:bookmarkEnd w:id="111"/>
-    <w:bookmarkStart w:id="112" w:name="senda-de-déficit-reconciliada"/>
+    <w:bookmarkEnd w:id="120"/>
+    <w:bookmarkStart w:id="121" w:name="senda-de-déficit-reconciliada"/>
     <w:p>
       <w:pPr>
         <w:pStyle w:val="Heading2"/>
@@ -25494,8 +27204,8 @@
         </w:tc>
       </w:tr>
     </w:tbl>
-    <w:bookmarkEnd w:id="112"/>
-    <w:bookmarkStart w:id="113" w:name="X9c418e63bddc0f86d9f158c9fa2c10f39119c03"/>
+    <w:bookmarkEnd w:id="121"/>
+    <w:bookmarkStart w:id="122" w:name="X9c418e63bddc0f86d9f158c9fa2c10f39119c03"/>
     <w:p>
       <w:pPr>
         <w:pStyle w:val="Heading2"/>
@@ -25738,9 +27448,9 @@
         </w:pict>
       </w:r>
     </w:p>
-    <w:bookmarkEnd w:id="113"/>
-    <w:bookmarkEnd w:id="114"/>
-    <w:bookmarkStart w:id="115" w:name="fundamentos-en-la-investigación-reciente"/>
+    <w:bookmarkEnd w:id="122"/>
+    <w:bookmarkEnd w:id="123"/>
+    <w:bookmarkStart w:id="124" w:name="fundamentos-en-la-investigación-reciente"/>
     <w:p>
       <w:pPr>
         <w:pStyle w:val="Heading1"/>
@@ -26513,8 +28223,8 @@
         </w:pict>
       </w:r>
     </w:p>
-    <w:bookmarkEnd w:id="115"/>
-    <w:bookmarkStart w:id="118" w:name="secuencia-de-gobierno"/>
+    <w:bookmarkEnd w:id="124"/>
+    <w:bookmarkStart w:id="127" w:name="secuencia-de-gobierno"/>
     <w:p>
       <w:pPr>
         <w:pStyle w:val="Heading1"/>
@@ -26523,7 +28233,7 @@
         <w:t xml:space="preserve">Secuencia de Gobierno</w:t>
       </w:r>
     </w:p>
-    <w:bookmarkStart w:id="116" w:name="X3f19c8a57f0489f02498b4816e1596433230a25"/>
+    <w:bookmarkStart w:id="125" w:name="X3f19c8a57f0489f02498b4816e1596433230a25"/>
     <w:p>
       <w:pPr>
         <w:pStyle w:val="Heading2"/>
@@ -26630,8 +28340,8 @@
         <w:t xml:space="preserve">Mesas de trabajo con los directivos de las 10 entidades más críticas para negociar por anticipado los compromisos del Año 1, formalizados en actas públicas el día de posesión.</w:t>
       </w:r>
     </w:p>
-    <w:bookmarkEnd w:id="116"/>
-    <w:bookmarkStart w:id="117" w:name="tabla-de-secuencia"/>
+    <w:bookmarkEnd w:id="125"/>
+    <w:bookmarkStart w:id="126" w:name="tabla-de-secuencia"/>
     <w:p>
       <w:pPr>
         <w:pStyle w:val="Heading2"/>
@@ -26924,9 +28634,9 @@
         </w:pict>
       </w:r>
     </w:p>
-    <w:bookmarkEnd w:id="117"/>
-    <w:bookmarkEnd w:id="118"/>
-    <w:bookmarkStart w:id="119" w:name="medición-y-blindaje"/>
+    <w:bookmarkEnd w:id="126"/>
+    <w:bookmarkEnd w:id="127"/>
+    <w:bookmarkStart w:id="128" w:name="medición-y-blindaje"/>
     <w:p>
       <w:pPr>
         <w:pStyle w:val="Heading1"/>
@@ -27113,6 +28823,83 @@
               <w:jc w:val="left"/>
             </w:pPr>
             <w:r>
+              <w:t xml:space="preserve">Valor agregado por trabajador y tasa de graduación de firmas</w:t>
+            </w:r>
+          </w:p>
+        </w:tc>
+        <w:tc>
+          <w:tcPr/>
+          <w:p>
+            <w:pPr>
+              <w:pStyle w:val="Compact"/>
+              <w:jc w:val="left"/>
+            </w:pPr>
+            <w:r>
+              <w:t xml:space="preserve">La productividad real, no solo el número de empleos (corrige la trampa</w:t>
+            </w:r>
+            <w:r>
+              <w:t xml:space="preserve"> </w:t>
+            </w:r>
+            <w:r>
+              <w:t xml:space="preserve">“</w:t>
+            </w:r>
+            <w:r>
+              <w:t xml:space="preserve">más empleo, menos productividad</w:t>
+            </w:r>
+            <w:r>
+              <w:t xml:space="preserve">”</w:t>
+            </w:r>
+            <w:r>
+              <w:t xml:space="preserve">)</w:t>
+            </w:r>
+          </w:p>
+        </w:tc>
+        <w:tc>
+          <w:tcPr/>
+          <w:p>
+            <w:pPr>
+              <w:pStyle w:val="Compact"/>
+              <w:jc w:val="left"/>
+            </w:pPr>
+            <w:r>
+              <w:t xml:space="preserve">Headcount; empleo de baja productividad</w:t>
+            </w:r>
+          </w:p>
+        </w:tc>
+        <w:tc>
+          <w:tcPr/>
+          <w:p>
+            <w:pPr>
+              <w:pStyle w:val="Compact"/>
+              <w:jc w:val="left"/>
+            </w:pPr>
+            <w:r>
+              <w:t xml:space="preserve">DANE + Confecámaras + DIAN</w:t>
+            </w:r>
+          </w:p>
+        </w:tc>
+        <w:tc>
+          <w:tcPr/>
+          <w:p>
+            <w:pPr>
+              <w:pStyle w:val="Compact"/>
+              <w:jc w:val="left"/>
+            </w:pPr>
+            <w:r>
+              <w:t xml:space="preserve">Anual</w:t>
+            </w:r>
+          </w:p>
+        </w:tc>
+      </w:tr>
+      <w:tr>
+        <w:tc>
+          <w:tcPr/>
+          <w:p>
+            <w:pPr>
+              <w:pStyle w:val="Compact"/>
+              <w:jc w:val="left"/>
+            </w:pPr>
+            <w:r>
               <w:t xml:space="preserve">Adicionalidad vs. nodos-control</w:t>
             </w:r>
           </w:p>
@@ -27732,8 +29519,8 @@
         </w:pict>
       </w:r>
     </w:p>
-    <w:bookmarkEnd w:id="119"/>
-    <w:bookmarkStart w:id="120" w:name="riesgos-y-límites-honestos"/>
+    <w:bookmarkEnd w:id="128"/>
+    <w:bookmarkStart w:id="129" w:name="riesgos-y-límites-honestos"/>
     <w:p>
       <w:pPr>
         <w:pStyle w:val="Heading1"/>
@@ -28361,8 +30148,8 @@
         </w:pict>
       </w:r>
     </w:p>
-    <w:bookmarkEnd w:id="120"/>
-    <w:bookmarkStart w:id="121" w:name="el-patriotismo-como-resultado"/>
+    <w:bookmarkEnd w:id="129"/>
+    <w:bookmarkStart w:id="130" w:name="el-patriotismo-como-resultado"/>
     <w:p>
       <w:pPr>
         <w:pStyle w:val="Heading1"/>
@@ -28402,8 +30189,8 @@
         </w:pict>
       </w:r>
     </w:p>
-    <w:bookmarkEnd w:id="121"/>
-    <w:bookmarkStart w:id="125" w:name="hitos-de-credibilidad-política"/>
+    <w:bookmarkEnd w:id="130"/>
+    <w:bookmarkStart w:id="134" w:name="hitos-de-credibilidad-política"/>
     <w:p>
       <w:pPr>
         <w:pStyle w:val="Heading1"/>
@@ -28420,7 +30207,7 @@
         <w:t xml:space="preserve">Las victorias tempranas no tienen que ser las más grandes — tienen que ser las más irreversibles (y, ahora, las más legítimas).</w:t>
       </w:r>
     </w:p>
-    <w:bookmarkStart w:id="122" w:name="transición-mayojulio-2026"/>
+    <w:bookmarkStart w:id="131" w:name="transición-mayojulio-2026"/>
     <w:p>
       <w:pPr>
         <w:pStyle w:val="Heading2"/>
@@ -28673,8 +30460,8 @@
         </w:tc>
       </w:tr>
     </w:tbl>
-    <w:bookmarkEnd w:id="122"/>
-    <w:bookmarkStart w:id="123" w:name="X570d003b3f7a6d5463237df464eec852c2a2ca2"/>
+    <w:bookmarkEnd w:id="131"/>
+    <w:bookmarkStart w:id="132" w:name="X570d003b3f7a6d5463237df464eec852c2a2ca2"/>
     <w:p>
       <w:pPr>
         <w:pStyle w:val="Heading2"/>
@@ -28910,8 +30697,8 @@
         </w:tc>
       </w:tr>
     </w:tbl>
-    <w:bookmarkEnd w:id="123"/>
-    <w:bookmarkStart w:id="124" w:name="Xa62cfd974d430fbd7c2b598818d6b625d2b2995"/>
+    <w:bookmarkEnd w:id="132"/>
+    <w:bookmarkStart w:id="133" w:name="Xa62cfd974d430fbd7c2b598818d6b625d2b2995"/>
     <w:p>
       <w:pPr>
         <w:pStyle w:val="Heading2"/>
@@ -29361,9 +31148,9 @@
         </w:pict>
       </w:r>
     </w:p>
-    <w:bookmarkEnd w:id="124"/>
-    <w:bookmarkEnd w:id="125"/>
-    <w:bookmarkStart w:id="132" w:name="X812fbe57f7047e7cc2b3d123e211b38b27f1044"/>
+    <w:bookmarkEnd w:id="133"/>
+    <w:bookmarkEnd w:id="134"/>
+    <w:bookmarkStart w:id="141" w:name="X812fbe57f7047e7cc2b3d123e211b38b27f1044"/>
     <w:p>
       <w:pPr>
         <w:pStyle w:val="Heading1"/>
@@ -29456,7 +31243,7 @@
         <w:t xml:space="preserve">IRCTC, fundada en 1999 como subsidiaria de Ferrocarriles de la India, se convirtió en una de las plataformas de viajes más concurridas del mundo, con cientos de miles de reservas diarias. No compitió con Airbnb globalmente — dominó su propio mercado con acceso a infraestructura estatal que ningún privado podía tener. En 2019 salió a bolsa manteniendo el Estado la mayoría del capital. Ese es el modelo.</w:t>
       </w:r>
     </w:p>
-    <w:bookmarkStart w:id="126" w:name="X13e252fe4095065decc34bd8793323709d4f723"/>
+    <w:bookmarkStart w:id="135" w:name="X13e252fe4095065decc34bd8793323709d4f723"/>
     <w:p>
       <w:pPr>
         <w:pStyle w:val="Heading2"/>
@@ -29633,8 +31420,8 @@
         </w:tc>
       </w:tr>
     </w:tbl>
-    <w:bookmarkEnd w:id="126"/>
-    <w:bookmarkStart w:id="127" w:name="la-estructura-de-capital-mixto"/>
+    <w:bookmarkEnd w:id="135"/>
+    <w:bookmarkStart w:id="136" w:name="la-estructura-de-capital-mixto"/>
     <w:p>
       <w:pPr>
         <w:pStyle w:val="Heading2"/>
@@ -29860,8 +31647,8 @@
         </w:tc>
       </w:tr>
     </w:tbl>
-    <w:bookmarkEnd w:id="127"/>
-    <w:bookmarkStart w:id="128" w:name="Xc7cbb19aca36f8f2f8724853254f86e4657ef14"/>
+    <w:bookmarkEnd w:id="136"/>
+    <w:bookmarkStart w:id="137" w:name="Xc7cbb19aca36f8f2f8724853254f86e4657ef14"/>
     <w:p>
       <w:pPr>
         <w:pStyle w:val="Heading2"/>
@@ -29878,8 +31665,8 @@
         <w:t xml:space="preserve">Integración con infraestructura pública (disponibilidad de parques, estado de vías, permisos en territorios étnicos, alertas de seguridad por municipio desde la plataforma de trazabilidad) — Airbnb no tiene acceso a esos datos. Verificación de calidad con consecuencias reales (el sello no es una estrella comprable sino certificación física del SENA; perderlo baja el ranking automáticamente). Comisión del 8% frente a 15-20% (la estructura de costos de Airbnb la obliga a comisiones altas; Colombia Viva no la tiene). Pagos sin fricción en moneda local (PSE, Nequi, Daviplata; integración con sistemas de Ecuador, Perú y Brasil) — relaciones con el sistema financiero que a una empresa extranjera le toman años.</w:t>
       </w:r>
     </w:p>
-    <w:bookmarkEnd w:id="128"/>
-    <w:bookmarkStart w:id="129" w:name="el-modelo-financiero"/>
+    <w:bookmarkEnd w:id="137"/>
+    <w:bookmarkStart w:id="138" w:name="el-modelo-financiero"/>
     <w:p>
       <w:pPr>
         <w:pStyle w:val="Heading2"/>
@@ -30094,8 +31881,8 @@
         </w:tc>
       </w:tr>
     </w:tbl>
-    <w:bookmarkEnd w:id="129"/>
-    <w:bookmarkStart w:id="130" w:name="el-empleo-que-generaría"/>
+    <w:bookmarkEnd w:id="138"/>
+    <w:bookmarkStart w:id="139" w:name="el-empleo-que-generaría"/>
     <w:p>
       <w:pPr>
         <w:pStyle w:val="Heading2"/>
@@ -30318,8 +32105,8 @@
         </w:tc>
       </w:tr>
     </w:tbl>
-    <w:bookmarkEnd w:id="130"/>
-    <w:bookmarkStart w:id="131" w:name="riesgos-y-mitigaciones"/>
+    <w:bookmarkEnd w:id="139"/>
+    <w:bookmarkStart w:id="140" w:name="riesgos-y-mitigaciones"/>
     <w:p>
       <w:pPr>
         <w:pStyle w:val="Heading2"/>
@@ -30542,8 +32329,8 @@
         <w:t xml:space="preserve">Colombia Viva no es la plataforma que compite con Airbnb en San Francisco. Es la que dominaría el turismo colombiano y latinoamericano con ventajas inimitables: datos públicos integrados, certificación con consecuencias, comisiones a la mitad y operadores dueños de su canal. El modelo IRCTC demostró que funciona — la diferencia es que aquí sería en turismo, no en trenes.</w:t>
       </w:r>
     </w:p>
-    <w:bookmarkEnd w:id="131"/>
-    <w:bookmarkEnd w:id="132"/>
+    <w:bookmarkEnd w:id="140"/>
+    <w:bookmarkEnd w:id="141"/>
     <w:sectPr/>
   </w:body>
 </w:document>

</xml_diff>

<commit_message>
v1.6: Modulo de Productividad Rural (Frente II), simetria campo-ciudad en competitividad, y fix del particionador de frentes
</commit_message>
<xml_diff>
--- a/dist/estado-en-el-territorio.docx
+++ b/dist/estado-en-el-territorio.docx
@@ -5626,7 +5626,7 @@
       </w:r>
     </w:p>
     <w:bookmarkEnd w:id="41"/>
-    <w:bookmarkStart w:id="44" w:name="frente-ii-reforma-agraria-integral"/>
+    <w:bookmarkStart w:id="51" w:name="frente-ii-reforma-agraria-integral"/>
     <w:p>
       <w:pPr>
         <w:pStyle w:val="Heading1"/>
@@ -6626,41 +6626,66 @@
       </w:r>
     </w:p>
     <w:bookmarkEnd w:id="43"/>
-    <w:bookmarkEnd w:id="44"/>
-    <w:bookmarkStart w:id="51" w:name="X6fb056096c407b019522fb160b94cd4b406fa8f"/>
+    <w:bookmarkStart w:id="50" w:name="X1b301b65442b3bc8a020498f40d4bc2f35500ab"/>
     <w:p>
       <w:pPr>
-        <w:pStyle w:val="Heading1"/>
-      </w:pPr>
-      <w:r>
-        <w:t xml:space="preserve">Frente III: Seguridad, Soberanía e Inteligencia</w:t>
+        <w:pStyle w:val="Heading2"/>
+      </w:pPr>
+      <w:r>
+        <w:t xml:space="preserve">Módulo de Productividad Rural: activar el campo que ya existe</w:t>
       </w:r>
     </w:p>
     <w:p>
       <w:pPr>
         <w:pStyle w:val="FirstParagraph"/>
+      </w:pPr>
+      <w:r>
+        <w:t xml:space="preserve">El campo concentra la peor productividad del país y, a la vez, la mejor palanca para subirla. La informalidad rural ronda el 83% y la productividad por trabajador agrícola está muy por debajo del promedio nacional, pero la tierra titulada, el riego y la asistencia técnica producen saltos de productividad que ninguna otra inversión iguala. Este módulo es el gemelo rural del Módulo de Productividad Urbana (12.3): aplica al campo el principio de</w:t>
+      </w:r>
+      <w:r>
+        <w:t xml:space="preserve"> </w:t>
+      </w:r>
+      <w:r>
+        <w:t xml:space="preserve">“</w:t>
+      </w:r>
+      <w:r>
+        <w:t xml:space="preserve">activar lo que ya existe</w:t>
+      </w:r>
+      <w:r>
+        <w:t xml:space="preserve">”</w:t>
+      </w:r>
+      <w:r>
+        <w:t xml:space="preserve"> </w:t>
+      </w:r>
+      <w:r>
+        <w:t xml:space="preserve">en vez de solo repartir, y persigue competitividad, no solo subsistencia.</w:t>
+      </w:r>
+    </w:p>
+    <w:p>
+      <w:pPr>
+        <w:pStyle w:val="BlockText"/>
       </w:pPr>
       <w:r>
         <w:rPr>
           <w:bCs/>
           <w:b/>
         </w:rPr>
-        <w:t xml:space="preserve">Metas:</w:t>
+        <w:t xml:space="preserve">Por qué importa para la competitividad nacional.</w:t>
       </w:r>
       <w:r>
         <w:t xml:space="preserve"> </w:t>
       </w:r>
       <w:r>
-        <w:t xml:space="preserve">homicidios de ~26 a ≤18/100.000 en 4 años; coca −30% en 4 años; cero falsos positivos.</w:t>
+        <w:t xml:space="preserve">Las exportaciones no minero-energéticas que el país necesita para no depender del petróleo salen en buena parte del agro: cacao, café especial, frutas, ganadería sostenible. Subir la productividad rural no es solo justicia con el campesino, es la base de la canasta exportadora que diversifica al país. El campo improductivo es un techo a la competitividad de Colombia.</w:t>
       </w:r>
     </w:p>
-    <w:bookmarkStart w:id="45" w:name="estrategia-de-control-territorial"/>
+    <w:bookmarkStart w:id="44" w:name="X71708dbb739ef61fb17c3c1c1bf23d7a55094be"/>
     <w:p>
       <w:pPr>
-        <w:pStyle w:val="Heading2"/>
-      </w:pPr>
-      <w:r>
-        <w:t xml:space="preserve">3.1 Estrategia de control territorial</w:t>
+        <w:pStyle w:val="Heading3"/>
+      </w:pPr>
+      <w:r>
+        <w:t xml:space="preserve">A. El título como activo productivo, no solo como derecho</w:t>
       </w:r>
     </w:p>
     <w:p>
@@ -6668,35 +6693,7 @@
         <w:pStyle w:val="FirstParagraph"/>
       </w:pPr>
       <w:r>
-        <w:t xml:space="preserve">Reencuadre: no</w:t>
-      </w:r>
-      <w:r>
-        <w:t xml:space="preserve"> </w:t>
-      </w:r>
-      <w:r>
-        <w:t xml:space="preserve">“</w:t>
-      </w:r>
-      <w:r>
-        <w:t xml:space="preserve">línea dura vs. negociación</w:t>
-      </w:r>
-      <w:r>
-        <w:t xml:space="preserve">”</w:t>
-      </w:r>
-      <w:r>
-        <w:t xml:space="preserve">. La restricción que ata es</w:t>
-      </w:r>
-      <w:r>
-        <w:t xml:space="preserve"> </w:t>
-      </w:r>
-      <w:r>
-        <w:rPr>
-          <w:bCs/>
-          <w:b/>
-        </w:rPr>
-        <w:t xml:space="preserve">control territorial + desmonte de economías ilegales</w:t>
-      </w:r>
-      <w:r>
-        <w:t xml:space="preserve">. Fuerza, negociación y sometimiento son herramientas subordinadas a ese fin.</w:t>
+        <w:t xml:space="preserve">La titulación masiva del Frente II ya entrega seguridad jurídica; este módulo la convierte en productividad. El título muerto en un cajón no sube la producción; el título usado como colateral, sí.</w:t>
       </w:r>
     </w:p>
     <w:tbl>
@@ -6724,18 +6721,6 @@
               <w:jc w:val="left"/>
             </w:pPr>
             <w:r>
-              <w:t xml:space="preserve">Instrumento</w:t>
-            </w:r>
-          </w:p>
-        </w:tc>
-        <w:tc>
-          <w:tcPr/>
-          <w:p>
-            <w:pPr>
-              <w:pStyle w:val="Compact"/>
-              <w:jc w:val="left"/>
-            </w:pPr>
-            <w:r>
               <w:t xml:space="preserve">Medida</w:t>
             </w:r>
           </w:p>
@@ -6748,332 +6733,144 @@
               <w:jc w:val="left"/>
             </w:pPr>
             <w:r>
-              <w:t xml:space="preserve">Condición</w:t>
-            </w:r>
-          </w:p>
-        </w:tc>
-        <w:tc>
-          <w:tcPr/>
-          <w:p>
-            <w:pPr>
-              <w:pStyle w:val="Compact"/>
-              <w:jc w:val="left"/>
-            </w:pPr>
-            <w:r>
-              <w:t xml:space="preserve">Responsable</w:t>
-            </w:r>
-          </w:p>
-        </w:tc>
-      </w:tr>
-      <w:tr>
-        <w:tc>
-          <w:tcPr/>
-          <w:p>
-            <w:pPr>
-              <w:pStyle w:val="Compact"/>
-              <w:jc w:val="left"/>
-            </w:pPr>
-            <w:r>
-              <w:t xml:space="preserve">Negociación</w:t>
-            </w:r>
-          </w:p>
-        </w:tc>
-        <w:tc>
-          <w:tcPr/>
-          <w:p>
-            <w:pPr>
-              <w:pStyle w:val="Compact"/>
-              <w:jc w:val="left"/>
-            </w:pPr>
-            <w:r>
-              <w:t xml:space="preserve">Con grupos con mando verificable y horizonte político; garantes creíbles; avance condicionado a hechos</w:t>
-            </w:r>
-          </w:p>
-        </w:tc>
-        <w:tc>
-          <w:tcPr/>
-          <w:p>
-            <w:pPr>
-              <w:pStyle w:val="Compact"/>
-              <w:jc w:val="left"/>
-            </w:pPr>
-            <w:r>
-              <w:t xml:space="preserve">Cese verificado 90 días</w:t>
-            </w:r>
-          </w:p>
-        </w:tc>
-        <w:tc>
-          <w:tcPr/>
-          <w:p>
-            <w:pPr>
-              <w:pStyle w:val="Compact"/>
-              <w:jc w:val="left"/>
-            </w:pPr>
-            <w:r>
-              <w:t xml:space="preserve">Alto Comisionado</w:t>
-            </w:r>
-          </w:p>
-        </w:tc>
-      </w:tr>
-      <w:tr>
-        <w:tc>
-          <w:tcPr/>
-          <w:p>
-            <w:pPr>
-              <w:pStyle w:val="Compact"/>
-              <w:jc w:val="left"/>
-            </w:pPr>
-            <w:r>
-              <w:t xml:space="preserve">Sometimiento</w:t>
-            </w:r>
-          </w:p>
-        </w:tc>
-        <w:tc>
-          <w:tcPr/>
-          <w:p>
-            <w:pPr>
-              <w:pStyle w:val="Compact"/>
-              <w:jc w:val="left"/>
-            </w:pPr>
-            <w:r>
-              <w:t xml:space="preserve">Grupos criminal-económicos sin agenda política; rendición individual con beneficios escalonados</w:t>
-            </w:r>
-          </w:p>
-        </w:tc>
-        <w:tc>
-          <w:tcPr/>
-          <w:p>
-            <w:pPr>
-              <w:pStyle w:val="Compact"/>
-              <w:jc w:val="left"/>
-            </w:pPr>
-            <w:r>
-              <w:t xml:space="preserve">Ventana de 6 meses</w:t>
-            </w:r>
-          </w:p>
-        </w:tc>
-        <w:tc>
-          <w:tcPr/>
-          <w:p>
-            <w:pPr>
-              <w:pStyle w:val="Compact"/>
-              <w:jc w:val="left"/>
-            </w:pPr>
-            <w:r>
-              <w:t xml:space="preserve">Fiscalía + Min. Justicia</w:t>
-            </w:r>
-          </w:p>
-        </w:tc>
-      </w:tr>
-      <w:tr>
-        <w:tc>
-          <w:tcPr/>
-          <w:p>
-            <w:pPr>
-              <w:pStyle w:val="Compact"/>
-              <w:jc w:val="left"/>
-            </w:pPr>
-            <w:r>
-              <w:t xml:space="preserve">Fuerza</w:t>
-            </w:r>
-          </w:p>
-        </w:tc>
-        <w:tc>
-          <w:tcPr/>
-          <w:p>
-            <w:pPr>
-              <w:pStyle w:val="Compact"/>
-              <w:jc w:val="left"/>
-            </w:pPr>
-            <w:r>
-              <w:t xml:space="preserve">Último recurso; foco en cabecillas y finanzas, no en combatientes rasos</w:t>
-            </w:r>
-          </w:p>
-        </w:tc>
-        <w:tc>
-          <w:tcPr/>
-          <w:p>
-            <w:pPr>
-              <w:pStyle w:val="Compact"/>
-              <w:jc w:val="left"/>
-            </w:pPr>
-            <w:r>
-              <w:t xml:space="preserve">Solo tras fracaso de negociación/sometimiento</w:t>
-            </w:r>
-          </w:p>
-        </w:tc>
-        <w:tc>
-          <w:tcPr/>
-          <w:p>
-            <w:pPr>
-              <w:pStyle w:val="Compact"/>
-              <w:jc w:val="left"/>
-            </w:pPr>
-            <w:r>
-              <w:t xml:space="preserve">FF.MM. + Policía</w:t>
-            </w:r>
-          </w:p>
-        </w:tc>
-      </w:tr>
-      <w:tr>
-        <w:tc>
-          <w:tcPr/>
-          <w:p>
-            <w:pPr>
-              <w:pStyle w:val="Compact"/>
-              <w:jc w:val="left"/>
-            </w:pPr>
-            <w:r>
-              <w:t xml:space="preserve">Secar reclutamiento</w:t>
-            </w:r>
-          </w:p>
-        </w:tc>
-        <w:tc>
-          <w:tcPr/>
-          <w:p>
-            <w:pPr>
-              <w:pStyle w:val="Compact"/>
-              <w:jc w:val="left"/>
-            </w:pPr>
-            <w:r>
-              <w:t xml:space="preserve">Empleo formal en zonas de riesgo; los nodos son la política de seguridad</w:t>
-            </w:r>
-          </w:p>
-        </w:tc>
-        <w:tc>
-          <w:tcPr/>
-          <w:p>
-            <w:pPr>
-              <w:pStyle w:val="Compact"/>
-              <w:jc w:val="left"/>
-            </w:pPr>
-            <w:r>
-              <w:t xml:space="preserve">Nodo activo = política de seguridad</w:t>
-            </w:r>
-          </w:p>
-        </w:tc>
-        <w:tc>
-          <w:tcPr/>
-          <w:p>
-            <w:pPr>
-              <w:pStyle w:val="Compact"/>
-              <w:jc w:val="left"/>
-            </w:pPr>
-            <w:r>
-              <w:t xml:space="preserve">DNP + SENA + Min. Trabajo</w:t>
-            </w:r>
-          </w:p>
-        </w:tc>
-      </w:tr>
-      <w:tr>
-        <w:tc>
-          <w:tcPr/>
-          <w:p>
-            <w:pPr>
-              <w:pStyle w:val="Compact"/>
-              <w:jc w:val="left"/>
-            </w:pPr>
-            <w:r>
-              <w:t xml:space="preserve">Drogas</w:t>
-            </w:r>
-          </w:p>
-        </w:tc>
-        <w:tc>
-          <w:tcPr/>
-          <w:p>
-            <w:pPr>
-              <w:pStyle w:val="Compact"/>
-              <w:jc w:val="left"/>
-            </w:pPr>
-            <w:r>
-              <w:t xml:space="preserve">Meta de daño, no erradicación. Golpear tráfico, finanzas y lavado, no al campesino. Sustitución = desarrollo rural</w:t>
-            </w:r>
-          </w:p>
-        </w:tc>
-        <w:tc>
-          <w:tcPr/>
-          <w:p>
-            <w:pPr>
-              <w:pStyle w:val="Compact"/>
-              <w:jc w:val="left"/>
-            </w:pPr>
-            <w:r>
-              <w:t xml:space="preserve">Datos trimestrales</w:t>
-            </w:r>
-          </w:p>
-        </w:tc>
-        <w:tc>
-          <w:tcPr/>
-          <w:p>
-            <w:pPr>
-              <w:pStyle w:val="Compact"/>
-              <w:jc w:val="left"/>
-            </w:pPr>
-            <w:r>
-              <w:t xml:space="preserve">UNODC + Policía + Min. Agr.</w:t>
-            </w:r>
-          </w:p>
-        </w:tc>
-      </w:tr>
-      <w:tr>
-        <w:tc>
-          <w:tcPr/>
-          <w:p>
-            <w:pPr>
-              <w:pStyle w:val="Compact"/>
-              <w:jc w:val="left"/>
-            </w:pPr>
-            <w:r>
-              <w:t xml:space="preserve">Equidad en la carga</w:t>
-            </w:r>
-          </w:p>
-        </w:tc>
-        <w:tc>
-          <w:tcPr/>
-          <w:p>
-            <w:pPr>
-              <w:pStyle w:val="Compact"/>
-              <w:jc w:val="left"/>
-            </w:pPr>
-            <w:r>
-              <w:t xml:space="preserve">Rendición de cuentas por toda muerte civil; candados DD.HH.; no repetir falsos positivos</w:t>
-            </w:r>
-          </w:p>
-        </w:tc>
-        <w:tc>
-          <w:tcPr/>
-          <w:p>
-            <w:pPr>
-              <w:pStyle w:val="Compact"/>
-              <w:jc w:val="left"/>
-            </w:pPr>
-            <w:r>
-              <w:t xml:space="preserve">Verificación independiente</w:t>
-            </w:r>
-          </w:p>
-        </w:tc>
-        <w:tc>
-          <w:tcPr/>
-          <w:p>
-            <w:pPr>
-              <w:pStyle w:val="Compact"/>
-              <w:jc w:val="left"/>
-            </w:pPr>
-            <w:r>
-              <w:t xml:space="preserve">Defensoría + Min. Defensa</w:t>
+              <w:t xml:space="preserve">Concreción</w:t>
+            </w:r>
+          </w:p>
+        </w:tc>
+        <w:tc>
+          <w:tcPr/>
+          <w:p>
+            <w:pPr>
+              <w:pStyle w:val="Compact"/>
+              <w:jc w:val="left"/>
+            </w:pPr>
+            <w:r>
+              <w:t xml:space="preserve">Vía jurídica</w:t>
+            </w:r>
+          </w:p>
+        </w:tc>
+        <w:tc>
+          <w:tcPr/>
+          <w:p>
+            <w:pPr>
+              <w:pStyle w:val="Compact"/>
+              <w:jc w:val="left"/>
+            </w:pPr>
+            <w:r>
+              <w:t xml:space="preserve">Plazo</w:t>
+            </w:r>
+          </w:p>
+        </w:tc>
+      </w:tr>
+      <w:tr>
+        <w:tc>
+          <w:tcPr/>
+          <w:p>
+            <w:pPr>
+              <w:pStyle w:val="Compact"/>
+              <w:jc w:val="left"/>
+            </w:pPr>
+            <w:r>
+              <w:t xml:space="preserve">Crédito contra título</w:t>
+            </w:r>
+          </w:p>
+        </w:tc>
+        <w:tc>
+          <w:tcPr/>
+          <w:p>
+            <w:pPr>
+              <w:pStyle w:val="Compact"/>
+              <w:jc w:val="left"/>
+            </w:pPr>
+            <w:r>
+              <w:t xml:space="preserve">Que el título recién entregado sirva de inmediato como garantía ante Banco Agrario y Finagro, con producto financiero diseñado para el pequeño productor</w:t>
+            </w:r>
+          </w:p>
+        </w:tc>
+        <w:tc>
+          <w:tcPr/>
+          <w:p>
+            <w:pPr>
+              <w:pStyle w:val="Compact"/>
+              <w:jc w:val="left"/>
+            </w:pPr>
+            <w:r>
+              <w:t xml:space="preserve">Decreto + Finagro + Banco Agrario</w:t>
+            </w:r>
+          </w:p>
+        </w:tc>
+        <w:tc>
+          <w:tcPr/>
+          <w:p>
+            <w:pPr>
+              <w:pStyle w:val="Compact"/>
+              <w:jc w:val="left"/>
+            </w:pPr>
+            <w:r>
+              <w:t xml:space="preserve">Año 1</w:t>
+            </w:r>
+          </w:p>
+        </w:tc>
+      </w:tr>
+      <w:tr>
+        <w:tc>
+          <w:tcPr/>
+          <w:p>
+            <w:pPr>
+              <w:pStyle w:val="Compact"/>
+              <w:jc w:val="left"/>
+            </w:pPr>
+            <w:r>
+              <w:t xml:space="preserve">Catastro como base de extensión</w:t>
+            </w:r>
+          </w:p>
+        </w:tc>
+        <w:tc>
+          <w:tcPr/>
+          <w:p>
+            <w:pPr>
+              <w:pStyle w:val="Compact"/>
+              <w:jc w:val="left"/>
+            </w:pPr>
+            <w:r>
+              <w:t xml:space="preserve">Los datos del catastro multipropósito identifican qué produce cada predio y dónde falta asistencia, riego o vía, para dirigir la inversión con precisión</w:t>
+            </w:r>
+          </w:p>
+        </w:tc>
+        <w:tc>
+          <w:tcPr/>
+          <w:p>
+            <w:pPr>
+              <w:pStyle w:val="Compact"/>
+              <w:jc w:val="left"/>
+            </w:pPr>
+            <w:r>
+              <w:t xml:space="preserve">Vía administrativa (IGAC + ADR)</w:t>
+            </w:r>
+          </w:p>
+        </w:tc>
+        <w:tc>
+          <w:tcPr/>
+          <w:p>
+            <w:pPr>
+              <w:pStyle w:val="Compact"/>
+              <w:jc w:val="left"/>
+            </w:pPr>
+            <w:r>
+              <w:t xml:space="preserve">Años 1-2</w:t>
             </w:r>
           </w:p>
         </w:tc>
       </w:tr>
     </w:tbl>
-    <w:bookmarkEnd w:id="45"/>
-    <w:bookmarkStart w:id="46" w:name="X3db343de3374bba162493cf78d004cc45a75a08"/>
+    <w:bookmarkEnd w:id="44"/>
+    <w:bookmarkStart w:id="45" w:name="X4d5bda5d871ecf1126696819096fbceb347c287"/>
     <w:p>
       <w:pPr>
-        <w:pStyle w:val="Heading2"/>
-      </w:pPr>
-      <w:r>
-        <w:t xml:space="preserve">3.2 Seguridad concentrada con DIH en nodos Ola 1</w:t>
+        <w:pStyle w:val="Heading3"/>
+      </w:pPr>
+      <w:r>
+        <w:t xml:space="preserve">B. Extensión agropecuaria moderna: difusión, no solo insumos</w:t>
       </w:r>
     </w:p>
     <w:p>
@@ -7081,40 +6878,7 @@
         <w:pStyle w:val="FirstParagraph"/>
       </w:pPr>
       <w:r>
-        <w:t xml:space="preserve">En los 3 nodos se aplica concentración de fuerza hasta</w:t>
-      </w:r>
-      <w:r>
-        <w:t xml:space="preserve"> </w:t>
-      </w:r>
-      <w:r>
-        <w:t xml:space="preserve">“</w:t>
-      </w:r>
-      <w:r>
-        <w:t xml:space="preserve">dominio del área</w:t>
-      </w:r>
-      <w:r>
-        <w:t xml:space="preserve">”</w:t>
-      </w:r>
-      <w:r>
-        <w:t xml:space="preserve">: el grupo armado no opera abiertamente, ni recluta, ni extorsiona. Tropa + juez + médico + maestro entran juntos, en semanas. El éxito se mide en presencia estatal civil establecida y reclutamiento seco, no en bajas, lo que elimina el incentivo que generó los falsos positivos. Solo se aplica donde la tasa de homicidios ya desciende (salvo el nodo de aprendizaje de 3.6, que se mantiene en Fase 0).</w:t>
-      </w:r>
-    </w:p>
-    <w:bookmarkEnd w:id="46"/>
-    <w:bookmarkStart w:id="47" w:name="X532d66123b9442d5630c33e3f658f341f92d400"/>
-    <w:p>
-      <w:pPr>
-        <w:pStyle w:val="Heading2"/>
-      </w:pPr>
-      <w:r>
-        <w:t xml:space="preserve">3.3 Capacidades de inteligencia: la brecha más urgente</w:t>
-      </w:r>
-    </w:p>
-    <w:p>
-      <w:pPr>
-        <w:pStyle w:val="FirstParagraph"/>
-      </w:pPr>
-      <w:r>
-        <w:t xml:space="preserve">En 2025 la Fuerza Pública aumentó sus acciones 34% sin mejora de seguridad: el problema no es déficit de operaciones, es déficit de inteligencia y de justicia que consuma los resultados.</w:t>
+        <w:t xml:space="preserve">La brecha entre el campesino promedio y el productivo es de conocimiento y técnica disponible, no de esfuerzo. Colombia desmanteló su sistema de extensión rural; reconstruirlo es de las inversiones de mayor retorno.</w:t>
       </w:r>
     </w:p>
     <w:tbl>
@@ -7142,31 +6906,31 @@
               <w:jc w:val="left"/>
             </w:pPr>
             <w:r>
-              <w:t xml:space="preserve">Capacidad</w:t>
-            </w:r>
-          </w:p>
-        </w:tc>
-        <w:tc>
-          <w:tcPr/>
-          <w:p>
-            <w:pPr>
-              <w:pStyle w:val="Compact"/>
-              <w:jc w:val="left"/>
-            </w:pPr>
-            <w:r>
-              <w:t xml:space="preserve">Qué se construye</w:t>
-            </w:r>
-          </w:p>
-        </w:tc>
-        <w:tc>
-          <w:tcPr/>
-          <w:p>
-            <w:pPr>
-              <w:pStyle w:val="Compact"/>
-              <w:jc w:val="left"/>
-            </w:pPr>
-            <w:r>
-              <w:t xml:space="preserve">Responsable</w:t>
+              <w:t xml:space="preserve">Medida</w:t>
+            </w:r>
+          </w:p>
+        </w:tc>
+        <w:tc>
+          <w:tcPr/>
+          <w:p>
+            <w:pPr>
+              <w:pStyle w:val="Compact"/>
+              <w:jc w:val="left"/>
+            </w:pPr>
+            <w:r>
+              <w:t xml:space="preserve">Concreción</w:t>
+            </w:r>
+          </w:p>
+        </w:tc>
+        <w:tc>
+          <w:tcPr/>
+          <w:p>
+            <w:pPr>
+              <w:pStyle w:val="Compact"/>
+              <w:jc w:val="left"/>
+            </w:pPr>
+            <w:r>
+              <w:t xml:space="preserve">Vía jurídica</w:t>
             </w:r>
           </w:p>
         </w:tc>
@@ -7192,281 +6956,131 @@
               <w:jc w:val="left"/>
             </w:pPr>
             <w:r>
-              <w:t xml:space="preserve">Inteligencia territorial fina</w:t>
-            </w:r>
-          </w:p>
-        </w:tc>
-        <w:tc>
-          <w:tcPr/>
-          <w:p>
-            <w:pPr>
-              <w:pStyle w:val="Compact"/>
-              <w:jc w:val="left"/>
-            </w:pPr>
-            <w:r>
-              <w:t xml:space="preserve">Reconstruir redes locales de inteligencia humana; incentivos competitivos a la desmovilización individual como fuente</w:t>
-            </w:r>
-          </w:p>
-        </w:tc>
-        <w:tc>
-          <w:tcPr/>
-          <w:p>
-            <w:pPr>
-              <w:pStyle w:val="Compact"/>
-              <w:jc w:val="left"/>
-            </w:pPr>
-            <w:r>
-              <w:t xml:space="preserve">Comando FF.MM. + DNP</w:t>
-            </w:r>
-          </w:p>
-        </w:tc>
-        <w:tc>
-          <w:tcPr/>
-          <w:p>
-            <w:pPr>
-              <w:pStyle w:val="Compact"/>
-              <w:jc w:val="left"/>
-            </w:pPr>
-            <w:r>
-              <w:t xml:space="preserve">Año 1</w:t>
-            </w:r>
-          </w:p>
-        </w:tc>
-      </w:tr>
-      <w:tr>
-        <w:tc>
-          <w:tcPr/>
-          <w:p>
-            <w:pPr>
-              <w:pStyle w:val="Compact"/>
-              <w:jc w:val="left"/>
-            </w:pPr>
-            <w:r>
-              <w:t xml:space="preserve">Inteligencia financiera</w:t>
-            </w:r>
-          </w:p>
-        </w:tc>
-        <w:tc>
-          <w:tcPr/>
-          <w:p>
-            <w:pPr>
-              <w:pStyle w:val="Compact"/>
-              <w:jc w:val="left"/>
-            </w:pPr>
-            <w:r>
-              <w:t xml:space="preserve">Fortalecer la UIAF con análisis de redes; cruce con la plataforma de trazabilidad</w:t>
-            </w:r>
-          </w:p>
-        </w:tc>
-        <w:tc>
-          <w:tcPr/>
-          <w:p>
-            <w:pPr>
-              <w:pStyle w:val="Compact"/>
-              <w:jc w:val="left"/>
-            </w:pPr>
-            <w:r>
-              <w:t xml:space="preserve">UIAF + Fiscalía + MinHacienda</w:t>
-            </w:r>
-          </w:p>
-        </w:tc>
-        <w:tc>
-          <w:tcPr/>
-          <w:p>
-            <w:pPr>
-              <w:pStyle w:val="Compact"/>
-              <w:jc w:val="left"/>
-            </w:pPr>
-            <w:r>
-              <w:t xml:space="preserve">Años 1-2</w:t>
-            </w:r>
-          </w:p>
-        </w:tc>
-      </w:tr>
-      <w:tr>
-        <w:tc>
-          <w:tcPr/>
-          <w:p>
-            <w:pPr>
-              <w:pStyle w:val="Compact"/>
-              <w:jc w:val="left"/>
-            </w:pPr>
-            <w:r>
-              <w:t xml:space="preserve">Inteligencia ambiental</w:t>
-            </w:r>
-          </w:p>
-        </w:tc>
-        <w:tc>
-          <w:tcPr/>
-          <w:p>
-            <w:pPr>
-              <w:pStyle w:val="Compact"/>
-              <w:jc w:val="left"/>
-            </w:pPr>
-            <w:r>
-              <w:t xml:space="preserve">Detección en tiempo real de deforestación, minería ilegal y contaminación hídrica en nodos y cuencas</w:t>
-            </w:r>
-          </w:p>
-        </w:tc>
-        <w:tc>
-          <w:tcPr/>
-          <w:p>
-            <w:pPr>
-              <w:pStyle w:val="Compact"/>
-              <w:jc w:val="left"/>
-            </w:pPr>
-            <w:r>
-              <w:t xml:space="preserve">DNI + Min. Ambiente + IDEAM</w:t>
-            </w:r>
-          </w:p>
-        </w:tc>
-        <w:tc>
-          <w:tcPr/>
-          <w:p>
-            <w:pPr>
-              <w:pStyle w:val="Compact"/>
-              <w:jc w:val="left"/>
-            </w:pPr>
-            <w:r>
-              <w:t xml:space="preserve">Año 1</w:t>
-            </w:r>
-          </w:p>
-        </w:tc>
-      </w:tr>
-      <w:tr>
-        <w:tc>
-          <w:tcPr/>
-          <w:p>
-            <w:pPr>
-              <w:pStyle w:val="Compact"/>
-              <w:jc w:val="left"/>
-            </w:pPr>
-            <w:r>
-              <w:t xml:space="preserve">Capacidad antidron</w:t>
-            </w:r>
-          </w:p>
-        </w:tc>
-        <w:tc>
-          <w:tcPr/>
-          <w:p>
-            <w:pPr>
-              <w:pStyle w:val="Compact"/>
-              <w:jc w:val="left"/>
-            </w:pPr>
-            <w:r>
-              <w:t xml:space="preserve">Detección y neutralización en nodos y nodos de infraestructura crítica; desarrollo nacional vía CIAC</w:t>
-            </w:r>
-          </w:p>
-        </w:tc>
-        <w:tc>
-          <w:tcPr/>
-          <w:p>
-            <w:pPr>
-              <w:pStyle w:val="Compact"/>
-              <w:jc w:val="left"/>
-            </w:pPr>
-            <w:r>
-              <w:t xml:space="preserve">Min. Defensa + CIAC</w:t>
-            </w:r>
-          </w:p>
-        </w:tc>
-        <w:tc>
-          <w:tcPr/>
-          <w:p>
-            <w:pPr>
-              <w:pStyle w:val="Compact"/>
-              <w:jc w:val="left"/>
-            </w:pPr>
-            <w:r>
-              <w:t xml:space="preserve">Año 1</w:t>
-            </w:r>
-          </w:p>
-        </w:tc>
-      </w:tr>
-      <w:tr>
-        <w:tc>
-          <w:tcPr/>
-          <w:p>
-            <w:pPr>
-              <w:pStyle w:val="Compact"/>
-              <w:jc w:val="left"/>
-            </w:pPr>
-            <w:r>
-              <w:t xml:space="preserve">Ciberinteligencia</w:t>
-            </w:r>
-          </w:p>
-        </w:tc>
-        <w:tc>
-          <w:tcPr/>
-          <w:p>
-            <w:pPr>
-              <w:pStyle w:val="Compact"/>
-              <w:jc w:val="left"/>
-            </w:pPr>
-            <w:r>
-              <w:t xml:space="preserve">Monitoreo de redes usadas para reclutamiento, con garantías constitucionales</w:t>
-            </w:r>
-          </w:p>
-        </w:tc>
-        <w:tc>
-          <w:tcPr/>
-          <w:p>
-            <w:pPr>
-              <w:pStyle w:val="Compact"/>
-              <w:jc w:val="left"/>
-            </w:pPr>
-            <w:r>
-              <w:t xml:space="preserve">DNI + Fiscalía</w:t>
-            </w:r>
-          </w:p>
-        </w:tc>
-        <w:tc>
-          <w:tcPr/>
-          <w:p>
-            <w:pPr>
-              <w:pStyle w:val="Compact"/>
-              <w:jc w:val="left"/>
-            </w:pPr>
-            <w:r>
-              <w:t xml:space="preserve">Años 1-2</w:t>
-            </w:r>
-          </w:p>
-        </w:tc>
-      </w:tr>
-      <w:tr>
-        <w:tc>
-          <w:tcPr/>
-          <w:p>
-            <w:pPr>
-              <w:pStyle w:val="Compact"/>
-              <w:jc w:val="left"/>
-            </w:pPr>
-            <w:r>
-              <w:t xml:space="preserve">Justicia con capacidad</w:t>
-            </w:r>
-          </w:p>
-        </w:tc>
-        <w:tc>
-          <w:tcPr/>
-          <w:p>
-            <w:pPr>
-              <w:pStyle w:val="Compact"/>
-              <w:jc w:val="left"/>
-            </w:pPr>
-            <w:r>
-              <w:t xml:space="preserve">Ampliar Fiscalía y jueces especializados para procesar capturas; sin esto la acción militar no disuade</w:t>
-            </w:r>
-          </w:p>
-        </w:tc>
-        <w:tc>
-          <w:tcPr/>
-          <w:p>
-            <w:pPr>
-              <w:pStyle w:val="Compact"/>
-              <w:jc w:val="left"/>
-            </w:pPr>
-            <w:r>
-              <w:t xml:space="preserve">Fiscalía + Consejo Superior</w:t>
+              <w:t xml:space="preserve">Extensionismo rural por resultados</w:t>
+            </w:r>
+          </w:p>
+        </w:tc>
+        <w:tc>
+          <w:tcPr/>
+          <w:p>
+            <w:pPr>
+              <w:pStyle w:val="Compact"/>
+              <w:jc w:val="left"/>
+            </w:pPr>
+            <w:r>
+              <w:t xml:space="preserve">Asesores técnicos en territorio (vía ADR y el Servicio Nacional de Vida ambiental) con metas de rendimiento por hectárea verificadas, no por número de visitas</w:t>
+            </w:r>
+          </w:p>
+        </w:tc>
+        <w:tc>
+          <w:tcPr/>
+          <w:p>
+            <w:pPr>
+              <w:pStyle w:val="Compact"/>
+              <w:jc w:val="left"/>
+            </w:pPr>
+            <w:r>
+              <w:t xml:space="preserve">Decreto + ADR + AGROSAVIA</w:t>
+            </w:r>
+          </w:p>
+        </w:tc>
+        <w:tc>
+          <w:tcPr/>
+          <w:p>
+            <w:pPr>
+              <w:pStyle w:val="Compact"/>
+              <w:jc w:val="left"/>
+            </w:pPr>
+            <w:r>
+              <w:t xml:space="preserve">Año 1 (piloto en nodos), 2-4 (escala)</w:t>
+            </w:r>
+          </w:p>
+        </w:tc>
+      </w:tr>
+      <w:tr>
+        <w:tc>
+          <w:tcPr/>
+          <w:p>
+            <w:pPr>
+              <w:pStyle w:val="Compact"/>
+              <w:jc w:val="left"/>
+            </w:pPr>
+            <w:r>
+              <w:t xml:space="preserve">Paquete tecnológico apropiado</w:t>
+            </w:r>
+          </w:p>
+        </w:tc>
+        <w:tc>
+          <w:tcPr/>
+          <w:p>
+            <w:pPr>
+              <w:pStyle w:val="Compact"/>
+              <w:jc w:val="left"/>
+            </w:pPr>
+            <w:r>
+              <w:t xml:space="preserve">Semilla mejorada, riego eficiente, manejo de suelos y poscosecha, adaptados a cada cadena; transferencia de AGROSAVIA al productor</w:t>
+            </w:r>
+          </w:p>
+        </w:tc>
+        <w:tc>
+          <w:tcPr/>
+          <w:p>
+            <w:pPr>
+              <w:pStyle w:val="Compact"/>
+              <w:jc w:val="left"/>
+            </w:pPr>
+            <w:r>
+              <w:t xml:space="preserve">Vía administrativa</w:t>
+            </w:r>
+          </w:p>
+        </w:tc>
+        <w:tc>
+          <w:tcPr/>
+          <w:p>
+            <w:pPr>
+              <w:pStyle w:val="Compact"/>
+              <w:jc w:val="left"/>
+            </w:pPr>
+            <w:r>
+              <w:t xml:space="preserve">Por ola</w:t>
+            </w:r>
+          </w:p>
+        </w:tc>
+      </w:tr>
+      <w:tr>
+        <w:tc>
+          <w:tcPr/>
+          <w:p>
+            <w:pPr>
+              <w:pStyle w:val="Compact"/>
+              <w:jc w:val="left"/>
+            </w:pPr>
+            <w:r>
+              <w:t xml:space="preserve">Sanidad e inocuidad para exportar</w:t>
+            </w:r>
+          </w:p>
+        </w:tc>
+        <w:tc>
+          <w:tcPr/>
+          <w:p>
+            <w:pPr>
+              <w:pStyle w:val="Compact"/>
+              <w:jc w:val="left"/>
+            </w:pPr>
+            <w:r>
+              <w:t xml:space="preserve">Fortalecer al ICA y al Invima para que la producción cumpla los estándares fitosanitarios que abren mercados externos (el cuello de botella real de la exportación agro)</w:t>
+            </w:r>
+          </w:p>
+        </w:tc>
+        <w:tc>
+          <w:tcPr/>
+          <w:p>
+            <w:pPr>
+              <w:pStyle w:val="Compact"/>
+              <w:jc w:val="left"/>
+            </w:pPr>
+            <w:r>
+              <w:t xml:space="preserve">Decreto + presupuesto</w:t>
             </w:r>
           </w:p>
         </w:tc>
@@ -7484,14 +7098,14 @@
         </w:tc>
       </w:tr>
     </w:tbl>
-    <w:bookmarkEnd w:id="47"/>
-    <w:bookmarkStart w:id="48" w:name="Xf7ad9bf6432f6e674456902cd7465f3a754fe6c"/>
+    <w:bookmarkEnd w:id="45"/>
+    <w:bookmarkStart w:id="46" w:name="c.-agregar-valor-y-conectar-al-mercado"/>
     <w:p>
       <w:pPr>
-        <w:pStyle w:val="Heading2"/>
-      </w:pPr>
-      <w:r>
-        <w:t xml:space="preserve">3.4 Jóvenes en Paz: cortar el reclutamiento desde la raíz</w:t>
+        <w:pStyle w:val="Heading3"/>
+      </w:pPr>
+      <w:r>
+        <w:t xml:space="preserve">C. Agregar valor y conectar al mercado</w:t>
       </w:r>
     </w:p>
     <w:p>
@@ -7499,7 +7113,7 @@
         <w:pStyle w:val="FirstParagraph"/>
       </w:pPr>
       <w:r>
-        <w:t xml:space="preserve">El reclutamiento no se detiene con operaciones, con empleo y futuro. El programa Jóvenes en Paz tiene resultados verificados: Quibdó 1.857 beneficiarios → homicidios −25.9%; Tumaco 1.127 jóvenes → −34%.</w:t>
+        <w:t xml:space="preserve">El campesino que vende materia prima al intermediario captura una fracción del valor. La productividad sube cuando el territorio procesa, asocia y vende mejor.</w:t>
       </w:r>
     </w:p>
     <w:tbl>
@@ -7527,7 +7141,7 @@
               <w:jc w:val="left"/>
             </w:pPr>
             <w:r>
-              <w:t xml:space="preserve">Componente</w:t>
+              <w:t xml:space="preserve">Medida</w:t>
             </w:r>
           </w:p>
         </w:tc>
@@ -7551,7 +7165,7 @@
               <w:jc w:val="left"/>
             </w:pPr>
             <w:r>
-              <w:t xml:space="preserve">Responsable</w:t>
+              <w:t xml:space="preserve">Vía jurídica</w:t>
             </w:r>
           </w:p>
         </w:tc>
@@ -7577,81 +7191,81 @@
               <w:jc w:val="left"/>
             </w:pPr>
             <w:r>
-              <w:t xml:space="preserve">Escala en nodos</w:t>
-            </w:r>
-          </w:p>
-        </w:tc>
-        <w:tc>
-          <w:tcPr/>
-          <w:p>
-            <w:pPr>
-              <w:pStyle w:val="Compact"/>
-              <w:jc w:val="left"/>
-            </w:pPr>
-            <w:r>
-              <w:t xml:space="preserve">Obligatorio en Fase 0 de cada nodo, simultáneo al despliegue de fuerza. Mín. 1.000 jóvenes/nodo antes del fin de Fase 1</w:t>
-            </w:r>
-          </w:p>
-        </w:tc>
-        <w:tc>
-          <w:tcPr/>
-          <w:p>
-            <w:pPr>
-              <w:pStyle w:val="Compact"/>
-              <w:jc w:val="left"/>
-            </w:pPr>
-            <w:r>
-              <w:t xml:space="preserve">DNP + SENA + Min. Trabajo</w:t>
-            </w:r>
-          </w:p>
-        </w:tc>
-        <w:tc>
-          <w:tcPr/>
-          <w:p>
-            <w:pPr>
-              <w:pStyle w:val="Compact"/>
-              <w:jc w:val="left"/>
-            </w:pPr>
-            <w:r>
-              <w:t xml:space="preserve">Fase 0</w:t>
-            </w:r>
-          </w:p>
-        </w:tc>
-      </w:tr>
-      <w:tr>
-        <w:tc>
-          <w:tcPr/>
-          <w:p>
-            <w:pPr>
-              <w:pStyle w:val="Compact"/>
-              <w:jc w:val="left"/>
-            </w:pPr>
-            <w:r>
-              <w:t xml:space="preserve">Incentivo tributario</w:t>
-            </w:r>
-          </w:p>
-        </w:tc>
-        <w:tc>
-          <w:tcPr/>
-          <w:p>
-            <w:pPr>
-              <w:pStyle w:val="Compact"/>
-              <w:jc w:val="left"/>
-            </w:pPr>
-            <w:r>
-              <w:t xml:space="preserve">Deducción del 150% para empresas que contraten jóvenes certificados en municipios de nodos</w:t>
-            </w:r>
-          </w:p>
-        </w:tc>
-        <w:tc>
-          <w:tcPr/>
-          <w:p>
-            <w:pPr>
-              <w:pStyle w:val="Compact"/>
-              <w:jc w:val="left"/>
-            </w:pPr>
-            <w:r>
-              <w:t xml:space="preserve">DIAN + Min. Trabajo</w:t>
+              <w:t xml:space="preserve">Procesamiento local</w:t>
+            </w:r>
+          </w:p>
+        </w:tc>
+        <w:tc>
+          <w:tcPr/>
+          <w:p>
+            <w:pPr>
+              <w:pStyle w:val="Compact"/>
+              <w:jc w:val="left"/>
+            </w:pPr>
+            <w:r>
+              <w:t xml:space="preserve">Apoyar centros de acopio, frío y primera transformación de propiedad cooperativa en los nodos (cacao seco y fermentado, café trillado, fruta procesada)</w:t>
+            </w:r>
+          </w:p>
+        </w:tc>
+        <w:tc>
+          <w:tcPr/>
+          <w:p>
+            <w:pPr>
+              <w:pStyle w:val="Compact"/>
+              <w:jc w:val="left"/>
+            </w:pPr>
+            <w:r>
+              <w:t xml:space="preserve">Decreto + ADR + cooperativas</w:t>
+            </w:r>
+          </w:p>
+        </w:tc>
+        <w:tc>
+          <w:tcPr/>
+          <w:p>
+            <w:pPr>
+              <w:pStyle w:val="Compact"/>
+              <w:jc w:val="left"/>
+            </w:pPr>
+            <w:r>
+              <w:t xml:space="preserve">Años 1-4</w:t>
+            </w:r>
+          </w:p>
+        </w:tc>
+      </w:tr>
+      <w:tr>
+        <w:tc>
+          <w:tcPr/>
+          <w:p>
+            <w:pPr>
+              <w:pStyle w:val="Compact"/>
+              <w:jc w:val="left"/>
+            </w:pPr>
+            <w:r>
+              <w:t xml:space="preserve">Compra pública como demanda ancla</w:t>
+            </w:r>
+          </w:p>
+        </w:tc>
+        <w:tc>
+          <w:tcPr/>
+          <w:p>
+            <w:pPr>
+              <w:pStyle w:val="Compact"/>
+              <w:jc w:val="left"/>
+            </w:pPr>
+            <w:r>
+              <w:t xml:space="preserve">El PAE, las guarniciones militares y los hospitales compran a las cooperativas de los nodos con contratos previsibles, dando escala para invertir</w:t>
+            </w:r>
+          </w:p>
+        </w:tc>
+        <w:tc>
+          <w:tcPr/>
+          <w:p>
+            <w:pPr>
+              <w:pStyle w:val="Compact"/>
+              <w:jc w:val="left"/>
+            </w:pPr>
+            <w:r>
+              <w:t xml:space="preserve">Reglamento de contratación</w:t>
             </w:r>
           </w:p>
         </w:tc>
@@ -7677,64 +7291,106 @@
               <w:jc w:val="left"/>
             </w:pPr>
             <w:r>
-              <w:t xml:space="preserve">Articulación SENA dual</w:t>
-            </w:r>
-          </w:p>
-        </w:tc>
-        <w:tc>
-          <w:tcPr/>
-          <w:p>
-            <w:pPr>
-              <w:pStyle w:val="Compact"/>
-              <w:jc w:val="left"/>
-            </w:pPr>
-            <w:r>
-              <w:t xml:space="preserve">Certificado de competencias como llave de salida del ciclo de reclutamiento; módulos de empleabilidad</w:t>
-            </w:r>
-          </w:p>
-        </w:tc>
-        <w:tc>
-          <w:tcPr/>
-          <w:p>
-            <w:pPr>
-              <w:pStyle w:val="Compact"/>
-              <w:jc w:val="left"/>
-            </w:pPr>
-            <w:r>
-              <w:t xml:space="preserve">SENA + Min. Trabajo</w:t>
-            </w:r>
-          </w:p>
-        </w:tc>
-        <w:tc>
-          <w:tcPr/>
-          <w:p>
-            <w:pPr>
-              <w:pStyle w:val="Compact"/>
-              <w:jc w:val="left"/>
-            </w:pPr>
-            <w:r>
-              <w:t xml:space="preserve">Fase 1</w:t>
+              <w:t xml:space="preserve">Asociatividad que baja costos</w:t>
+            </w:r>
+          </w:p>
+        </w:tc>
+        <w:tc>
+          <w:tcPr/>
+          <w:p>
+            <w:pPr>
+              <w:pStyle w:val="Compact"/>
+              <w:jc w:val="left"/>
+            </w:pPr>
+            <w:r>
+              <w:t xml:space="preserve">Cooperativas para comprar insumos en volumen, compartir maquinaria y negociar precio, con el costo de formación reducido (Frente I)</w:t>
+            </w:r>
+          </w:p>
+        </w:tc>
+        <w:tc>
+          <w:tcPr/>
+          <w:p>
+            <w:pPr>
+              <w:pStyle w:val="Compact"/>
+              <w:jc w:val="left"/>
+            </w:pPr>
+            <w:r>
+              <w:t xml:space="preserve">Ley + decreto</w:t>
+            </w:r>
+          </w:p>
+        </w:tc>
+        <w:tc>
+          <w:tcPr/>
+          <w:p>
+            <w:pPr>
+              <w:pStyle w:val="Compact"/>
+              <w:jc w:val="left"/>
+            </w:pPr>
+            <w:r>
+              <w:t xml:space="preserve">Años 1-2</w:t>
+            </w:r>
+          </w:p>
+        </w:tc>
+      </w:tr>
+      <w:tr>
+        <w:tc>
+          <w:tcPr/>
+          <w:p>
+            <w:pPr>
+              <w:pStyle w:val="Compact"/>
+              <w:jc w:val="left"/>
+            </w:pPr>
+            <w:r>
+              <w:t xml:space="preserve">Acceso directo a mercado y exportación</w:t>
+            </w:r>
+          </w:p>
+        </w:tc>
+        <w:tc>
+          <w:tcPr/>
+          <w:p>
+            <w:pPr>
+              <w:pStyle w:val="Compact"/>
+              <w:jc w:val="left"/>
+            </w:pPr>
+            <w:r>
+              <w:t xml:space="preserve">Vincular las marcas territoriales y las denominaciones de origen (cacao del Caquetá, café del Cesar) con ProColombia y los canales de exportación</w:t>
+            </w:r>
+          </w:p>
+        </w:tc>
+        <w:tc>
+          <w:tcPr/>
+          <w:p>
+            <w:pPr>
+              <w:pStyle w:val="Compact"/>
+              <w:jc w:val="left"/>
+            </w:pPr>
+            <w:r>
+              <w:t xml:space="preserve">Decreto + ProColombia</w:t>
+            </w:r>
+          </w:p>
+        </w:tc>
+        <w:tc>
+          <w:tcPr/>
+          <w:p>
+            <w:pPr>
+              <w:pStyle w:val="Compact"/>
+              <w:jc w:val="left"/>
+            </w:pPr>
+            <w:r>
+              <w:t xml:space="preserve">Años 2-4</w:t>
             </w:r>
           </w:p>
         </w:tc>
       </w:tr>
     </w:tbl>
-    <w:bookmarkEnd w:id="48"/>
-    <w:bookmarkStart w:id="49" w:name="X6ba3ae1e4becc3dcb03e8bc5a1df200742b0da1"/>
+    <w:bookmarkEnd w:id="46"/>
+    <w:bookmarkStart w:id="47" w:name="Xb62ecd1740456cb0eeeba5a58343441d5501244"/>
     <w:p>
       <w:pPr>
-        <w:pStyle w:val="Heading2"/>
-      </w:pPr>
-      <w:r>
-        <w:t xml:space="preserve">3.5 Puente de ingreso para sustitución de coca: el eslabón que rompe el ciclo</w:t>
-      </w:r>
-    </w:p>
-    <w:p>
-      <w:pPr>
-        <w:pStyle w:val="FirstParagraph"/>
-      </w:pPr>
-      <w:r>
-        <w:t xml:space="preserve">Entre arrancar la coca y que el cultivo alternativo produzca ingreso pasan 8-24 meses. Sin ingreso en ese vacío, la familia regresa a la coca por necesidad. Cerrarlo es la condición de posibilidad de la sustitución voluntaria.</w:t>
+        <w:pStyle w:val="Heading3"/>
+      </w:pPr>
+      <w:r>
+        <w:t xml:space="preserve">D. Riego y bienes públicos que multiplican el rendimiento</w:t>
       </w:r>
     </w:p>
     <w:tbl>
@@ -7762,7 +7418,7 @@
               <w:jc w:val="left"/>
             </w:pPr>
             <w:r>
-              <w:t xml:space="preserve">Componente</w:t>
+              <w:t xml:space="preserve">Medida</w:t>
             </w:r>
           </w:p>
         </w:tc>
@@ -7786,232 +7442,386 @@
               <w:jc w:val="left"/>
             </w:pPr>
             <w:r>
-              <w:t xml:space="preserve">Lógica</w:t>
-            </w:r>
-          </w:p>
-        </w:tc>
-        <w:tc>
-          <w:tcPr/>
-          <w:p>
-            <w:pPr>
-              <w:pStyle w:val="Compact"/>
-              <w:jc w:val="left"/>
-            </w:pPr>
-            <w:r>
-              <w:t xml:space="preserve">Responsable</w:t>
-            </w:r>
-          </w:p>
-        </w:tc>
-      </w:tr>
-      <w:tr>
-        <w:tc>
-          <w:tcPr/>
-          <w:p>
-            <w:pPr>
-              <w:pStyle w:val="Compact"/>
-              <w:jc w:val="left"/>
-            </w:pPr>
-            <w:r>
-              <w:t xml:space="preserve">Empleo temporal en obras del nodo</w:t>
-            </w:r>
-          </w:p>
-        </w:tc>
-        <w:tc>
-          <w:tcPr/>
-          <w:p>
-            <w:pPr>
-              <w:pStyle w:val="Compact"/>
-              <w:jc w:val="left"/>
-            </w:pPr>
-            <w:r>
-              <w:t xml:space="preserve">Prioridad a familias que arrancan coca: escuelas, salud, vías terciarias, acueductos, reforestación. $1.5-2M/mes, 6 meses. Meta 500-1.000 empleos/nodo</w:t>
-            </w:r>
-          </w:p>
-        </w:tc>
-        <w:tc>
-          <w:tcPr/>
-          <w:p>
-            <w:pPr>
-              <w:pStyle w:val="Compact"/>
-              <w:jc w:val="left"/>
-            </w:pPr>
-            <w:r>
-              <w:t xml:space="preserve">El campesino no pierde ingreso al salir de la coca; el período de espera construye los bienes públicos del nodo</w:t>
-            </w:r>
-          </w:p>
-        </w:tc>
-        <w:tc>
-          <w:tcPr/>
-          <w:p>
-            <w:pPr>
-              <w:pStyle w:val="Compact"/>
-              <w:jc w:val="left"/>
-            </w:pPr>
-            <w:r>
-              <w:t xml:space="preserve">Min. Trabajo + INVIAS + Min. Vivienda</w:t>
-            </w:r>
-          </w:p>
-        </w:tc>
-      </w:tr>
-      <w:tr>
-        <w:tc>
-          <w:tcPr/>
-          <w:p>
-            <w:pPr>
-              <w:pStyle w:val="Compact"/>
-              <w:jc w:val="left"/>
-            </w:pPr>
-            <w:r>
-              <w:t xml:space="preserve">Pago por arranque voluntario</w:t>
-            </w:r>
-          </w:p>
-        </w:tc>
-        <w:tc>
-          <w:tcPr/>
-          <w:p>
-            <w:pPr>
-              <w:pStyle w:val="Compact"/>
-              <w:jc w:val="left"/>
-            </w:pPr>
-            <w:r>
-              <w:t xml:space="preserve">$5.000-8.000/ha: 50% al arrancar, 50% a los 6 meses con cultivo alternativo. Verificación por drones, no por papel</w:t>
-            </w:r>
-          </w:p>
-        </w:tc>
-        <w:tc>
-          <w:tcPr/>
-          <w:p>
-            <w:pPr>
-              <w:pStyle w:val="Compact"/>
-              <w:jc w:val="left"/>
-            </w:pPr>
-            <w:r>
-              <w:t xml:space="preserve">Señal económica inmediata que cambia el cálculo</w:t>
-            </w:r>
-          </w:p>
-        </w:tc>
-        <w:tc>
-          <w:tcPr/>
-          <w:p>
-            <w:pPr>
-              <w:pStyle w:val="Compact"/>
-              <w:jc w:val="left"/>
-            </w:pPr>
-            <w:r>
-              <w:t xml:space="preserve">UNODC + Min. Agricultura</w:t>
-            </w:r>
-          </w:p>
-        </w:tc>
-      </w:tr>
-      <w:tr>
-        <w:tc>
-          <w:tcPr/>
-          <w:p>
-            <w:pPr>
-              <w:pStyle w:val="Compact"/>
-              <w:jc w:val="left"/>
-            </w:pPr>
-            <w:r>
-              <w:t xml:space="preserve">Compra garantizada (2 años)</w:t>
-            </w:r>
-          </w:p>
-        </w:tc>
-        <w:tc>
-          <w:tcPr/>
-          <w:p>
-            <w:pPr>
-              <w:pStyle w:val="Compact"/>
-              <w:jc w:val="left"/>
-            </w:pPr>
-            <w:r>
-              <w:t xml:space="preserve">El Estado compra 100% de la producción alternativa a ≥80% del precio internacional (Idema reformado)</w:t>
-            </w:r>
-          </w:p>
-        </w:tc>
-        <w:tc>
-          <w:tcPr/>
-          <w:p>
-            <w:pPr>
-              <w:pStyle w:val="Compact"/>
-              <w:jc w:val="left"/>
-            </w:pPr>
-            <w:r>
-              <w:t xml:space="preserve">Elimina la incertidumbre de mercado, segundo factor de regreso a la coca</w:t>
-            </w:r>
-          </w:p>
-        </w:tc>
-        <w:tc>
-          <w:tcPr/>
-          <w:p>
-            <w:pPr>
-              <w:pStyle w:val="Compact"/>
-              <w:jc w:val="left"/>
-            </w:pPr>
-            <w:r>
-              <w:t xml:space="preserve">Min. Agricultura + IDEMA reformado</w:t>
-            </w:r>
-          </w:p>
-        </w:tc>
-      </w:tr>
-      <w:tr>
-        <w:tc>
-          <w:tcPr/>
-          <w:p>
-            <w:pPr>
-              <w:pStyle w:val="Compact"/>
-              <w:jc w:val="left"/>
-            </w:pPr>
-            <w:r>
-              <w:t xml:space="preserve">Articulación con reforma agraria</w:t>
-            </w:r>
-          </w:p>
-        </w:tc>
-        <w:tc>
-          <w:tcPr/>
-          <w:p>
-            <w:pPr>
-              <w:pStyle w:val="Compact"/>
-              <w:jc w:val="left"/>
-            </w:pPr>
-            <w:r>
-              <w:t xml:space="preserve">El arranque activa la titulación y el paquete habilitador. El título es el activo que vuelve permanente la decisión</w:t>
-            </w:r>
-          </w:p>
-        </w:tc>
-        <w:tc>
-          <w:tcPr/>
-          <w:p>
-            <w:pPr>
-              <w:pStyle w:val="Compact"/>
-              <w:jc w:val="left"/>
-            </w:pPr>
-            <w:r>
-              <w:t xml:space="preserve">La tierra propia es el mayor desincentivo al regreso</w:t>
-            </w:r>
-          </w:p>
-        </w:tc>
-        <w:tc>
-          <w:tcPr/>
-          <w:p>
-            <w:pPr>
-              <w:pStyle w:val="Compact"/>
-              <w:jc w:val="left"/>
-            </w:pPr>
-            <w:r>
-              <w:t xml:space="preserve">ANT + Min. Agricultura</w:t>
+              <w:t xml:space="preserve">Vía jurídica</w:t>
+            </w:r>
+          </w:p>
+        </w:tc>
+        <w:tc>
+          <w:tcPr/>
+          <w:p>
+            <w:pPr>
+              <w:pStyle w:val="Compact"/>
+              <w:jc w:val="left"/>
+            </w:pPr>
+            <w:r>
+              <w:t xml:space="preserve">Plazo</w:t>
+            </w:r>
+          </w:p>
+        </w:tc>
+      </w:tr>
+      <w:tr>
+        <w:tc>
+          <w:tcPr/>
+          <w:p>
+            <w:pPr>
+              <w:pStyle w:val="Compact"/>
+              <w:jc w:val="left"/>
+            </w:pPr>
+            <w:r>
+              <w:t xml:space="preserve">Distritos de riego pequeños y medianos</w:t>
+            </w:r>
+          </w:p>
+        </w:tc>
+        <w:tc>
+          <w:tcPr/>
+          <w:p>
+            <w:pPr>
+              <w:pStyle w:val="Compact"/>
+              <w:jc w:val="left"/>
+            </w:pPr>
+            <w:r>
+              <w:t xml:space="preserve">Riego tecnificado donde la cadena lo justifica; el riego puede duplicar el rendimiento por hectárea</w:t>
+            </w:r>
+          </w:p>
+        </w:tc>
+        <w:tc>
+          <w:tcPr/>
+          <w:p>
+            <w:pPr>
+              <w:pStyle w:val="Compact"/>
+              <w:jc w:val="left"/>
+            </w:pPr>
+            <w:r>
+              <w:t xml:space="preserve">Decreto + ADR + presupuesto</w:t>
+            </w:r>
+          </w:p>
+        </w:tc>
+        <w:tc>
+          <w:tcPr/>
+          <w:p>
+            <w:pPr>
+              <w:pStyle w:val="Compact"/>
+              <w:jc w:val="left"/>
+            </w:pPr>
+            <w:r>
+              <w:t xml:space="preserve">Años 1-4</w:t>
+            </w:r>
+          </w:p>
+        </w:tc>
+      </w:tr>
+      <w:tr>
+        <w:tc>
+          <w:tcPr/>
+          <w:p>
+            <w:pPr>
+              <w:pStyle w:val="Compact"/>
+              <w:jc w:val="left"/>
+            </w:pPr>
+            <w:r>
+              <w:t xml:space="preserve">Vías terciarias y conectividad</w:t>
+            </w:r>
+          </w:p>
+        </w:tc>
+        <w:tc>
+          <w:tcPr/>
+          <w:p>
+            <w:pPr>
+              <w:pStyle w:val="Compact"/>
+              <w:jc w:val="left"/>
+            </w:pPr>
+            <w:r>
+              <w:t xml:space="preserve">El mismo paquete de bienes públicos del nodo (Frente I); sin vía, la cosecha se pierde o el flete se come el margen</w:t>
+            </w:r>
+          </w:p>
+        </w:tc>
+        <w:tc>
+          <w:tcPr/>
+          <w:p>
+            <w:pPr>
+              <w:pStyle w:val="Compact"/>
+              <w:jc w:val="left"/>
+            </w:pPr>
+            <w:r>
+              <w:t xml:space="preserve">INVIAS + Min. TIC</w:t>
+            </w:r>
+          </w:p>
+        </w:tc>
+        <w:tc>
+          <w:tcPr/>
+          <w:p>
+            <w:pPr>
+              <w:pStyle w:val="Compact"/>
+              <w:jc w:val="left"/>
+            </w:pPr>
+            <w:r>
+              <w:t xml:space="preserve">Por ola</w:t>
             </w:r>
           </w:p>
         </w:tc>
       </w:tr>
     </w:tbl>
-    <w:bookmarkEnd w:id="49"/>
-    <w:bookmarkStart w:id="50" w:name="Xdd8fc299dd5c76316850f0d87d9bbb02f82974a"/>
+    <w:bookmarkEnd w:id="47"/>
+    <w:bookmarkStart w:id="48" w:name="X8b68fea6c675426c680e90e779e14b88416b05c"/>
     <w:p>
       <w:pPr>
-        <w:pStyle w:val="Heading2"/>
-      </w:pPr>
-      <w:r>
-        <w:t xml:space="preserve">3.6 Soberanía y diversificación de proveedores de defensa</w:t>
+        <w:pStyle w:val="Heading3"/>
+      </w:pPr>
+      <w:r>
+        <w:t xml:space="preserve">Métricas de productividad rural (no solo hectáreas tituladas)</w:t>
+      </w:r>
+    </w:p>
+    <w:tbl>
+      <w:tblPr>
+        <w:tblStyle w:val="Table"/>
+        <w:tblW w:type="pct" w:w="5000"/>
+        <w:tblLook w:firstRow="1" w:lastRow="0" w:firstColumn="0" w:lastColumn="0" w:noHBand="0" w:noVBand="0" w:val="0020"/>
+        <w:jc w:val="start"/>
+      </w:tblPr>
+      <w:tblGrid>
+        <w:gridCol w:w="2640"/>
+        <w:gridCol w:w="2640"/>
+        <w:gridCol w:w="2640"/>
+      </w:tblGrid>
+      <w:tr>
+        <w:trPr>
+          <w:tblHeader w:val="true"/>
+        </w:trPr>
+        <w:tc>
+          <w:tcPr/>
+          <w:p>
+            <w:pPr>
+              <w:pStyle w:val="Compact"/>
+              <w:jc w:val="left"/>
+            </w:pPr>
+            <w:r>
+              <w:t xml:space="preserve">Indicador</w:t>
+            </w:r>
+          </w:p>
+        </w:tc>
+        <w:tc>
+          <w:tcPr/>
+          <w:p>
+            <w:pPr>
+              <w:pStyle w:val="Compact"/>
+              <w:jc w:val="left"/>
+            </w:pPr>
+            <w:r>
+              <w:t xml:space="preserve">Qué mide</w:t>
+            </w:r>
+          </w:p>
+        </w:tc>
+        <w:tc>
+          <w:tcPr/>
+          <w:p>
+            <w:pPr>
+              <w:pStyle w:val="Compact"/>
+              <w:jc w:val="left"/>
+            </w:pPr>
+            <w:r>
+              <w:t xml:space="preserve">Meta</w:t>
+            </w:r>
+          </w:p>
+        </w:tc>
+      </w:tr>
+      <w:tr>
+        <w:tc>
+          <w:tcPr/>
+          <w:p>
+            <w:pPr>
+              <w:pStyle w:val="Compact"/>
+              <w:jc w:val="left"/>
+            </w:pPr>
+            <w:r>
+              <w:t xml:space="preserve">Rendimiento por hectárea en cadenas priorizadas</w:t>
+            </w:r>
+          </w:p>
+        </w:tc>
+        <w:tc>
+          <w:tcPr/>
+          <w:p>
+            <w:pPr>
+              <w:pStyle w:val="Compact"/>
+              <w:jc w:val="left"/>
+            </w:pPr>
+            <w:r>
+              <w:t xml:space="preserve">Productividad agrícola real</w:t>
+            </w:r>
+          </w:p>
+        </w:tc>
+        <w:tc>
+          <w:tcPr/>
+          <w:p>
+            <w:pPr>
+              <w:pStyle w:val="Compact"/>
+              <w:jc w:val="left"/>
+            </w:pPr>
+            <w:r>
+              <w:t xml:space="preserve">Subir de forma sostenida frente a la línea base del nodo</w:t>
+            </w:r>
+          </w:p>
+        </w:tc>
+      </w:tr>
+      <w:tr>
+        <w:tc>
+          <w:tcPr/>
+          <w:p>
+            <w:pPr>
+              <w:pStyle w:val="Compact"/>
+              <w:jc w:val="left"/>
+            </w:pPr>
+            <w:r>
+              <w:t xml:space="preserve">Ingreso neto del productor formalizado</w:t>
+            </w:r>
+          </w:p>
+        </w:tc>
+        <w:tc>
+          <w:tcPr/>
+          <w:p>
+            <w:pPr>
+              <w:pStyle w:val="Compact"/>
+              <w:jc w:val="left"/>
+            </w:pPr>
+            <w:r>
+              <w:t xml:space="preserve">Que la productividad llega al campesino, no solo al intermediario</w:t>
+            </w:r>
+          </w:p>
+        </w:tc>
+        <w:tc>
+          <w:tcPr/>
+          <w:p>
+            <w:pPr>
+              <w:pStyle w:val="Compact"/>
+              <w:jc w:val="left"/>
+            </w:pPr>
+            <w:r>
+              <w:t xml:space="preserve">Crecimiento verificable en PILA y registros de cooperativa</w:t>
+            </w:r>
+          </w:p>
+        </w:tc>
+      </w:tr>
+      <w:tr>
+        <w:tc>
+          <w:tcPr/>
+          <w:p>
+            <w:pPr>
+              <w:pStyle w:val="Compact"/>
+              <w:jc w:val="left"/>
+            </w:pPr>
+            <w:r>
+              <w:t xml:space="preserve">Valor agregado retenido en el territorio</w:t>
+            </w:r>
+          </w:p>
+        </w:tc>
+        <w:tc>
+          <w:tcPr/>
+          <w:p>
+            <w:pPr>
+              <w:pStyle w:val="Compact"/>
+              <w:jc w:val="left"/>
+            </w:pPr>
+            <w:r>
+              <w:t xml:space="preserve">Que el nodo procesa, no solo extrae</w:t>
+            </w:r>
+          </w:p>
+        </w:tc>
+        <w:tc>
+          <w:tcPr/>
+          <w:p>
+            <w:pPr>
+              <w:pStyle w:val="Compact"/>
+              <w:jc w:val="left"/>
+            </w:pPr>
+            <w:r>
+              <w:t xml:space="preserve">% de producción con primera transformación local</w:t>
+            </w:r>
+          </w:p>
+        </w:tc>
+      </w:tr>
+      <w:tr>
+        <w:tc>
+          <w:tcPr/>
+          <w:p>
+            <w:pPr>
+              <w:pStyle w:val="Compact"/>
+              <w:jc w:val="left"/>
+            </w:pPr>
+            <w:r>
+              <w:t xml:space="preserve">Exportaciones agro no tradicionales de los nodos</w:t>
+            </w:r>
+          </w:p>
+        </w:tc>
+        <w:tc>
+          <w:tcPr/>
+          <w:p>
+            <w:pPr>
+              <w:pStyle w:val="Compact"/>
+              <w:jc w:val="left"/>
+            </w:pPr>
+            <w:r>
+              <w:t xml:space="preserve">Aporte a la competitividad nacional</w:t>
+            </w:r>
+          </w:p>
+        </w:tc>
+        <w:tc>
+          <w:tcPr/>
+          <w:p>
+            <w:pPr>
+              <w:pStyle w:val="Compact"/>
+              <w:jc w:val="left"/>
+            </w:pPr>
+            <w:r>
+              <w:t xml:space="preserve">Crecimiento real en el período</w:t>
+            </w:r>
+          </w:p>
+        </w:tc>
+      </w:tr>
+      <w:tr>
+        <w:tc>
+          <w:tcPr/>
+          <w:p>
+            <w:pPr>
+              <w:pStyle w:val="Compact"/>
+              <w:jc w:val="left"/>
+            </w:pPr>
+            <w:r>
+              <w:t xml:space="preserve">Tasa de uso del título como colateral</w:t>
+            </w:r>
+          </w:p>
+        </w:tc>
+        <w:tc>
+          <w:tcPr/>
+          <w:p>
+            <w:pPr>
+              <w:pStyle w:val="Compact"/>
+              <w:jc w:val="left"/>
+            </w:pPr>
+            <w:r>
+              <w:t xml:space="preserve">Que el título es activo productivo, no papel</w:t>
+            </w:r>
+          </w:p>
+        </w:tc>
+        <w:tc>
+          <w:tcPr/>
+          <w:p>
+            <w:pPr>
+              <w:pStyle w:val="Compact"/>
+              <w:jc w:val="left"/>
+            </w:pPr>
+            <w:r>
+              <w:t xml:space="preserve">% de títulos nuevos con crédito asociado a 24 meses</w:t>
+            </w:r>
+          </w:p>
+        </w:tc>
+      </w:tr>
+    </w:tbl>
+    <w:bookmarkEnd w:id="48"/>
+    <w:bookmarkStart w:id="49" w:name="la-advertencia-honesta"/>
+    <w:p>
+      <w:pPr>
+        <w:pStyle w:val="Heading3"/>
+      </w:pPr>
+      <w:r>
+        <w:t xml:space="preserve">La advertencia honesta</w:t>
       </w:r>
     </w:p>
     <w:p>
@@ -8019,20 +7829,1433 @@
         <w:pStyle w:val="FirstParagraph"/>
       </w:pPr>
       <w:r>
-        <w:t xml:space="preserve">Regla: ningún proveedor &gt;40% del portafolio. Diversificar hacia Corea del Sur, Francia, Alemania, Turquía, Brasil y Colombia misma. Toda compra importada incluye cláusula obligatoria de transferencia tecnológica a COTECMAR/CIAC/Indumil, producción nacional progresiva (offset mínimo 20% en el primer contrato, escalando) y formación de ingenieros colombianos.</w:t>
+        <w:t xml:space="preserve">Titular sin paquete habilitador produce papeles, no productividad: es el error histórico que el Frente II ya busca evitar con su regla de</w:t>
+      </w:r>
+      <w:r>
+        <w:t xml:space="preserve"> </w:t>
+      </w:r>
+      <w:r>
+        <w:t xml:space="preserve">“</w:t>
+      </w:r>
+      <w:r>
+        <w:t xml:space="preserve">ninguna tierra sin crédito, asistencia técnica, vía y mercado</w:t>
+      </w:r>
+      <w:r>
+        <w:t xml:space="preserve">”</w:t>
+      </w:r>
+      <w:r>
+        <w:t xml:space="preserve">. Este módulo es esa regla vuelta sistema. Y, como en el caso urbano, el riesgo es capturar el beneficio en los grandes; por eso prioriza al pequeño y mediano productor y la propiedad cooperativa, no la agroindustria ya consolidada.</w:t>
+      </w:r>
+    </w:p>
+    <w:bookmarkEnd w:id="49"/>
+    <w:bookmarkEnd w:id="50"/>
+    <w:bookmarkEnd w:id="51"/>
+    <w:bookmarkStart w:id="58" w:name="X6fb056096c407b019522fb160b94cd4b406fa8f"/>
+    <w:p>
+      <w:pPr>
+        <w:pStyle w:val="Heading1"/>
+      </w:pPr>
+      <w:r>
+        <w:t xml:space="preserve">Frente III: Seguridad, Soberanía e Inteligencia</w:t>
       </w:r>
     </w:p>
     <w:p>
       <w:pPr>
+        <w:pStyle w:val="FirstParagraph"/>
+      </w:pPr>
+      <w:r>
+        <w:rPr>
+          <w:bCs/>
+          <w:b/>
+        </w:rPr>
+        <w:t xml:space="preserve">Metas:</w:t>
+      </w:r>
+      <w:r>
+        <w:t xml:space="preserve"> </w:t>
+      </w:r>
+      <w:r>
+        <w:t xml:space="preserve">homicidios de ~26 a ≤18/100.000 en 4 años; coca −30% en 4 años; cero falsos positivos.</w:t>
+      </w:r>
+    </w:p>
+    <w:bookmarkStart w:id="52" w:name="estrategia-de-control-territorial"/>
+    <w:p>
+      <w:pPr>
+        <w:pStyle w:val="Heading2"/>
+      </w:pPr>
+      <w:r>
+        <w:t xml:space="preserve">3.1 Estrategia de control territorial</w:t>
+      </w:r>
+    </w:p>
+    <w:p>
+      <w:pPr>
+        <w:pStyle w:val="FirstParagraph"/>
+      </w:pPr>
+      <w:r>
+        <w:t xml:space="preserve">Reencuadre: no</w:t>
+      </w:r>
+      <w:r>
+        <w:t xml:space="preserve"> </w:t>
+      </w:r>
+      <w:r>
+        <w:t xml:space="preserve">“</w:t>
+      </w:r>
+      <w:r>
+        <w:t xml:space="preserve">línea dura vs. negociación</w:t>
+      </w:r>
+      <w:r>
+        <w:t xml:space="preserve">”</w:t>
+      </w:r>
+      <w:r>
+        <w:t xml:space="preserve">. La restricción que ata es</w:t>
+      </w:r>
+      <w:r>
+        <w:t xml:space="preserve"> </w:t>
+      </w:r>
+      <w:r>
+        <w:rPr>
+          <w:bCs/>
+          <w:b/>
+        </w:rPr>
+        <w:t xml:space="preserve">control territorial + desmonte de economías ilegales</w:t>
+      </w:r>
+      <w:r>
+        <w:t xml:space="preserve">. Fuerza, negociación y sometimiento son herramientas subordinadas a ese fin.</w:t>
+      </w:r>
+    </w:p>
+    <w:tbl>
+      <w:tblPr>
+        <w:tblStyle w:val="Table"/>
+        <w:tblW w:type="pct" w:w="5000"/>
+        <w:tblLook w:firstRow="1" w:lastRow="0" w:firstColumn="0" w:lastColumn="0" w:noHBand="0" w:noVBand="0" w:val="0020"/>
+        <w:jc w:val="start"/>
+      </w:tblPr>
+      <w:tblGrid>
+        <w:gridCol w:w="1980"/>
+        <w:gridCol w:w="1980"/>
+        <w:gridCol w:w="1980"/>
+        <w:gridCol w:w="1980"/>
+      </w:tblGrid>
+      <w:tr>
+        <w:trPr>
+          <w:tblHeader w:val="true"/>
+        </w:trPr>
+        <w:tc>
+          <w:tcPr/>
+          <w:p>
+            <w:pPr>
+              <w:pStyle w:val="Compact"/>
+              <w:jc w:val="left"/>
+            </w:pPr>
+            <w:r>
+              <w:t xml:space="preserve">Instrumento</w:t>
+            </w:r>
+          </w:p>
+        </w:tc>
+        <w:tc>
+          <w:tcPr/>
+          <w:p>
+            <w:pPr>
+              <w:pStyle w:val="Compact"/>
+              <w:jc w:val="left"/>
+            </w:pPr>
+            <w:r>
+              <w:t xml:space="preserve">Medida</w:t>
+            </w:r>
+          </w:p>
+        </w:tc>
+        <w:tc>
+          <w:tcPr/>
+          <w:p>
+            <w:pPr>
+              <w:pStyle w:val="Compact"/>
+              <w:jc w:val="left"/>
+            </w:pPr>
+            <w:r>
+              <w:t xml:space="preserve">Condición</w:t>
+            </w:r>
+          </w:p>
+        </w:tc>
+        <w:tc>
+          <w:tcPr/>
+          <w:p>
+            <w:pPr>
+              <w:pStyle w:val="Compact"/>
+              <w:jc w:val="left"/>
+            </w:pPr>
+            <w:r>
+              <w:t xml:space="preserve">Responsable</w:t>
+            </w:r>
+          </w:p>
+        </w:tc>
+      </w:tr>
+      <w:tr>
+        <w:tc>
+          <w:tcPr/>
+          <w:p>
+            <w:pPr>
+              <w:pStyle w:val="Compact"/>
+              <w:jc w:val="left"/>
+            </w:pPr>
+            <w:r>
+              <w:t xml:space="preserve">Negociación</w:t>
+            </w:r>
+          </w:p>
+        </w:tc>
+        <w:tc>
+          <w:tcPr/>
+          <w:p>
+            <w:pPr>
+              <w:pStyle w:val="Compact"/>
+              <w:jc w:val="left"/>
+            </w:pPr>
+            <w:r>
+              <w:t xml:space="preserve">Con grupos con mando verificable y horizonte político; garantes creíbles; avance condicionado a hechos</w:t>
+            </w:r>
+          </w:p>
+        </w:tc>
+        <w:tc>
+          <w:tcPr/>
+          <w:p>
+            <w:pPr>
+              <w:pStyle w:val="Compact"/>
+              <w:jc w:val="left"/>
+            </w:pPr>
+            <w:r>
+              <w:t xml:space="preserve">Cese verificado 90 días</w:t>
+            </w:r>
+          </w:p>
+        </w:tc>
+        <w:tc>
+          <w:tcPr/>
+          <w:p>
+            <w:pPr>
+              <w:pStyle w:val="Compact"/>
+              <w:jc w:val="left"/>
+            </w:pPr>
+            <w:r>
+              <w:t xml:space="preserve">Alto Comisionado</w:t>
+            </w:r>
+          </w:p>
+        </w:tc>
+      </w:tr>
+      <w:tr>
+        <w:tc>
+          <w:tcPr/>
+          <w:p>
+            <w:pPr>
+              <w:pStyle w:val="Compact"/>
+              <w:jc w:val="left"/>
+            </w:pPr>
+            <w:r>
+              <w:t xml:space="preserve">Sometimiento</w:t>
+            </w:r>
+          </w:p>
+        </w:tc>
+        <w:tc>
+          <w:tcPr/>
+          <w:p>
+            <w:pPr>
+              <w:pStyle w:val="Compact"/>
+              <w:jc w:val="left"/>
+            </w:pPr>
+            <w:r>
+              <w:t xml:space="preserve">Grupos criminal-económicos sin agenda política; rendición individual con beneficios escalonados</w:t>
+            </w:r>
+          </w:p>
+        </w:tc>
+        <w:tc>
+          <w:tcPr/>
+          <w:p>
+            <w:pPr>
+              <w:pStyle w:val="Compact"/>
+              <w:jc w:val="left"/>
+            </w:pPr>
+            <w:r>
+              <w:t xml:space="preserve">Ventana de 6 meses</w:t>
+            </w:r>
+          </w:p>
+        </w:tc>
+        <w:tc>
+          <w:tcPr/>
+          <w:p>
+            <w:pPr>
+              <w:pStyle w:val="Compact"/>
+              <w:jc w:val="left"/>
+            </w:pPr>
+            <w:r>
+              <w:t xml:space="preserve">Fiscalía + Min. Justicia</w:t>
+            </w:r>
+          </w:p>
+        </w:tc>
+      </w:tr>
+      <w:tr>
+        <w:tc>
+          <w:tcPr/>
+          <w:p>
+            <w:pPr>
+              <w:pStyle w:val="Compact"/>
+              <w:jc w:val="left"/>
+            </w:pPr>
+            <w:r>
+              <w:t xml:space="preserve">Fuerza</w:t>
+            </w:r>
+          </w:p>
+        </w:tc>
+        <w:tc>
+          <w:tcPr/>
+          <w:p>
+            <w:pPr>
+              <w:pStyle w:val="Compact"/>
+              <w:jc w:val="left"/>
+            </w:pPr>
+            <w:r>
+              <w:t xml:space="preserve">Último recurso; foco en cabecillas y finanzas, no en combatientes rasos</w:t>
+            </w:r>
+          </w:p>
+        </w:tc>
+        <w:tc>
+          <w:tcPr/>
+          <w:p>
+            <w:pPr>
+              <w:pStyle w:val="Compact"/>
+              <w:jc w:val="left"/>
+            </w:pPr>
+            <w:r>
+              <w:t xml:space="preserve">Solo tras fracaso de negociación/sometimiento</w:t>
+            </w:r>
+          </w:p>
+        </w:tc>
+        <w:tc>
+          <w:tcPr/>
+          <w:p>
+            <w:pPr>
+              <w:pStyle w:val="Compact"/>
+              <w:jc w:val="left"/>
+            </w:pPr>
+            <w:r>
+              <w:t xml:space="preserve">FF.MM. + Policía</w:t>
+            </w:r>
+          </w:p>
+        </w:tc>
+      </w:tr>
+      <w:tr>
+        <w:tc>
+          <w:tcPr/>
+          <w:p>
+            <w:pPr>
+              <w:pStyle w:val="Compact"/>
+              <w:jc w:val="left"/>
+            </w:pPr>
+            <w:r>
+              <w:t xml:space="preserve">Secar reclutamiento</w:t>
+            </w:r>
+          </w:p>
+        </w:tc>
+        <w:tc>
+          <w:tcPr/>
+          <w:p>
+            <w:pPr>
+              <w:pStyle w:val="Compact"/>
+              <w:jc w:val="left"/>
+            </w:pPr>
+            <w:r>
+              <w:t xml:space="preserve">Empleo formal en zonas de riesgo; los nodos son la política de seguridad</w:t>
+            </w:r>
+          </w:p>
+        </w:tc>
+        <w:tc>
+          <w:tcPr/>
+          <w:p>
+            <w:pPr>
+              <w:pStyle w:val="Compact"/>
+              <w:jc w:val="left"/>
+            </w:pPr>
+            <w:r>
+              <w:t xml:space="preserve">Nodo activo = política de seguridad</w:t>
+            </w:r>
+          </w:p>
+        </w:tc>
+        <w:tc>
+          <w:tcPr/>
+          <w:p>
+            <w:pPr>
+              <w:pStyle w:val="Compact"/>
+              <w:jc w:val="left"/>
+            </w:pPr>
+            <w:r>
+              <w:t xml:space="preserve">DNP + SENA + Min. Trabajo</w:t>
+            </w:r>
+          </w:p>
+        </w:tc>
+      </w:tr>
+      <w:tr>
+        <w:tc>
+          <w:tcPr/>
+          <w:p>
+            <w:pPr>
+              <w:pStyle w:val="Compact"/>
+              <w:jc w:val="left"/>
+            </w:pPr>
+            <w:r>
+              <w:t xml:space="preserve">Drogas</w:t>
+            </w:r>
+          </w:p>
+        </w:tc>
+        <w:tc>
+          <w:tcPr/>
+          <w:p>
+            <w:pPr>
+              <w:pStyle w:val="Compact"/>
+              <w:jc w:val="left"/>
+            </w:pPr>
+            <w:r>
+              <w:t xml:space="preserve">Meta de daño, no erradicación. Golpear tráfico, finanzas y lavado, no al campesino. Sustitución = desarrollo rural</w:t>
+            </w:r>
+          </w:p>
+        </w:tc>
+        <w:tc>
+          <w:tcPr/>
+          <w:p>
+            <w:pPr>
+              <w:pStyle w:val="Compact"/>
+              <w:jc w:val="left"/>
+            </w:pPr>
+            <w:r>
+              <w:t xml:space="preserve">Datos trimestrales</w:t>
+            </w:r>
+          </w:p>
+        </w:tc>
+        <w:tc>
+          <w:tcPr/>
+          <w:p>
+            <w:pPr>
+              <w:pStyle w:val="Compact"/>
+              <w:jc w:val="left"/>
+            </w:pPr>
+            <w:r>
+              <w:t xml:space="preserve">UNODC + Policía + Min. Agr.</w:t>
+            </w:r>
+          </w:p>
+        </w:tc>
+      </w:tr>
+      <w:tr>
+        <w:tc>
+          <w:tcPr/>
+          <w:p>
+            <w:pPr>
+              <w:pStyle w:val="Compact"/>
+              <w:jc w:val="left"/>
+            </w:pPr>
+            <w:r>
+              <w:t xml:space="preserve">Equidad en la carga</w:t>
+            </w:r>
+          </w:p>
+        </w:tc>
+        <w:tc>
+          <w:tcPr/>
+          <w:p>
+            <w:pPr>
+              <w:pStyle w:val="Compact"/>
+              <w:jc w:val="left"/>
+            </w:pPr>
+            <w:r>
+              <w:t xml:space="preserve">Rendición de cuentas por toda muerte civil; candados DD.HH.; no repetir falsos positivos</w:t>
+            </w:r>
+          </w:p>
+        </w:tc>
+        <w:tc>
+          <w:tcPr/>
+          <w:p>
+            <w:pPr>
+              <w:pStyle w:val="Compact"/>
+              <w:jc w:val="left"/>
+            </w:pPr>
+            <w:r>
+              <w:t xml:space="preserve">Verificación independiente</w:t>
+            </w:r>
+          </w:p>
+        </w:tc>
+        <w:tc>
+          <w:tcPr/>
+          <w:p>
+            <w:pPr>
+              <w:pStyle w:val="Compact"/>
+              <w:jc w:val="left"/>
+            </w:pPr>
+            <w:r>
+              <w:t xml:space="preserve">Defensoría + Min. Defensa</w:t>
+            </w:r>
+          </w:p>
+        </w:tc>
+      </w:tr>
+    </w:tbl>
+    <w:bookmarkEnd w:id="52"/>
+    <w:bookmarkStart w:id="53" w:name="X3db343de3374bba162493cf78d004cc45a75a08"/>
+    <w:p>
+      <w:pPr>
+        <w:pStyle w:val="Heading2"/>
+      </w:pPr>
+      <w:r>
+        <w:t xml:space="preserve">3.2 Seguridad concentrada con DIH en nodos Ola 1</w:t>
+      </w:r>
+    </w:p>
+    <w:p>
+      <w:pPr>
+        <w:pStyle w:val="FirstParagraph"/>
+      </w:pPr>
+      <w:r>
+        <w:t xml:space="preserve">En los 3 nodos se aplica concentración de fuerza hasta</w:t>
+      </w:r>
+      <w:r>
+        <w:t xml:space="preserve"> </w:t>
+      </w:r>
+      <w:r>
+        <w:t xml:space="preserve">“</w:t>
+      </w:r>
+      <w:r>
+        <w:t xml:space="preserve">dominio del área</w:t>
+      </w:r>
+      <w:r>
+        <w:t xml:space="preserve">”</w:t>
+      </w:r>
+      <w:r>
+        <w:t xml:space="preserve">: el grupo armado no opera abiertamente, ni recluta, ni extorsiona. Tropa + juez + médico + maestro entran juntos, en semanas. El éxito se mide en presencia estatal civil establecida y reclutamiento seco, no en bajas, lo que elimina el incentivo que generó los falsos positivos. Solo se aplica donde la tasa de homicidios ya desciende (salvo el nodo de aprendizaje de 3.6, que se mantiene en Fase 0).</w:t>
+      </w:r>
+    </w:p>
+    <w:bookmarkEnd w:id="53"/>
+    <w:bookmarkStart w:id="54" w:name="X532d66123b9442d5630c33e3f658f341f92d400"/>
+    <w:p>
+      <w:pPr>
+        <w:pStyle w:val="Heading2"/>
+      </w:pPr>
+      <w:r>
+        <w:t xml:space="preserve">3.3 Capacidades de inteligencia: la brecha más urgente</w:t>
+      </w:r>
+    </w:p>
+    <w:p>
+      <w:pPr>
+        <w:pStyle w:val="FirstParagraph"/>
+      </w:pPr>
+      <w:r>
+        <w:t xml:space="preserve">En 2025 la Fuerza Pública aumentó sus acciones 34% sin mejora de seguridad: el problema no es déficit de operaciones, es déficit de inteligencia y de justicia que consuma los resultados.</w:t>
+      </w:r>
+    </w:p>
+    <w:tbl>
+      <w:tblPr>
+        <w:tblStyle w:val="Table"/>
+        <w:tblW w:type="pct" w:w="5000"/>
+        <w:tblLook w:firstRow="1" w:lastRow="0" w:firstColumn="0" w:lastColumn="0" w:noHBand="0" w:noVBand="0" w:val="0020"/>
+        <w:jc w:val="start"/>
+      </w:tblPr>
+      <w:tblGrid>
+        <w:gridCol w:w="1980"/>
+        <w:gridCol w:w="1980"/>
+        <w:gridCol w:w="1980"/>
+        <w:gridCol w:w="1980"/>
+      </w:tblGrid>
+      <w:tr>
+        <w:trPr>
+          <w:tblHeader w:val="true"/>
+        </w:trPr>
+        <w:tc>
+          <w:tcPr/>
+          <w:p>
+            <w:pPr>
+              <w:pStyle w:val="Compact"/>
+              <w:jc w:val="left"/>
+            </w:pPr>
+            <w:r>
+              <w:t xml:space="preserve">Capacidad</w:t>
+            </w:r>
+          </w:p>
+        </w:tc>
+        <w:tc>
+          <w:tcPr/>
+          <w:p>
+            <w:pPr>
+              <w:pStyle w:val="Compact"/>
+              <w:jc w:val="left"/>
+            </w:pPr>
+            <w:r>
+              <w:t xml:space="preserve">Qué se construye</w:t>
+            </w:r>
+          </w:p>
+        </w:tc>
+        <w:tc>
+          <w:tcPr/>
+          <w:p>
+            <w:pPr>
+              <w:pStyle w:val="Compact"/>
+              <w:jc w:val="left"/>
+            </w:pPr>
+            <w:r>
+              <w:t xml:space="preserve">Responsable</w:t>
+            </w:r>
+          </w:p>
+        </w:tc>
+        <w:tc>
+          <w:tcPr/>
+          <w:p>
+            <w:pPr>
+              <w:pStyle w:val="Compact"/>
+              <w:jc w:val="left"/>
+            </w:pPr>
+            <w:r>
+              <w:t xml:space="preserve">Plazo</w:t>
+            </w:r>
+          </w:p>
+        </w:tc>
+      </w:tr>
+      <w:tr>
+        <w:tc>
+          <w:tcPr/>
+          <w:p>
+            <w:pPr>
+              <w:pStyle w:val="Compact"/>
+              <w:jc w:val="left"/>
+            </w:pPr>
+            <w:r>
+              <w:t xml:space="preserve">Inteligencia territorial fina</w:t>
+            </w:r>
+          </w:p>
+        </w:tc>
+        <w:tc>
+          <w:tcPr/>
+          <w:p>
+            <w:pPr>
+              <w:pStyle w:val="Compact"/>
+              <w:jc w:val="left"/>
+            </w:pPr>
+            <w:r>
+              <w:t xml:space="preserve">Reconstruir redes locales de inteligencia humana; incentivos competitivos a la desmovilización individual como fuente</w:t>
+            </w:r>
+          </w:p>
+        </w:tc>
+        <w:tc>
+          <w:tcPr/>
+          <w:p>
+            <w:pPr>
+              <w:pStyle w:val="Compact"/>
+              <w:jc w:val="left"/>
+            </w:pPr>
+            <w:r>
+              <w:t xml:space="preserve">Comando FF.MM. + DNP</w:t>
+            </w:r>
+          </w:p>
+        </w:tc>
+        <w:tc>
+          <w:tcPr/>
+          <w:p>
+            <w:pPr>
+              <w:pStyle w:val="Compact"/>
+              <w:jc w:val="left"/>
+            </w:pPr>
+            <w:r>
+              <w:t xml:space="preserve">Año 1</w:t>
+            </w:r>
+          </w:p>
+        </w:tc>
+      </w:tr>
+      <w:tr>
+        <w:tc>
+          <w:tcPr/>
+          <w:p>
+            <w:pPr>
+              <w:pStyle w:val="Compact"/>
+              <w:jc w:val="left"/>
+            </w:pPr>
+            <w:r>
+              <w:t xml:space="preserve">Inteligencia financiera</w:t>
+            </w:r>
+          </w:p>
+        </w:tc>
+        <w:tc>
+          <w:tcPr/>
+          <w:p>
+            <w:pPr>
+              <w:pStyle w:val="Compact"/>
+              <w:jc w:val="left"/>
+            </w:pPr>
+            <w:r>
+              <w:t xml:space="preserve">Fortalecer la UIAF con análisis de redes; cruce con la plataforma de trazabilidad</w:t>
+            </w:r>
+          </w:p>
+        </w:tc>
+        <w:tc>
+          <w:tcPr/>
+          <w:p>
+            <w:pPr>
+              <w:pStyle w:val="Compact"/>
+              <w:jc w:val="left"/>
+            </w:pPr>
+            <w:r>
+              <w:t xml:space="preserve">UIAF + Fiscalía + MinHacienda</w:t>
+            </w:r>
+          </w:p>
+        </w:tc>
+        <w:tc>
+          <w:tcPr/>
+          <w:p>
+            <w:pPr>
+              <w:pStyle w:val="Compact"/>
+              <w:jc w:val="left"/>
+            </w:pPr>
+            <w:r>
+              <w:t xml:space="preserve">Años 1-2</w:t>
+            </w:r>
+          </w:p>
+        </w:tc>
+      </w:tr>
+      <w:tr>
+        <w:tc>
+          <w:tcPr/>
+          <w:p>
+            <w:pPr>
+              <w:pStyle w:val="Compact"/>
+              <w:jc w:val="left"/>
+            </w:pPr>
+            <w:r>
+              <w:t xml:space="preserve">Inteligencia ambiental</w:t>
+            </w:r>
+          </w:p>
+        </w:tc>
+        <w:tc>
+          <w:tcPr/>
+          <w:p>
+            <w:pPr>
+              <w:pStyle w:val="Compact"/>
+              <w:jc w:val="left"/>
+            </w:pPr>
+            <w:r>
+              <w:t xml:space="preserve">Detección en tiempo real de deforestación, minería ilegal y contaminación hídrica en nodos y cuencas</w:t>
+            </w:r>
+          </w:p>
+        </w:tc>
+        <w:tc>
+          <w:tcPr/>
+          <w:p>
+            <w:pPr>
+              <w:pStyle w:val="Compact"/>
+              <w:jc w:val="left"/>
+            </w:pPr>
+            <w:r>
+              <w:t xml:space="preserve">DNI + Min. Ambiente + IDEAM</w:t>
+            </w:r>
+          </w:p>
+        </w:tc>
+        <w:tc>
+          <w:tcPr/>
+          <w:p>
+            <w:pPr>
+              <w:pStyle w:val="Compact"/>
+              <w:jc w:val="left"/>
+            </w:pPr>
+            <w:r>
+              <w:t xml:space="preserve">Año 1</w:t>
+            </w:r>
+          </w:p>
+        </w:tc>
+      </w:tr>
+      <w:tr>
+        <w:tc>
+          <w:tcPr/>
+          <w:p>
+            <w:pPr>
+              <w:pStyle w:val="Compact"/>
+              <w:jc w:val="left"/>
+            </w:pPr>
+            <w:r>
+              <w:t xml:space="preserve">Capacidad antidron</w:t>
+            </w:r>
+          </w:p>
+        </w:tc>
+        <w:tc>
+          <w:tcPr/>
+          <w:p>
+            <w:pPr>
+              <w:pStyle w:val="Compact"/>
+              <w:jc w:val="left"/>
+            </w:pPr>
+            <w:r>
+              <w:t xml:space="preserve">Detección y neutralización en nodos y nodos de infraestructura crítica; desarrollo nacional vía CIAC</w:t>
+            </w:r>
+          </w:p>
+        </w:tc>
+        <w:tc>
+          <w:tcPr/>
+          <w:p>
+            <w:pPr>
+              <w:pStyle w:val="Compact"/>
+              <w:jc w:val="left"/>
+            </w:pPr>
+            <w:r>
+              <w:t xml:space="preserve">Min. Defensa + CIAC</w:t>
+            </w:r>
+          </w:p>
+        </w:tc>
+        <w:tc>
+          <w:tcPr/>
+          <w:p>
+            <w:pPr>
+              <w:pStyle w:val="Compact"/>
+              <w:jc w:val="left"/>
+            </w:pPr>
+            <w:r>
+              <w:t xml:space="preserve">Año 1</w:t>
+            </w:r>
+          </w:p>
+        </w:tc>
+      </w:tr>
+      <w:tr>
+        <w:tc>
+          <w:tcPr/>
+          <w:p>
+            <w:pPr>
+              <w:pStyle w:val="Compact"/>
+              <w:jc w:val="left"/>
+            </w:pPr>
+            <w:r>
+              <w:t xml:space="preserve">Ciberinteligencia</w:t>
+            </w:r>
+          </w:p>
+        </w:tc>
+        <w:tc>
+          <w:tcPr/>
+          <w:p>
+            <w:pPr>
+              <w:pStyle w:val="Compact"/>
+              <w:jc w:val="left"/>
+            </w:pPr>
+            <w:r>
+              <w:t xml:space="preserve">Monitoreo de redes usadas para reclutamiento, con garantías constitucionales</w:t>
+            </w:r>
+          </w:p>
+        </w:tc>
+        <w:tc>
+          <w:tcPr/>
+          <w:p>
+            <w:pPr>
+              <w:pStyle w:val="Compact"/>
+              <w:jc w:val="left"/>
+            </w:pPr>
+            <w:r>
+              <w:t xml:space="preserve">DNI + Fiscalía</w:t>
+            </w:r>
+          </w:p>
+        </w:tc>
+        <w:tc>
+          <w:tcPr/>
+          <w:p>
+            <w:pPr>
+              <w:pStyle w:val="Compact"/>
+              <w:jc w:val="left"/>
+            </w:pPr>
+            <w:r>
+              <w:t xml:space="preserve">Años 1-2</w:t>
+            </w:r>
+          </w:p>
+        </w:tc>
+      </w:tr>
+      <w:tr>
+        <w:tc>
+          <w:tcPr/>
+          <w:p>
+            <w:pPr>
+              <w:pStyle w:val="Compact"/>
+              <w:jc w:val="left"/>
+            </w:pPr>
+            <w:r>
+              <w:t xml:space="preserve">Justicia con capacidad</w:t>
+            </w:r>
+          </w:p>
+        </w:tc>
+        <w:tc>
+          <w:tcPr/>
+          <w:p>
+            <w:pPr>
+              <w:pStyle w:val="Compact"/>
+              <w:jc w:val="left"/>
+            </w:pPr>
+            <w:r>
+              <w:t xml:space="preserve">Ampliar Fiscalía y jueces especializados para procesar capturas; sin esto la acción militar no disuade</w:t>
+            </w:r>
+          </w:p>
+        </w:tc>
+        <w:tc>
+          <w:tcPr/>
+          <w:p>
+            <w:pPr>
+              <w:pStyle w:val="Compact"/>
+              <w:jc w:val="left"/>
+            </w:pPr>
+            <w:r>
+              <w:t xml:space="preserve">Fiscalía + Consejo Superior</w:t>
+            </w:r>
+          </w:p>
+        </w:tc>
+        <w:tc>
+          <w:tcPr/>
+          <w:p>
+            <w:pPr>
+              <w:pStyle w:val="Compact"/>
+              <w:jc w:val="left"/>
+            </w:pPr>
+            <w:r>
+              <w:t xml:space="preserve">Años 1-3</w:t>
+            </w:r>
+          </w:p>
+        </w:tc>
+      </w:tr>
+    </w:tbl>
+    <w:bookmarkEnd w:id="54"/>
+    <w:bookmarkStart w:id="55" w:name="Xf7ad9bf6432f6e674456902cd7465f3a754fe6c"/>
+    <w:p>
+      <w:pPr>
+        <w:pStyle w:val="Heading2"/>
+      </w:pPr>
+      <w:r>
+        <w:t xml:space="preserve">3.4 Jóvenes en Paz: cortar el reclutamiento desde la raíz</w:t>
+      </w:r>
+    </w:p>
+    <w:p>
+      <w:pPr>
+        <w:pStyle w:val="FirstParagraph"/>
+      </w:pPr>
+      <w:r>
+        <w:t xml:space="preserve">El reclutamiento no se detiene con operaciones, con empleo y futuro. El programa Jóvenes en Paz tiene resultados verificados: Quibdó 1.857 beneficiarios → homicidios −25.9%; Tumaco 1.127 jóvenes → −34%.</w:t>
+      </w:r>
+    </w:p>
+    <w:tbl>
+      <w:tblPr>
+        <w:tblStyle w:val="Table"/>
+        <w:tblW w:type="pct" w:w="5000"/>
+        <w:tblLook w:firstRow="1" w:lastRow="0" w:firstColumn="0" w:lastColumn="0" w:noHBand="0" w:noVBand="0" w:val="0020"/>
+        <w:jc w:val="start"/>
+      </w:tblPr>
+      <w:tblGrid>
+        <w:gridCol w:w="1980"/>
+        <w:gridCol w:w="1980"/>
+        <w:gridCol w:w="1980"/>
+        <w:gridCol w:w="1980"/>
+      </w:tblGrid>
+      <w:tr>
+        <w:trPr>
+          <w:tblHeader w:val="true"/>
+        </w:trPr>
+        <w:tc>
+          <w:tcPr/>
+          <w:p>
+            <w:pPr>
+              <w:pStyle w:val="Compact"/>
+              <w:jc w:val="left"/>
+            </w:pPr>
+            <w:r>
+              <w:t xml:space="preserve">Componente</w:t>
+            </w:r>
+          </w:p>
+        </w:tc>
+        <w:tc>
+          <w:tcPr/>
+          <w:p>
+            <w:pPr>
+              <w:pStyle w:val="Compact"/>
+              <w:jc w:val="left"/>
+            </w:pPr>
+            <w:r>
+              <w:t xml:space="preserve">Concreción</w:t>
+            </w:r>
+          </w:p>
+        </w:tc>
+        <w:tc>
+          <w:tcPr/>
+          <w:p>
+            <w:pPr>
+              <w:pStyle w:val="Compact"/>
+              <w:jc w:val="left"/>
+            </w:pPr>
+            <w:r>
+              <w:t xml:space="preserve">Responsable</w:t>
+            </w:r>
+          </w:p>
+        </w:tc>
+        <w:tc>
+          <w:tcPr/>
+          <w:p>
+            <w:pPr>
+              <w:pStyle w:val="Compact"/>
+              <w:jc w:val="left"/>
+            </w:pPr>
+            <w:r>
+              <w:t xml:space="preserve">Plazo</w:t>
+            </w:r>
+          </w:p>
+        </w:tc>
+      </w:tr>
+      <w:tr>
+        <w:tc>
+          <w:tcPr/>
+          <w:p>
+            <w:pPr>
+              <w:pStyle w:val="Compact"/>
+              <w:jc w:val="left"/>
+            </w:pPr>
+            <w:r>
+              <w:t xml:space="preserve">Escala en nodos</w:t>
+            </w:r>
+          </w:p>
+        </w:tc>
+        <w:tc>
+          <w:tcPr/>
+          <w:p>
+            <w:pPr>
+              <w:pStyle w:val="Compact"/>
+              <w:jc w:val="left"/>
+            </w:pPr>
+            <w:r>
+              <w:t xml:space="preserve">Obligatorio en Fase 0 de cada nodo, simultáneo al despliegue de fuerza. Mín. 1.000 jóvenes/nodo antes del fin de Fase 1</w:t>
+            </w:r>
+          </w:p>
+        </w:tc>
+        <w:tc>
+          <w:tcPr/>
+          <w:p>
+            <w:pPr>
+              <w:pStyle w:val="Compact"/>
+              <w:jc w:val="left"/>
+            </w:pPr>
+            <w:r>
+              <w:t xml:space="preserve">DNP + SENA + Min. Trabajo</w:t>
+            </w:r>
+          </w:p>
+        </w:tc>
+        <w:tc>
+          <w:tcPr/>
+          <w:p>
+            <w:pPr>
+              <w:pStyle w:val="Compact"/>
+              <w:jc w:val="left"/>
+            </w:pPr>
+            <w:r>
+              <w:t xml:space="preserve">Fase 0</w:t>
+            </w:r>
+          </w:p>
+        </w:tc>
+      </w:tr>
+      <w:tr>
+        <w:tc>
+          <w:tcPr/>
+          <w:p>
+            <w:pPr>
+              <w:pStyle w:val="Compact"/>
+              <w:jc w:val="left"/>
+            </w:pPr>
+            <w:r>
+              <w:t xml:space="preserve">Incentivo tributario</w:t>
+            </w:r>
+          </w:p>
+        </w:tc>
+        <w:tc>
+          <w:tcPr/>
+          <w:p>
+            <w:pPr>
+              <w:pStyle w:val="Compact"/>
+              <w:jc w:val="left"/>
+            </w:pPr>
+            <w:r>
+              <w:t xml:space="preserve">Deducción del 150% para empresas que contraten jóvenes certificados en municipios de nodos</w:t>
+            </w:r>
+          </w:p>
+        </w:tc>
+        <w:tc>
+          <w:tcPr/>
+          <w:p>
+            <w:pPr>
+              <w:pStyle w:val="Compact"/>
+              <w:jc w:val="left"/>
+            </w:pPr>
+            <w:r>
+              <w:t xml:space="preserve">DIAN + Min. Trabajo</w:t>
+            </w:r>
+          </w:p>
+        </w:tc>
+        <w:tc>
+          <w:tcPr/>
+          <w:p>
+            <w:pPr>
+              <w:pStyle w:val="Compact"/>
+              <w:jc w:val="left"/>
+            </w:pPr>
+            <w:r>
+              <w:t xml:space="preserve">Año 1</w:t>
+            </w:r>
+          </w:p>
+        </w:tc>
+      </w:tr>
+      <w:tr>
+        <w:tc>
+          <w:tcPr/>
+          <w:p>
+            <w:pPr>
+              <w:pStyle w:val="Compact"/>
+              <w:jc w:val="left"/>
+            </w:pPr>
+            <w:r>
+              <w:t xml:space="preserve">Articulación SENA dual</w:t>
+            </w:r>
+          </w:p>
+        </w:tc>
+        <w:tc>
+          <w:tcPr/>
+          <w:p>
+            <w:pPr>
+              <w:pStyle w:val="Compact"/>
+              <w:jc w:val="left"/>
+            </w:pPr>
+            <w:r>
+              <w:t xml:space="preserve">Certificado de competencias como llave de salida del ciclo de reclutamiento; módulos de empleabilidad</w:t>
+            </w:r>
+          </w:p>
+        </w:tc>
+        <w:tc>
+          <w:tcPr/>
+          <w:p>
+            <w:pPr>
+              <w:pStyle w:val="Compact"/>
+              <w:jc w:val="left"/>
+            </w:pPr>
+            <w:r>
+              <w:t xml:space="preserve">SENA + Min. Trabajo</w:t>
+            </w:r>
+          </w:p>
+        </w:tc>
+        <w:tc>
+          <w:tcPr/>
+          <w:p>
+            <w:pPr>
+              <w:pStyle w:val="Compact"/>
+              <w:jc w:val="left"/>
+            </w:pPr>
+            <w:r>
+              <w:t xml:space="preserve">Fase 1</w:t>
+            </w:r>
+          </w:p>
+        </w:tc>
+      </w:tr>
+    </w:tbl>
+    <w:bookmarkEnd w:id="55"/>
+    <w:bookmarkStart w:id="56" w:name="X6ba3ae1e4becc3dcb03e8bc5a1df200742b0da1"/>
+    <w:p>
+      <w:pPr>
+        <w:pStyle w:val="Heading2"/>
+      </w:pPr>
+      <w:r>
+        <w:t xml:space="preserve">3.5 Puente de ingreso para sustitución de coca: el eslabón que rompe el ciclo</w:t>
+      </w:r>
+    </w:p>
+    <w:p>
+      <w:pPr>
+        <w:pStyle w:val="FirstParagraph"/>
+      </w:pPr>
+      <w:r>
+        <w:t xml:space="preserve">Entre arrancar la coca y que el cultivo alternativo produzca ingreso pasan 8-24 meses. Sin ingreso en ese vacío, la familia regresa a la coca por necesidad. Cerrarlo es la condición de posibilidad de la sustitución voluntaria.</w:t>
+      </w:r>
+    </w:p>
+    <w:tbl>
+      <w:tblPr>
+        <w:tblStyle w:val="Table"/>
+        <w:tblW w:type="pct" w:w="5000"/>
+        <w:tblLook w:firstRow="1" w:lastRow="0" w:firstColumn="0" w:lastColumn="0" w:noHBand="0" w:noVBand="0" w:val="0020"/>
+        <w:jc w:val="start"/>
+      </w:tblPr>
+      <w:tblGrid>
+        <w:gridCol w:w="1980"/>
+        <w:gridCol w:w="1980"/>
+        <w:gridCol w:w="1980"/>
+        <w:gridCol w:w="1980"/>
+      </w:tblGrid>
+      <w:tr>
+        <w:trPr>
+          <w:tblHeader w:val="true"/>
+        </w:trPr>
+        <w:tc>
+          <w:tcPr/>
+          <w:p>
+            <w:pPr>
+              <w:pStyle w:val="Compact"/>
+              <w:jc w:val="left"/>
+            </w:pPr>
+            <w:r>
+              <w:t xml:space="preserve">Componente</w:t>
+            </w:r>
+          </w:p>
+        </w:tc>
+        <w:tc>
+          <w:tcPr/>
+          <w:p>
+            <w:pPr>
+              <w:pStyle w:val="Compact"/>
+              <w:jc w:val="left"/>
+            </w:pPr>
+            <w:r>
+              <w:t xml:space="preserve">Concreción</w:t>
+            </w:r>
+          </w:p>
+        </w:tc>
+        <w:tc>
+          <w:tcPr/>
+          <w:p>
+            <w:pPr>
+              <w:pStyle w:val="Compact"/>
+              <w:jc w:val="left"/>
+            </w:pPr>
+            <w:r>
+              <w:t xml:space="preserve">Lógica</w:t>
+            </w:r>
+          </w:p>
+        </w:tc>
+        <w:tc>
+          <w:tcPr/>
+          <w:p>
+            <w:pPr>
+              <w:pStyle w:val="Compact"/>
+              <w:jc w:val="left"/>
+            </w:pPr>
+            <w:r>
+              <w:t xml:space="preserve">Responsable</w:t>
+            </w:r>
+          </w:p>
+        </w:tc>
+      </w:tr>
+      <w:tr>
+        <w:tc>
+          <w:tcPr/>
+          <w:p>
+            <w:pPr>
+              <w:pStyle w:val="Compact"/>
+              <w:jc w:val="left"/>
+            </w:pPr>
+            <w:r>
+              <w:t xml:space="preserve">Empleo temporal en obras del nodo</w:t>
+            </w:r>
+          </w:p>
+        </w:tc>
+        <w:tc>
+          <w:tcPr/>
+          <w:p>
+            <w:pPr>
+              <w:pStyle w:val="Compact"/>
+              <w:jc w:val="left"/>
+            </w:pPr>
+            <w:r>
+              <w:t xml:space="preserve">Prioridad a familias que arrancan coca: escuelas, salud, vías terciarias, acueductos, reforestación. $1.5-2M/mes, 6 meses. Meta 500-1.000 empleos/nodo</w:t>
+            </w:r>
+          </w:p>
+        </w:tc>
+        <w:tc>
+          <w:tcPr/>
+          <w:p>
+            <w:pPr>
+              <w:pStyle w:val="Compact"/>
+              <w:jc w:val="left"/>
+            </w:pPr>
+            <w:r>
+              <w:t xml:space="preserve">El campesino no pierde ingreso al salir de la coca; el período de espera construye los bienes públicos del nodo</w:t>
+            </w:r>
+          </w:p>
+        </w:tc>
+        <w:tc>
+          <w:tcPr/>
+          <w:p>
+            <w:pPr>
+              <w:pStyle w:val="Compact"/>
+              <w:jc w:val="left"/>
+            </w:pPr>
+            <w:r>
+              <w:t xml:space="preserve">Min. Trabajo + INVIAS + Min. Vivienda</w:t>
+            </w:r>
+          </w:p>
+        </w:tc>
+      </w:tr>
+      <w:tr>
+        <w:tc>
+          <w:tcPr/>
+          <w:p>
+            <w:pPr>
+              <w:pStyle w:val="Compact"/>
+              <w:jc w:val="left"/>
+            </w:pPr>
+            <w:r>
+              <w:t xml:space="preserve">Pago por arranque voluntario</w:t>
+            </w:r>
+          </w:p>
+        </w:tc>
+        <w:tc>
+          <w:tcPr/>
+          <w:p>
+            <w:pPr>
+              <w:pStyle w:val="Compact"/>
+              <w:jc w:val="left"/>
+            </w:pPr>
+            <w:r>
+              <w:t xml:space="preserve">$5.000-8.000/ha: 50% al arrancar, 50% a los 6 meses con cultivo alternativo. Verificación por drones, no por papel</w:t>
+            </w:r>
+          </w:p>
+        </w:tc>
+        <w:tc>
+          <w:tcPr/>
+          <w:p>
+            <w:pPr>
+              <w:pStyle w:val="Compact"/>
+              <w:jc w:val="left"/>
+            </w:pPr>
+            <w:r>
+              <w:t xml:space="preserve">Señal económica inmediata que cambia el cálculo</w:t>
+            </w:r>
+          </w:p>
+        </w:tc>
+        <w:tc>
+          <w:tcPr/>
+          <w:p>
+            <w:pPr>
+              <w:pStyle w:val="Compact"/>
+              <w:jc w:val="left"/>
+            </w:pPr>
+            <w:r>
+              <w:t xml:space="preserve">UNODC + Min. Agricultura</w:t>
+            </w:r>
+          </w:p>
+        </w:tc>
+      </w:tr>
+      <w:tr>
+        <w:tc>
+          <w:tcPr/>
+          <w:p>
+            <w:pPr>
+              <w:pStyle w:val="Compact"/>
+              <w:jc w:val="left"/>
+            </w:pPr>
+            <w:r>
+              <w:t xml:space="preserve">Compra garantizada (2 años)</w:t>
+            </w:r>
+          </w:p>
+        </w:tc>
+        <w:tc>
+          <w:tcPr/>
+          <w:p>
+            <w:pPr>
+              <w:pStyle w:val="Compact"/>
+              <w:jc w:val="left"/>
+            </w:pPr>
+            <w:r>
+              <w:t xml:space="preserve">El Estado compra 100% de la producción alternativa a ≥80% del precio internacional (Idema reformado)</w:t>
+            </w:r>
+          </w:p>
+        </w:tc>
+        <w:tc>
+          <w:tcPr/>
+          <w:p>
+            <w:pPr>
+              <w:pStyle w:val="Compact"/>
+              <w:jc w:val="left"/>
+            </w:pPr>
+            <w:r>
+              <w:t xml:space="preserve">Elimina la incertidumbre de mercado, segundo factor de regreso a la coca</w:t>
+            </w:r>
+          </w:p>
+        </w:tc>
+        <w:tc>
+          <w:tcPr/>
+          <w:p>
+            <w:pPr>
+              <w:pStyle w:val="Compact"/>
+              <w:jc w:val="left"/>
+            </w:pPr>
+            <w:r>
+              <w:t xml:space="preserve">Min. Agricultura + IDEMA reformado</w:t>
+            </w:r>
+          </w:p>
+        </w:tc>
+      </w:tr>
+      <w:tr>
+        <w:tc>
+          <w:tcPr/>
+          <w:p>
+            <w:pPr>
+              <w:pStyle w:val="Compact"/>
+              <w:jc w:val="left"/>
+            </w:pPr>
+            <w:r>
+              <w:t xml:space="preserve">Articulación con reforma agraria</w:t>
+            </w:r>
+          </w:p>
+        </w:tc>
+        <w:tc>
+          <w:tcPr/>
+          <w:p>
+            <w:pPr>
+              <w:pStyle w:val="Compact"/>
+              <w:jc w:val="left"/>
+            </w:pPr>
+            <w:r>
+              <w:t xml:space="preserve">El arranque activa la titulación y el paquete habilitador. El título es el activo que vuelve permanente la decisión</w:t>
+            </w:r>
+          </w:p>
+        </w:tc>
+        <w:tc>
+          <w:tcPr/>
+          <w:p>
+            <w:pPr>
+              <w:pStyle w:val="Compact"/>
+              <w:jc w:val="left"/>
+            </w:pPr>
+            <w:r>
+              <w:t xml:space="preserve">La tierra propia es el mayor desincentivo al regreso</w:t>
+            </w:r>
+          </w:p>
+        </w:tc>
+        <w:tc>
+          <w:tcPr/>
+          <w:p>
+            <w:pPr>
+              <w:pStyle w:val="Compact"/>
+              <w:jc w:val="left"/>
+            </w:pPr>
+            <w:r>
+              <w:t xml:space="preserve">ANT + Min. Agricultura</w:t>
+            </w:r>
+          </w:p>
+        </w:tc>
+      </w:tr>
+    </w:tbl>
+    <w:bookmarkEnd w:id="56"/>
+    <w:bookmarkStart w:id="57" w:name="Xdd8fc299dd5c76316850f0d87d9bbb02f82974a"/>
+    <w:p>
+      <w:pPr>
+        <w:pStyle w:val="Heading2"/>
+      </w:pPr>
+      <w:r>
+        <w:t xml:space="preserve">3.6 Soberanía y diversificación de proveedores de defensa</w:t>
+      </w:r>
+    </w:p>
+    <w:p>
+      <w:pPr>
+        <w:pStyle w:val="FirstParagraph"/>
+      </w:pPr>
+      <w:r>
+        <w:t xml:space="preserve">Regla: ningún proveedor &gt;40% del portafolio. Diversificar hacia Corea del Sur, Francia, Alemania, Turquía, Brasil y Colombia misma. Toda compra importada incluye cláusula obligatoria de transferencia tecnológica a COTECMAR/CIAC/Indumil, producción nacional progresiva (offset mínimo 20% en el primer contrato, escalando) y formación de ingenieros colombianos.</w:t>
+      </w:r>
+    </w:p>
+    <w:p>
+      <w:pPr>
         <w:pStyle w:val="BlockText"/>
       </w:pPr>
       <w:r>
         <w:t xml:space="preserve">La verdadera soberanía es llenar el territorio de Estado, lo que además le quita a actores externos el pretexto barato para intervenir.</w:t>
       </w:r>
     </w:p>
-    <w:bookmarkEnd w:id="50"/>
-    <w:bookmarkEnd w:id="51"/>
-    <w:bookmarkStart w:id="52" w:name="frente-iv-anticorrupción"/>
+    <w:bookmarkEnd w:id="57"/>
+    <w:bookmarkEnd w:id="58"/>
+    <w:bookmarkStart w:id="59" w:name="frente-iv-anticorrupción"/>
     <w:p>
       <w:pPr>
         <w:pStyle w:val="Heading1"/>
@@ -8607,8 +9830,8 @@
         </w:tc>
       </w:tr>
     </w:tbl>
-    <w:bookmarkEnd w:id="52"/>
-    <w:bookmarkStart w:id="53" w:name="frente-v-sostenibilidad-fiscal"/>
+    <w:bookmarkEnd w:id="59"/>
+    <w:bookmarkStart w:id="60" w:name="frente-v-sostenibilidad-fiscal"/>
     <w:p>
       <w:pPr>
         <w:pStyle w:val="Heading1"/>
@@ -9176,8 +10399,8 @@
         <w:t xml:space="preserve">El núcleo del programa cabe en el escenario base; la reforma tributaria acelera, no habilita.</w:t>
       </w:r>
     </w:p>
-    <w:bookmarkEnd w:id="53"/>
-    <w:bookmarkStart w:id="54" w:name="frente-vi-salud"/>
+    <w:bookmarkEnd w:id="60"/>
+    <w:bookmarkStart w:id="61" w:name="frente-vi-salud"/>
     <w:p>
       <w:pPr>
         <w:pStyle w:val="Heading1"/>
@@ -9521,8 +10744,8 @@
         </w:tc>
       </w:tr>
     </w:tbl>
-    <w:bookmarkEnd w:id="54"/>
-    <w:bookmarkStart w:id="55" w:name="frente-vii-educación"/>
+    <w:bookmarkEnd w:id="61"/>
+    <w:bookmarkStart w:id="62" w:name="frente-vii-educación"/>
     <w:p>
       <w:pPr>
         <w:pStyle w:val="Heading1"/>
@@ -9866,8 +11089,8 @@
         </w:tc>
       </w:tr>
     </w:tbl>
-    <w:bookmarkEnd w:id="55"/>
-    <w:bookmarkStart w:id="62" w:name="X09fe9273843d1b882bb63686b495cc2ac9ab41a"/>
+    <w:bookmarkEnd w:id="62"/>
+    <w:bookmarkStart w:id="69" w:name="X09fe9273843d1b882bb63686b495cc2ac9ab41a"/>
     <w:p>
       <w:pPr>
         <w:pStyle w:val="Heading1"/>
@@ -9884,7 +11107,7 @@
         <w:t xml:space="preserve">Este frente es la condición de posibilidad de todos los demás. Sin capacidad ejecutoria el Frente I no crea empleos, el II no titula, el VI no gira a tiempo. Se activa primero, desde la transición.</w:t>
       </w:r>
     </w:p>
-    <w:bookmarkStart w:id="56" w:name="Xe6eb94b91175e11a3903a18ff99c3a01d56a154"/>
+    <w:bookmarkStart w:id="63" w:name="Xe6eb94b91175e11a3903a18ff99c3a01d56a154"/>
     <w:p>
       <w:pPr>
         <w:pStyle w:val="Heading2"/>
@@ -10222,8 +11445,8 @@
         </w:tc>
       </w:tr>
     </w:tbl>
-    <w:bookmarkEnd w:id="56"/>
-    <w:bookmarkStart w:id="57" w:name="Xffafa52adae810e624d7bfe2f97d5251450d331"/>
+    <w:bookmarkEnd w:id="63"/>
+    <w:bookmarkStart w:id="64" w:name="Xffafa52adae810e624d7bfe2f97d5251450d331"/>
     <w:p>
       <w:pPr>
         <w:pStyle w:val="Heading2"/>
@@ -10599,8 +11822,8 @@
         </w:tc>
       </w:tr>
     </w:tbl>
-    <w:bookmarkEnd w:id="57"/>
-    <w:bookmarkStart w:id="58" w:name="X124704e51a351247cd699b4f9032ed71edc02d9"/>
+    <w:bookmarkEnd w:id="64"/>
+    <w:bookmarkStart w:id="65" w:name="X124704e51a351247cd699b4f9032ed71edc02d9"/>
     <w:p>
       <w:pPr>
         <w:pStyle w:val="Heading2"/>
@@ -11241,8 +12464,8 @@
         </w:tc>
       </w:tr>
     </w:tbl>
-    <w:bookmarkEnd w:id="58"/>
-    <w:bookmarkStart w:id="59" w:name="X2d970ec646a4bebe670c5382d37253608bc4046"/>
+    <w:bookmarkEnd w:id="65"/>
+    <w:bookmarkStart w:id="66" w:name="X2d970ec646a4bebe670c5382d37253608bc4046"/>
     <w:p>
       <w:pPr>
         <w:pStyle w:val="Heading2"/>
@@ -11698,8 +12921,8 @@
         </w:tc>
       </w:tr>
     </w:tbl>
-    <w:bookmarkEnd w:id="59"/>
-    <w:bookmarkStart w:id="60" w:name="X6bb7ba996a160b3fd1fbf3ea701eb17c0cb4d57"/>
+    <w:bookmarkEnd w:id="66"/>
+    <w:bookmarkStart w:id="67" w:name="X6bb7ba996a160b3fd1fbf3ea701eb17c0cb4d57"/>
     <w:p>
       <w:pPr>
         <w:pStyle w:val="Heading2"/>
@@ -11716,8 +12939,8 @@
         <w:t xml:space="preserve">Mecanismo formal de aprendizaje: canal de discrepancia técnica con respuesta en 15 días; separación entre medios y fines (el director ejecuta mientras la discrepancia se procesa); revisiones en momentos definidos (fin de fase, año, evidencia de fracaso); registro público de cambios de política con justificación.</w:t>
       </w:r>
     </w:p>
-    <w:bookmarkEnd w:id="60"/>
-    <w:bookmarkStart w:id="61" w:name="Xa33881156a37651bd585277402ac08d6b867f37"/>
+    <w:bookmarkEnd w:id="67"/>
+    <w:bookmarkStart w:id="68" w:name="Xa33881156a37651bd585277402ac08d6b867f37"/>
     <w:p>
       <w:pPr>
         <w:pStyle w:val="Heading2"/>
@@ -11976,9 +13199,9 @@
         <w:t xml:space="preserve">El listón crítico baja: no se necesita encontrar 60 personas perfectas, sino un núcleo sénior pequeño. La masa de trabajo técnico la cubren convenios universitarios y el Servicio, bajo supervisión, y la retención del talento clave se ata a la vía rápida hacia la Alta Dirección Pública (misma lógica de la Credencial de Ciudadanía Activa).</w:t>
       </w:r>
     </w:p>
-    <w:bookmarkEnd w:id="61"/>
-    <w:bookmarkEnd w:id="62"/>
-    <w:bookmarkStart w:id="65" w:name="frente-ix-infraestructura-estratégica"/>
+    <w:bookmarkEnd w:id="68"/>
+    <w:bookmarkEnd w:id="69"/>
+    <w:bookmarkStart w:id="72" w:name="frente-ix-infraestructura-estratégica"/>
     <w:p>
       <w:pPr>
         <w:pStyle w:val="Heading1"/>
@@ -12005,7 +13228,7 @@
         <w:t xml:space="preserve">Colombia no tiene déficit de proyectos anunciados, tiene déficit de proyectos terminados y activados. El mayor retorno está en activar lo que el país ya pagó, no en anunciar obras nuevas.</w:t>
       </w:r>
     </w:p>
-    <w:bookmarkStart w:id="63" w:name="prioridades-por-impactocosto"/>
+    <w:bookmarkStart w:id="70" w:name="prioridades-por-impactocosto"/>
     <w:p>
       <w:pPr>
         <w:pStyle w:val="Heading2"/>
@@ -12404,8 +13627,8 @@
         </w:tc>
       </w:tr>
     </w:tbl>
-    <w:bookmarkEnd w:id="63"/>
-    <w:bookmarkStart w:id="64" w:name="puertos-qué-hacer-y-qué-no"/>
+    <w:bookmarkEnd w:id="70"/>
+    <w:bookmarkStart w:id="71" w:name="puertos-qué-hacer-y-qué-no"/>
     <w:p>
       <w:pPr>
         <w:pStyle w:val="Heading2"/>
@@ -12620,9 +13843,9 @@
         </w:tc>
       </w:tr>
     </w:tbl>
-    <w:bookmarkEnd w:id="64"/>
-    <w:bookmarkEnd w:id="65"/>
-    <w:bookmarkStart w:id="70" w:name="X2f6c928d123bc981ffad937b3bd8ba4677d8180"/>
+    <w:bookmarkEnd w:id="71"/>
+    <w:bookmarkEnd w:id="72"/>
+    <w:bookmarkStart w:id="77" w:name="X2f6c928d123bc981ffad937b3bd8ba4677d8180"/>
     <w:p>
       <w:pPr>
         <w:pStyle w:val="Heading1"/>
@@ -12639,7 +13862,7 @@
         <w:t xml:space="preserve">No es paralelo a los demás, es la capa de valor agregado que el programa ya construye. La tecnología avanzada es el siguiente eslabón de cadenas que los frentes anteriores activan.</w:t>
       </w:r>
     </w:p>
-    <w:bookmarkStart w:id="66" w:name="lo-que-colombia-ya-tiene-y-no-escala"/>
+    <w:bookmarkStart w:id="73" w:name="lo-que-colombia-ya-tiene-y-no-escala"/>
     <w:p>
       <w:pPr>
         <w:pStyle w:val="Heading2"/>
@@ -12892,8 +14115,8 @@
         </w:tc>
       </w:tr>
     </w:tbl>
-    <w:bookmarkEnd w:id="66"/>
-    <w:bookmarkStart w:id="67" w:name="X4696b3caf4f8fece9557445c4df25d58e8cf305"/>
+    <w:bookmarkEnd w:id="73"/>
+    <w:bookmarkStart w:id="74" w:name="X4696b3caf4f8fece9557445c4df25d58e8cf305"/>
     <w:p>
       <w:pPr>
         <w:pStyle w:val="Heading2"/>
@@ -13776,8 +14999,8 @@
         <w:t xml:space="preserve">La biodiversidad es información, pero transformarla requiere capacidad de innovación. Lo factible en un período: concentrar los recursos de Minciencias en dos o tres clústeres con masa crítica real (medicina regenerativa: U. Andes + IDCBIS + DreamBio + CellRep) y conectarlos al Estado como primer cliente.</w:t>
       </w:r>
     </w:p>
-    <w:bookmarkEnd w:id="67"/>
-    <w:bookmarkStart w:id="68" w:name="X3449a18d80e272281ea1b456dc0407c24bfaae2"/>
+    <w:bookmarkEnd w:id="74"/>
+    <w:bookmarkStart w:id="75" w:name="X3449a18d80e272281ea1b456dc0407c24bfaae2"/>
     <w:p>
       <w:pPr>
         <w:pStyle w:val="Heading2"/>
@@ -13916,8 +15139,8 @@
         <w:t xml:space="preserve">(o, en su defecto, a productividad medida por un evaluador independiente), no a producción ni a empleo, que son falsificables. El apoyo tiene cláusula de reversión y vencimiento: quien no alcanza el umbral de exportación pierde el beneficio. La compra pública doméstica es la rampa de entrada; la exportación es la prueba de que la apuesta funciona.</w:t>
       </w:r>
     </w:p>
-    <w:bookmarkEnd w:id="68"/>
-    <w:bookmarkStart w:id="69" w:name="Xc2c87e99ec3785ae71c01c47159b269548efa3c"/>
+    <w:bookmarkEnd w:id="75"/>
+    <w:bookmarkStart w:id="76" w:name="Xc2c87e99ec3785ae71c01c47159b269548efa3c"/>
     <w:p>
       <w:pPr>
         <w:pStyle w:val="Heading2"/>
@@ -14251,9 +15474,9 @@
         </w:tc>
       </w:tr>
     </w:tbl>
-    <w:bookmarkEnd w:id="69"/>
-    <w:bookmarkEnd w:id="70"/>
-    <w:bookmarkStart w:id="77" w:name="X80587d1274c45fdb557b85c24f679ba0042fef2"/>
+    <w:bookmarkEnd w:id="76"/>
+    <w:bookmarkEnd w:id="77"/>
+    <w:bookmarkStart w:id="84" w:name="X80587d1274c45fdb557b85c24f679ba0042fef2"/>
     <w:p>
       <w:pPr>
         <w:pStyle w:val="Heading1"/>
@@ -14288,7 +15511,7 @@
         <w:t xml:space="preserve">Colombia no tiene principalmente un problema de cobertura nominal, tiene un problema de cobertura real. El agua potable existe en el papel para el 88.9%, pero el 39% de las plantas no funciona y 12.5 millones no tienen alcantarillado. Nadie opera lo que se construye.</w:t>
       </w:r>
     </w:p>
-    <w:bookmarkStart w:id="71" w:name="diagnóstico-la-trampa-del-abandono"/>
+    <w:bookmarkStart w:id="78" w:name="diagnóstico-la-trampa-del-abandono"/>
     <w:p>
       <w:pPr>
         <w:pStyle w:val="Heading2"/>
@@ -14305,8 +15528,8 @@
         <w:t xml:space="preserve">De 684 plantas evaluadas por la Contraloría, solo el 39% funciona. El problema no es fiscal ni técnico, es de diseño contractual: el contrato de obra no incluía el de operación. El MinVivienda ejecutó históricamente apenas el 7.2% de los recursos de agua y en 2025 recortó el presupuesto 53%.</w:t>
       </w:r>
     </w:p>
-    <w:bookmarkEnd w:id="71"/>
-    <w:bookmarkStart w:id="72" w:name="X001e9a38f418189df669e4f2b3742056f9bbc02"/>
+    <w:bookmarkEnd w:id="78"/>
+    <w:bookmarkStart w:id="79" w:name="X001e9a38f418189df669e4f2b3742056f9bbc02"/>
     <w:p>
       <w:pPr>
         <w:pStyle w:val="Heading2"/>
@@ -14605,8 +15828,8 @@
         </w:tc>
       </w:tr>
     </w:tbl>
-    <w:bookmarkEnd w:id="72"/>
-    <w:bookmarkStart w:id="73" w:name="Xa4cd304851d4a0bf90e4213a86ddfef360774c0"/>
+    <w:bookmarkEnd w:id="79"/>
+    <w:bookmarkStart w:id="80" w:name="Xa4cd304851d4a0bf90e4213a86ddfef360774c0"/>
     <w:p>
       <w:pPr>
         <w:pStyle w:val="Heading2"/>
@@ -15129,8 +16352,8 @@
         </w:tc>
       </w:tr>
     </w:tbl>
-    <w:bookmarkEnd w:id="73"/>
-    <w:bookmarkStart w:id="74" w:name="tecnologías-por-contexto"/>
+    <w:bookmarkEnd w:id="80"/>
+    <w:bookmarkStart w:id="81" w:name="tecnologías-por-contexto"/>
     <w:p>
       <w:pPr>
         <w:pStyle w:val="Heading2"/>
@@ -15406,8 +16629,8 @@
         </w:tc>
       </w:tr>
     </w:tbl>
-    <w:bookmarkEnd w:id="74"/>
-    <w:bookmarkStart w:id="75" w:name="el-impacto-en-empleo"/>
+    <w:bookmarkEnd w:id="81"/>
+    <w:bookmarkStart w:id="82" w:name="el-impacto-en-empleo"/>
     <w:p>
       <w:pPr>
         <w:pStyle w:val="Heading2"/>
@@ -15682,8 +16905,8 @@
         </w:tc>
       </w:tr>
     </w:tbl>
-    <w:bookmarkEnd w:id="75"/>
-    <w:bookmarkStart w:id="76" w:name="lo-que-no-promete-este-frente"/>
+    <w:bookmarkEnd w:id="82"/>
+    <w:bookmarkStart w:id="83" w:name="lo-que-no-promete-este-frente"/>
     <w:p>
       <w:pPr>
         <w:pStyle w:val="Heading2"/>
@@ -15758,9 +16981,9 @@
         <w:t xml:space="preserve">la tarifa regulada accesible, con subsidio cruzado y cofinanciación 3 años, es parte del diseño. Sin tarifa, la planta cierra.</w:t>
       </w:r>
     </w:p>
-    <w:bookmarkEnd w:id="76"/>
-    <w:bookmarkEnd w:id="77"/>
-    <w:bookmarkStart w:id="91" w:name="X4f62eec2f5b561c9a3006ff1624de90841123b4"/>
+    <w:bookmarkEnd w:id="83"/>
+    <w:bookmarkEnd w:id="84"/>
+    <w:bookmarkStart w:id="98" w:name="X4f62eec2f5b561c9a3006ff1624de90841123b4"/>
     <w:p>
       <w:pPr>
         <w:pStyle w:val="Heading1"/>
@@ -15801,7 +17024,7 @@
         <w:t xml:space="preserve">En 2025 el turismo generó $11.166 millones de dólares en divisas, superando por primera vez al carbón y al café juntos. El problema no es volumen, es distribución: el 92% de las reservas se concentra en Bogotá, Medellín y Cartagena.</w:t>
       </w:r>
     </w:p>
-    <w:bookmarkStart w:id="78" w:name="lo-que-el-programa-ya-da-a-las-ciudades"/>
+    <w:bookmarkStart w:id="85" w:name="lo-que-el-programa-ya-da-a-las-ciudades"/>
     <w:p>
       <w:pPr>
         <w:pStyle w:val="Heading2"/>
@@ -16025,8 +17248,8 @@
         </w:tc>
       </w:tr>
     </w:tbl>
-    <w:bookmarkEnd w:id="78"/>
-    <w:bookmarkStart w:id="79" w:name="X6effa46f43b0d00bec6789a5d55d6a8fdf78fc2"/>
+    <w:bookmarkEnd w:id="85"/>
+    <w:bookmarkStart w:id="86" w:name="X6effa46f43b0d00bec6789a5d55d6a8fdf78fc2"/>
     <w:p>
       <w:pPr>
         <w:pStyle w:val="Heading2"/>
@@ -16373,8 +17596,8 @@
         <w:t xml:space="preserve">La congestión de Bogotá cuesta ~$15 billones/año. Tres medidas de costo cero: incentivo tributario del 130% para teletrabajo verificable del 20% de la nómina; estándar técnico de conectividad domiciliaria como condición de las concesiones de espectro; y horarios escalonados en entidades del Estado en ciudades de más de 500.000 habitantes.</w:t>
       </w:r>
     </w:p>
-    <w:bookmarkEnd w:id="79"/>
-    <w:bookmarkStart w:id="88" w:name="X3bb78ace0de402ec778ca3bbacad90ae0c7952d"/>
+    <w:bookmarkEnd w:id="86"/>
+    <w:bookmarkStart w:id="95" w:name="X3bb78ace0de402ec778ca3bbacad90ae0c7952d"/>
     <w:p>
       <w:pPr>
         <w:pStyle w:val="Heading2"/>
@@ -16519,7 +17742,7 @@
         <w:t xml:space="preserve">a los nodos, no los reemplaza.</w:t>
       </w:r>
     </w:p>
-    <w:bookmarkStart w:id="80" w:name="X341be06a04fa5cc37ba2f7ed5953662c8f247e0"/>
+    <w:bookmarkStart w:id="87" w:name="X341be06a04fa5cc37ba2f7ed5953662c8f247e0"/>
     <w:p>
       <w:pPr>
         <w:pStyle w:val="Heading3"/>
@@ -16753,8 +17976,8 @@
         </w:tc>
       </w:tr>
     </w:tbl>
-    <w:bookmarkEnd w:id="80"/>
-    <w:bookmarkStart w:id="81" w:name="X3a26c1fbb94e9c58c15e5ffc2bc14e60aa837a2"/>
+    <w:bookmarkEnd w:id="87"/>
+    <w:bookmarkStart w:id="88" w:name="X3a26c1fbb94e9c58c15e5ffc2bc14e60aa837a2"/>
     <w:p>
       <w:pPr>
         <w:pStyle w:val="Heading3"/>
@@ -17006,8 +18229,8 @@
         </w:tc>
       </w:tr>
     </w:tbl>
-    <w:bookmarkEnd w:id="81"/>
-    <w:bookmarkStart w:id="82" w:name="X5826c0a2fdfb3dc8e5e521d287a14b0893cfbf6"/>
+    <w:bookmarkEnd w:id="88"/>
+    <w:bookmarkStart w:id="89" w:name="X5826c0a2fdfb3dc8e5e521d287a14b0893cfbf6"/>
     <w:p>
       <w:pPr>
         <w:pStyle w:val="Heading3"/>
@@ -17271,8 +18494,8 @@
         </w:tc>
       </w:tr>
     </w:tbl>
-    <w:bookmarkEnd w:id="82"/>
-    <w:bookmarkStart w:id="83" w:name="X12441944bc318c15c36eface9a40d0d7ffe3aed"/>
+    <w:bookmarkEnd w:id="89"/>
+    <w:bookmarkStart w:id="90" w:name="X12441944bc318c15c36eface9a40d0d7ffe3aed"/>
     <w:p>
       <w:pPr>
         <w:pStyle w:val="Heading3"/>
@@ -17522,8 +18745,8 @@
         </w:tc>
       </w:tr>
     </w:tbl>
-    <w:bookmarkEnd w:id="83"/>
-    <w:bookmarkStart w:id="84" w:name="Xfc0331b83edd36c564078cedb0f8608d2c60049"/>
+    <w:bookmarkEnd w:id="90"/>
+    <w:bookmarkStart w:id="91" w:name="Xfc0331b83edd36c564078cedb0f8608d2c60049"/>
     <w:p>
       <w:pPr>
         <w:pStyle w:val="Heading3"/>
@@ -17775,8 +18998,8 @@
         </w:tc>
       </w:tr>
     </w:tbl>
-    <w:bookmarkEnd w:id="84"/>
-    <w:bookmarkStart w:id="85" w:name="f.-la-ciudad-que-funciona"/>
+    <w:bookmarkEnd w:id="91"/>
+    <w:bookmarkStart w:id="92" w:name="f.-la-ciudad-que-funciona"/>
     <w:p>
       <w:pPr>
         <w:pStyle w:val="Heading3"/>
@@ -17793,8 +19016,8 @@
         <w:t xml:space="preserve">La congestión y la fricción urbana son un impuesto directo a la productividad de quien ya trabaja. Las palancas ya están en 12.2 (interoperabilidad del transporte, teletrabajo, formalización urbana); este módulo las reconoce explícitamente como política de productividad, no solo de movilidad.</w:t>
       </w:r>
     </w:p>
-    <w:bookmarkEnd w:id="85"/>
-    <w:bookmarkStart w:id="86" w:name="Xd443673e4132f70adfc516fc7bc8560ee242af9"/>
+    <w:bookmarkEnd w:id="92"/>
+    <w:bookmarkStart w:id="93" w:name="Xd443673e4132f70adfc516fc7bc8560ee242af9"/>
     <w:p>
       <w:pPr>
         <w:pStyle w:val="Heading3"/>
@@ -18032,8 +19255,8 @@
         </w:tc>
       </w:tr>
     </w:tbl>
-    <w:bookmarkEnd w:id="86"/>
-    <w:bookmarkStart w:id="87" w:name="una-advertencia-honesta"/>
+    <w:bookmarkEnd w:id="93"/>
+    <w:bookmarkStart w:id="94" w:name="una-advertencia-honesta"/>
     <w:p>
       <w:pPr>
         <w:pStyle w:val="Heading3"/>
@@ -18082,9 +19305,9 @@
         <w:t xml:space="preserve">(no a las grandes), ata todo apoyo a competencia y desempeño, y corre en paralelo a los nodos, no en su lugar. La tensión entre competitividad nacional y justicia territorial es real; el plan la asume con los ojos abiertos en vez de fingir que no existe.</w:t>
       </w:r>
     </w:p>
-    <w:bookmarkEnd w:id="87"/>
-    <w:bookmarkEnd w:id="88"/>
-    <w:bookmarkStart w:id="89" w:name="X1bba574aa25410650f7841df1158dd6ea3828c5"/>
+    <w:bookmarkEnd w:id="94"/>
+    <w:bookmarkEnd w:id="95"/>
+    <w:bookmarkStart w:id="96" w:name="X1bba574aa25410650f7841df1158dd6ea3828c5"/>
     <w:p>
       <w:pPr>
         <w:pStyle w:val="Heading2"/>
@@ -18546,8 +19769,8 @@
         </w:tc>
       </w:tr>
     </w:tbl>
-    <w:bookmarkEnd w:id="89"/>
-    <w:bookmarkStart w:id="90" w:name="Xf79264da502ae9ac5a1795ed90ae6eedd6d1f37"/>
+    <w:bookmarkEnd w:id="96"/>
+    <w:bookmarkStart w:id="97" w:name="Xf79264da502ae9ac5a1795ed90ae6eedd6d1f37"/>
     <w:p>
       <w:pPr>
         <w:pStyle w:val="Heading2"/>
@@ -18652,9 +19875,9 @@
         <w:t xml:space="preserve">.</w:t>
       </w:r>
     </w:p>
-    <w:bookmarkEnd w:id="90"/>
-    <w:bookmarkEnd w:id="91"/>
-    <w:bookmarkStart w:id="102" w:name="X3356fa1ebf2d69c2684f142fc61bec6de18686a"/>
+    <w:bookmarkEnd w:id="97"/>
+    <w:bookmarkEnd w:id="98"/>
+    <w:bookmarkStart w:id="109" w:name="X3356fa1ebf2d69c2684f142fc61bec6de18686a"/>
     <w:p>
       <w:pPr>
         <w:pStyle w:val="Heading1"/>
@@ -18683,7 +19906,7 @@
         <w:t xml:space="preserve">Este frente no es sobre valores declarados, es sobre la arquitectura institucional que los convierte en práctica verificable. La ética no cambia con campañas: cambia cuando se rediseña qué se premia y qué se castiga. El antirracismo y el anticlasismo no avanzan con discursos: avanzan cuando las brechas se miden, se publican y se vuelven indicadores de gestión.</w:t>
       </w:r>
     </w:p>
-    <w:bookmarkStart w:id="92" w:name="austeridad-republicana"/>
+    <w:bookmarkStart w:id="99" w:name="austeridad-republicana"/>
     <w:p>
       <w:pPr>
         <w:pStyle w:val="Heading2"/>
@@ -18959,8 +20182,8 @@
         </w:tc>
       </w:tr>
     </w:tbl>
-    <w:bookmarkEnd w:id="92"/>
-    <w:bookmarkStart w:id="93" w:name="Xbe1bc1ffe34ded2f92eda4082bd128705780a83"/>
+    <w:bookmarkEnd w:id="99"/>
+    <w:bookmarkStart w:id="100" w:name="Xbe1bc1ffe34ded2f92eda4082bd128705780a83"/>
     <w:p>
       <w:pPr>
         <w:pStyle w:val="Heading2"/>
@@ -19329,8 +20552,8 @@
         <w:t xml:space="preserve">del escenario base, no como la fuente que financia compromisos duros (ver Cuadro Fiscal). Los ahorros de eficiencia son históricamente difíciles de capturar a la escala proyectada; no se construye sobre ellos ningún gasto que no pueda sostenerse sin ellos.</w:t>
       </w:r>
     </w:p>
-    <w:bookmarkEnd w:id="93"/>
-    <w:bookmarkStart w:id="94" w:name="Xfebf870c2c394019a95ecc0180aa7025eb2a4af"/>
+    <w:bookmarkEnd w:id="100"/>
+    <w:bookmarkStart w:id="101" w:name="Xfebf870c2c394019a95ecc0180aa7025eb2a4af"/>
     <w:p>
       <w:pPr>
         <w:pStyle w:val="Heading2"/>
@@ -19664,8 +20887,8 @@
         </w:tc>
       </w:tr>
     </w:tbl>
-    <w:bookmarkEnd w:id="94"/>
-    <w:bookmarkStart w:id="95" w:name="X021ffd85052d4393a2d0f56afd4a3ff51f9fae0"/>
+    <w:bookmarkEnd w:id="101"/>
+    <w:bookmarkStart w:id="102" w:name="X021ffd85052d4393a2d0f56afd4a3ff51f9fae0"/>
     <w:p>
       <w:pPr>
         <w:pStyle w:val="Heading2"/>
@@ -19970,8 +21193,8 @@
         </w:tc>
       </w:tr>
     </w:tbl>
-    <w:bookmarkEnd w:id="95"/>
-    <w:bookmarkStart w:id="96" w:name="Xf5b4c686dba9c5577ecb87553f8f18292bc15b9"/>
+    <w:bookmarkEnd w:id="102"/>
+    <w:bookmarkStart w:id="103" w:name="Xf5b4c686dba9c5577ecb87553f8f18292bc15b9"/>
     <w:p>
       <w:pPr>
         <w:pStyle w:val="Heading2"/>
@@ -20247,8 +21470,8 @@
         </w:tc>
       </w:tr>
     </w:tbl>
-    <w:bookmarkEnd w:id="96"/>
-    <w:bookmarkStart w:id="97" w:name="X6089359649d7a4a7f1dd461f2e4ee211200a0d9"/>
+    <w:bookmarkEnd w:id="103"/>
+    <w:bookmarkStart w:id="104" w:name="X6089359649d7a4a7f1dd461f2e4ee211200a0d9"/>
     <w:p>
       <w:pPr>
         <w:pStyle w:val="Heading2"/>
@@ -20695,8 +21918,8 @@
         <w:t xml:space="preserve">en el período, por reasignación, corrección de brechas y formalización, no por nueva deuda.</w:t>
       </w:r>
     </w:p>
-    <w:bookmarkEnd w:id="97"/>
-    <w:bookmarkStart w:id="98" w:name="X380695f0c27088be8e420774f4e23f7c12a3c46"/>
+    <w:bookmarkEnd w:id="104"/>
+    <w:bookmarkStart w:id="105" w:name="X380695f0c27088be8e420774f4e23f7c12a3c46"/>
     <w:p>
       <w:pPr>
         <w:pStyle w:val="Heading2"/>
@@ -21018,8 +22241,8 @@
         </w:tc>
       </w:tr>
     </w:tbl>
-    <w:bookmarkEnd w:id="98"/>
-    <w:bookmarkStart w:id="99" w:name="los-ocho-mecanismos-de-diseño"/>
+    <w:bookmarkEnd w:id="105"/>
+    <w:bookmarkStart w:id="106" w:name="los-ocho-mecanismos-de-diseño"/>
     <w:p>
       <w:pPr>
         <w:pStyle w:val="Heading2"/>
@@ -21409,8 +22632,8 @@
         <w:t xml:space="preserve">. Una regla binaria robusta (alerta roja → congela desembolso) resiste la captura mejor que una fórmula elegante de siete variables con pesos exactos. Donde un mecanismo sea fino y gameable, se simplifica. La elegancia no es el objetivo, la resistencia a la captura sí.</w:t>
       </w:r>
     </w:p>
-    <w:bookmarkEnd w:id="99"/>
-    <w:bookmarkStart w:id="100" w:name="X48788df1506cb0a5518aa91f8d345153bda9c42"/>
+    <w:bookmarkEnd w:id="106"/>
+    <w:bookmarkStart w:id="107" w:name="X48788df1506cb0a5518aa91f8d345153bda9c42"/>
     <w:p>
       <w:pPr>
         <w:pStyle w:val="Heading2"/>
@@ -21801,8 +23024,8 @@
         </w:tc>
       </w:tr>
     </w:tbl>
-    <w:bookmarkEnd w:id="100"/>
-    <w:bookmarkStart w:id="101" w:name="X3427fda87ec4dbe2d4edb93053a5ae465351199"/>
+    <w:bookmarkEnd w:id="107"/>
+    <w:bookmarkStart w:id="108" w:name="X3427fda87ec4dbe2d4edb93053a5ae465351199"/>
     <w:p>
       <w:pPr>
         <w:pStyle w:val="Heading2"/>
@@ -22086,9 +23309,9 @@
         <w:t xml:space="preserve">El mecanismo más poderoso no es el castigo después del robo, es hacer que robar sea más difícil y costoso que cumplir. Cuando el alcalde sabe que la rendición en vivo tiene audiencia, que el interventor no lo eligió él, que el veedor tiene protección, y que perder los recursos del nodo destruye su capital político, el cálculo cambia. Eso es diseño de mecanismos: cambiar el cálculo sin cambiar a las personas.</w:t>
       </w:r>
     </w:p>
-    <w:bookmarkEnd w:id="101"/>
-    <w:bookmarkEnd w:id="102"/>
-    <w:bookmarkStart w:id="112" w:name="Xbc642ba39422177b7a477569c28a5373a2663f2"/>
+    <w:bookmarkEnd w:id="108"/>
+    <w:bookmarkEnd w:id="109"/>
+    <w:bookmarkStart w:id="119" w:name="Xbc642ba39422177b7a477569c28a5373a2663f2"/>
     <w:p>
       <w:pPr>
         <w:pStyle w:val="Heading1"/>
@@ -22128,7 +23351,7 @@
         <w:t xml:space="preserve">. Es: ¿podemos diseñar una institución tan valiosa que no querer servir sea la excepción? Si el servicio da competencias reales, conecta clases y contribuye a algo que importa, la voluntariedad emerge del valor, y la universalidad garantiza que eso ocurra para todos.</w:t>
       </w:r>
     </w:p>
-    <w:bookmarkStart w:id="103" w:name="por-qué-el-modelo-actual-falla"/>
+    <w:bookmarkStart w:id="110" w:name="por-qué-el-modelo-actual-falla"/>
     <w:p>
       <w:pPr>
         <w:pStyle w:val="Heading2"/>
@@ -22381,8 +23604,8 @@
         </w:tc>
       </w:tr>
     </w:tbl>
-    <w:bookmarkEnd w:id="103"/>
-    <w:bookmarkStart w:id="104" w:name="X8f4dbd14b20fbf0212aedf6d78669c95af2197b"/>
+    <w:bookmarkEnd w:id="110"/>
+    <w:bookmarkStart w:id="111" w:name="X8f4dbd14b20fbf0212aedf6d78669c95af2197b"/>
     <w:p>
       <w:pPr>
         <w:pStyle w:val="Heading2"/>
@@ -22665,8 +23888,8 @@
         </w:tc>
       </w:tr>
     </w:tbl>
-    <w:bookmarkEnd w:id="104"/>
-    <w:bookmarkStart w:id="105" w:name="X2ab33b8e26a824172e96759dd37ec715d0bd7d5"/>
+    <w:bookmarkEnd w:id="111"/>
+    <w:bookmarkStart w:id="112" w:name="X2ab33b8e26a824172e96759dd37ec715d0bd7d5"/>
     <w:p>
       <w:pPr>
         <w:pStyle w:val="Heading2"/>
@@ -23074,8 +24297,8 @@
         </w:tc>
       </w:tr>
     </w:tbl>
-    <w:bookmarkEnd w:id="105"/>
-    <w:bookmarkStart w:id="106" w:name="los-cuatro-mecanismos-de-diseño"/>
+    <w:bookmarkEnd w:id="112"/>
+    <w:bookmarkStart w:id="113" w:name="los-cuatro-mecanismos-de-diseño"/>
     <w:p>
       <w:pPr>
         <w:pStyle w:val="Heading2"/>
@@ -23156,8 +24379,8 @@
         <w:t xml:space="preserve">Además de la certificación SENA: 5 puntos en concursos de la Alta Dirección Pública, puntaje adicional en becas del Icetex y acceso prioritario al crédito del Banco Agrario. Beneficios atados a la credencial (emitida por el SENA, entidad de carrera autónoma), no al gobierno que la otorgó.</w:t>
       </w:r>
     </w:p>
-    <w:bookmarkEnd w:id="106"/>
-    <w:bookmarkStart w:id="107" w:name="X73188e79240bf31e3872e4b857e6e02a31de94f"/>
+    <w:bookmarkEnd w:id="113"/>
+    <w:bookmarkStart w:id="114" w:name="X73188e79240bf31e3872e4b857e6e02a31de94f"/>
     <w:p>
       <w:pPr>
         <w:pStyle w:val="Heading2"/>
@@ -23401,8 +24624,8 @@
         <w:t xml:space="preserve">si en el Año 2 la participación voluntaria supera el 80% de la meta, la universalidad obligatoria entra sin resistencia. Si no, la meta del Año 2 se recorre, pero no se abandona la universalidad: se revisa el valor del servicio, no la ambición.</w:t>
       </w:r>
     </w:p>
-    <w:bookmarkEnd w:id="107"/>
-    <w:bookmarkStart w:id="108" w:name="lo-que-produce-el-triple-resultado"/>
+    <w:bookmarkEnd w:id="114"/>
+    <w:bookmarkStart w:id="115" w:name="lo-que-produce-el-triple-resultado"/>
     <w:p>
       <w:pPr>
         <w:pStyle w:val="Heading2"/>
@@ -23628,8 +24851,8 @@
         </w:tc>
       </w:tr>
     </w:tbl>
-    <w:bookmarkEnd w:id="108"/>
-    <w:bookmarkStart w:id="109" w:name="dih-y-ética-no-negociable"/>
+    <w:bookmarkEnd w:id="115"/>
+    <w:bookmarkStart w:id="116" w:name="dih-y-ética-no-negociable"/>
     <w:p>
       <w:pPr>
         <w:pStyle w:val="Heading2"/>
@@ -23646,8 +24869,8 @@
         <w:t xml:space="preserve">80 horas obligatorias de DIH y ética militar (modalidad de defensa) y 40 de derechos fundamentales (ambiental y comunitaria), con peso igual al desempeño técnico. Una calificación deficiente bloquea el ascenso. Toda denuncia de violación de derechos tiene canal expedito (respuesta máx. 10 días) y protección al denunciante. La responsabilidad de mando aplica desde el primer día.</w:t>
       </w:r>
     </w:p>
-    <w:bookmarkEnd w:id="109"/>
-    <w:bookmarkStart w:id="110" w:name="costo-fiscal-con-honestidad"/>
+    <w:bookmarkEnd w:id="116"/>
+    <w:bookmarkStart w:id="117" w:name="costo-fiscal-con-honestidad"/>
     <w:p>
       <w:pPr>
         <w:pStyle w:val="Heading2"/>
@@ -24328,8 +25551,8 @@
         <w:t xml:space="preserve">se materializan, pero el programa no asume que se materializan. Las dos descargas (valor producido por brigadas y subsidios desplazados) son verificables y se mantienen como compensación; la optimización del Estado se trata como margen adicional, no como supuesto que cierra la cuenta.</w:t>
       </w:r>
     </w:p>
-    <w:bookmarkEnd w:id="110"/>
-    <w:bookmarkStart w:id="111" w:name="X520263755f37ebc0e296910b9442e90a6499dff"/>
+    <w:bookmarkEnd w:id="117"/>
+    <w:bookmarkStart w:id="118" w:name="X520263755f37ebc0e296910b9442e90a6499dff"/>
     <w:p>
       <w:pPr>
         <w:pStyle w:val="Heading2"/>
@@ -24560,9 +25783,9 @@
         </w:pict>
       </w:r>
     </w:p>
-    <w:bookmarkEnd w:id="111"/>
-    <w:bookmarkEnd w:id="112"/>
-    <w:bookmarkStart w:id="113" w:name="X3faac5e722218683f840905436c1ce8f1f456b4"/>
+    <w:bookmarkEnd w:id="118"/>
+    <w:bookmarkEnd w:id="119"/>
+    <w:bookmarkStart w:id="120" w:name="X3faac5e722218683f840905436c1ce8f1f456b4"/>
     <w:p>
       <w:pPr>
         <w:pStyle w:val="Heading1"/>
@@ -24939,8 +26162,8 @@
         </w:pict>
       </w:r>
     </w:p>
-    <w:bookmarkEnd w:id="113"/>
-    <w:bookmarkStart w:id="117" w:name="viabilidad-jurídica-de-los-mecanismos"/>
+    <w:bookmarkEnd w:id="120"/>
+    <w:bookmarkStart w:id="124" w:name="viabilidad-jurídica-de-los-mecanismos"/>
     <w:p>
       <w:pPr>
         <w:pStyle w:val="Heading1"/>
@@ -24995,7 +26218,7 @@
         <w:t xml:space="preserve">Verificación (junio 2026): esta clasificación se contrastó con el estado actual del derecho colombiano. Hallazgos: (a) la Jurisdicción Agraria y Rural ya está creada (AL 03/2023 + Ley Estatutaria 2570/2026), el plan la implementa, no la crea; (b) el catastro multipropósito ya es servicio público (Ley 1955/2019, Decreto 148/2020), ejecutable por vía administrativa; (c) la objeción de conciencia exige ley estatutaria y su diseño es constitucionalmente discutible; (d) la interventoría nacional sobre territorios y la condicionalidad de transferencias constitucionales (SGP/regalías) no se logran por decreto/circular. Las filas afectadas están marcadas.</w:t>
       </w:r>
     </w:p>
-    <w:bookmarkStart w:id="114" w:name="qué-puede-cada-instrumento"/>
+    <w:bookmarkStart w:id="121" w:name="qué-puede-cada-instrumento"/>
     <w:p>
       <w:pPr>
         <w:pStyle w:val="Heading2"/>
@@ -25376,8 +26599,8 @@
         </w:tc>
       </w:tr>
     </w:tbl>
-    <w:bookmarkEnd w:id="114"/>
-    <w:bookmarkStart w:id="115" w:name="Xe6c0699dc55585295c7afbed3421e73e8534581"/>
+    <w:bookmarkEnd w:id="121"/>
+    <w:bookmarkStart w:id="122" w:name="Xe6c0699dc55585295c7afbed3421e73e8534581"/>
     <w:p>
       <w:pPr>
         <w:pStyle w:val="Heading2"/>
@@ -26400,8 +27623,8 @@
         </w:tc>
       </w:tr>
     </w:tbl>
-    <w:bookmarkEnd w:id="115"/>
-    <w:bookmarkStart w:id="116" w:name="la-estrategia-de-secuencia-legislativa"/>
+    <w:bookmarkEnd w:id="122"/>
+    <w:bookmarkStart w:id="123" w:name="la-estrategia-de-secuencia-legislativa"/>
     <w:p>
       <w:pPr>
         <w:pStyle w:val="Heading2"/>
@@ -26454,9 +27677,9 @@
         </w:pict>
       </w:r>
     </w:p>
-    <w:bookmarkEnd w:id="116"/>
-    <w:bookmarkEnd w:id="117"/>
-    <w:bookmarkStart w:id="123" w:name="cuadro-fiscal-de-dos-escenarios"/>
+    <w:bookmarkEnd w:id="123"/>
+    <w:bookmarkEnd w:id="124"/>
+    <w:bookmarkStart w:id="130" w:name="cuadro-fiscal-de-dos-escenarios"/>
     <w:p>
       <w:pPr>
         <w:pStyle w:val="Heading1"/>
@@ -26486,7 +27709,7 @@
         <w:t xml:space="preserve">.</w:t>
       </w:r>
     </w:p>
-    <w:bookmarkStart w:id="118" w:name="punto-de-partida"/>
+    <w:bookmarkStart w:id="125" w:name="punto-de-partida"/>
     <w:p>
       <w:pPr>
         <w:pStyle w:val="Heading2"/>
@@ -26503,8 +27726,8 @@
         <w:t xml:space="preserve">Déficit ~6.4-7% del PIB; deuda hacia el 70%; calificación BB; 1 de cada 3 pesos del presupuesto en intereses.</w:t>
       </w:r>
     </w:p>
-    <w:bookmarkEnd w:id="118"/>
-    <w:bookmarkStart w:id="119" w:name="escenario-base-sin-reforma-tributaria"/>
+    <w:bookmarkEnd w:id="125"/>
+    <w:bookmarkStart w:id="126" w:name="escenario-base-sin-reforma-tributaria"/>
     <w:p>
       <w:pPr>
         <w:pStyle w:val="Heading2"/>
@@ -26812,8 +28035,8 @@
         <w:t xml:space="preserve">Ningún compromiso duro del núcleo se construye sobre el dividendo ético ni sobre la reforma tributaria.</w:t>
       </w:r>
     </w:p>
-    <w:bookmarkEnd w:id="119"/>
-    <w:bookmarkStart w:id="120" w:name="X469a5fa7720b6041b511ba7c856f00452ca54b6"/>
+    <w:bookmarkEnd w:id="126"/>
+    <w:bookmarkStart w:id="127" w:name="X469a5fa7720b6041b511ba7c856f00452ca54b6"/>
     <w:p>
       <w:pPr>
         <w:pStyle w:val="Heading2"/>
@@ -26938,8 +28161,8 @@
         <w:t xml:space="preserve">y adelanta la universalidad del Servicio, no habilita el núcleo, lo expande.</w:t>
       </w:r>
     </w:p>
-    <w:bookmarkEnd w:id="120"/>
-    <w:bookmarkStart w:id="121" w:name="senda-de-déficit-reconciliada"/>
+    <w:bookmarkEnd w:id="127"/>
+    <w:bookmarkStart w:id="128" w:name="senda-de-déficit-reconciliada"/>
     <w:p>
       <w:pPr>
         <w:pStyle w:val="Heading2"/>
@@ -27162,8 +28385,8 @@
         </w:tc>
       </w:tr>
     </w:tbl>
-    <w:bookmarkEnd w:id="121"/>
-    <w:bookmarkStart w:id="122" w:name="X9c418e63bddc0f86d9f158c9fa2c10f39119c03"/>
+    <w:bookmarkEnd w:id="128"/>
+    <w:bookmarkStart w:id="129" w:name="X9c418e63bddc0f86d9f158c9fa2c10f39119c03"/>
     <w:p>
       <w:pPr>
         <w:pStyle w:val="Heading2"/>
@@ -27406,9 +28629,9 @@
         </w:pict>
       </w:r>
     </w:p>
-    <w:bookmarkEnd w:id="122"/>
-    <w:bookmarkEnd w:id="123"/>
-    <w:bookmarkStart w:id="124" w:name="fundamentos-en-la-investigación-reciente"/>
+    <w:bookmarkEnd w:id="129"/>
+    <w:bookmarkEnd w:id="130"/>
+    <w:bookmarkStart w:id="131" w:name="fundamentos-en-la-investigación-reciente"/>
     <w:p>
       <w:pPr>
         <w:pStyle w:val="Heading1"/>
@@ -28181,8 +29404,8 @@
         </w:pict>
       </w:r>
     </w:p>
-    <w:bookmarkEnd w:id="124"/>
-    <w:bookmarkStart w:id="128" w:name="X63812107fc27b9894e947da83252cc3e34ce294"/>
+    <w:bookmarkEnd w:id="131"/>
+    <w:bookmarkStart w:id="135" w:name="X63812107fc27b9894e947da83252cc3e34ce294"/>
     <w:p>
       <w:pPr>
         <w:pStyle w:val="Heading1"/>
@@ -28217,7 +29440,7 @@
         <w:t xml:space="preserve">En 2025 el país logró el desempleo más bajo del siglo, pero la productividad por trabajador cayó cerca de 3,1% entre 2022 y 2025 y la productividad total de los factores apenas creció 0,9%. El empleo nuevo se concentra en servicios de baja productividad y el paso de trabajadores hacia sectores más productivos se redujo a la mitad en una década. Crear empleo formal y subir la productividad no son lo mismo, y el país lleva años demostrándolo. Sin productividad no hay competitividad, y sin competitividad el empleo que se crea es frágil.</w:t>
       </w:r>
     </w:p>
-    <w:bookmarkStart w:id="125" w:name="el-objetivo-nacional-con-metas-duras"/>
+    <w:bookmarkStart w:id="132" w:name="el-objetivo-nacional-con-metas-duras"/>
     <w:p>
       <w:pPr>
         <w:pStyle w:val="Heading2"/>
@@ -28601,8 +29824,8 @@
         <w:t xml:space="preserve">La productividad deja de ser un subproducto esperado y se vuelve un objetivo medido, con dueño y con tablero público, anclado al Sistema Nacional de Competitividad que ya existe en Colombia (Consejo Privado de Competitividad + DNP + DANE).</w:t>
       </w:r>
     </w:p>
-    <w:bookmarkEnd w:id="125"/>
-    <w:bookmarkStart w:id="126" w:name="las-palancas-fuertes-en-orden"/>
+    <w:bookmarkEnd w:id="132"/>
+    <w:bookmarkStart w:id="133" w:name="las-palancas-fuertes-en-orden"/>
     <w:p>
       <w:pPr>
         <w:pStyle w:val="Heading2"/>
@@ -28638,7 +29861,7 @@
         <w:t xml:space="preserve"> </w:t>
       </w:r>
       <w:r>
-        <w:t xml:space="preserve">La palanca de fondo y la más subestimada. El título convierte tierra muerta en colateral, el colateral en crédito, el crédito en la inversión que hoy falta, y el registro permite que la tierra fluya hacia quien la usa mejor. Ataca de raíz la mala asignación de recursos, que es el corazón del problema de productividad. Y ya tiene piso legal (servicio público desde 2019): es ejecución y financiación, no un pedido al Congreso.</w:t>
+        <w:t xml:space="preserve">La palanca de fondo y la más subestimada. El título convierte tierra muerta en colateral, el colateral en crédito, el crédito en la inversión que hoy falta, y el registro permite que la tierra fluya hacia quien la usa mejor. Ataca de raíz la mala asignación de recursos, que es el corazón del problema de productividad. Ya tiene piso legal (servicio público desde 2019): es ejecución y financiación, no un pedido al Congreso. El Módulo de Productividad Rural del Frente II convierte esa titulación en productividad medida (rendimiento por hectárea, valor agregado local, exportación agro).</w:t>
       </w:r>
     </w:p>
     <w:p>
@@ -28698,13 +29921,13 @@
           <w:bCs/>
           <w:b/>
         </w:rPr>
-        <w:t xml:space="preserve">Difusión tecnológica y de gestión (Módulo de Productividad Urbana, 12.3).</w:t>
+        <w:t xml:space="preserve">Difusión tecnológica y de gestión (Módulos de Productividad Urbana 12.3 y Rural del Frente II).</w:t>
       </w:r>
       <w:r>
         <w:t xml:space="preserve"> </w:t>
       </w:r>
       <w:r>
-        <w:t xml:space="preserve">La mayor ganancia no está en inventar sino en que la firma promedio adopte lo que ya existe. El extensionismo para pymes mueve la media de todo el parque empresarial. Barato y enteramente ejecutivo.</w:t>
+        <w:t xml:space="preserve">La mayor ganancia no está en inventar sino en que el productor promedio adopte lo que ya existe. El extensionismo para pymes urbanas y la extensión agropecuaria moderna mueven la media de todo el aparato productivo, en la ciudad y en el campo. Barato y enteramente ejecutivo.</w:t>
       </w:r>
     </w:p>
     <w:p>
@@ -28813,8 +30036,8 @@
         <w:t xml:space="preserve">SENA dual pegado a los vectores de cada nodo, recualificación del trabajador en activo, reconocimiento de aprendizajes previos. La palanca más lenta y la de mayor retorno.</w:t>
       </w:r>
     </w:p>
-    <w:bookmarkEnd w:id="126"/>
-    <w:bookmarkStart w:id="127" w:name="Xe0242f5602f4db7493a3d4c5a801923b610b7a1"/>
+    <w:bookmarkEnd w:id="133"/>
+    <w:bookmarkStart w:id="134" w:name="Xe0242f5602f4db7493a3d4c5a801923b610b7a1"/>
     <w:p>
       <w:pPr>
         <w:pStyle w:val="Heading2"/>
@@ -28856,9 +30079,9 @@
         </w:pict>
       </w:r>
     </w:p>
-    <w:bookmarkEnd w:id="127"/>
-    <w:bookmarkEnd w:id="128"/>
-    <w:bookmarkStart w:id="131" w:name="secuencia-de-gobierno"/>
+    <w:bookmarkEnd w:id="134"/>
+    <w:bookmarkEnd w:id="135"/>
+    <w:bookmarkStart w:id="138" w:name="secuencia-de-gobierno"/>
     <w:p>
       <w:pPr>
         <w:pStyle w:val="Heading1"/>
@@ -28867,7 +30090,7 @@
         <w:t xml:space="preserve">Secuencia de Gobierno</w:t>
       </w:r>
     </w:p>
-    <w:bookmarkStart w:id="129" w:name="X3f19c8a57f0489f02498b4816e1596433230a25"/>
+    <w:bookmarkStart w:id="136" w:name="X3f19c8a57f0489f02498b4816e1596433230a25"/>
     <w:p>
       <w:pPr>
         <w:pStyle w:val="Heading2"/>
@@ -28974,8 +30197,8 @@
         <w:t xml:space="preserve">Mesas de trabajo con los directivos de las 10 entidades más críticas para negociar por anticipado los compromisos del Año 1, formalizados en actas públicas el día de posesión.</w:t>
       </w:r>
     </w:p>
-    <w:bookmarkEnd w:id="129"/>
-    <w:bookmarkStart w:id="130" w:name="tabla-de-secuencia"/>
+    <w:bookmarkEnd w:id="136"/>
+    <w:bookmarkStart w:id="137" w:name="tabla-de-secuencia"/>
     <w:p>
       <w:pPr>
         <w:pStyle w:val="Heading2"/>
@@ -29268,9 +30491,9 @@
         </w:pict>
       </w:r>
     </w:p>
-    <w:bookmarkEnd w:id="130"/>
-    <w:bookmarkEnd w:id="131"/>
-    <w:bookmarkStart w:id="132" w:name="medición-y-blindaje"/>
+    <w:bookmarkEnd w:id="137"/>
+    <w:bookmarkEnd w:id="138"/>
+    <w:bookmarkStart w:id="139" w:name="medición-y-blindaje"/>
     <w:p>
       <w:pPr>
         <w:pStyle w:val="Heading1"/>
@@ -30153,8 +31376,8 @@
         </w:pict>
       </w:r>
     </w:p>
-    <w:bookmarkEnd w:id="132"/>
-    <w:bookmarkStart w:id="133" w:name="riesgos-y-límites-honestos"/>
+    <w:bookmarkEnd w:id="139"/>
+    <w:bookmarkStart w:id="140" w:name="riesgos-y-límites-honestos"/>
     <w:p>
       <w:pPr>
         <w:pStyle w:val="Heading1"/>
@@ -30782,8 +32005,8 @@
         </w:pict>
       </w:r>
     </w:p>
-    <w:bookmarkEnd w:id="133"/>
-    <w:bookmarkStart w:id="134" w:name="el-patriotismo-como-resultado"/>
+    <w:bookmarkEnd w:id="140"/>
+    <w:bookmarkStart w:id="141" w:name="el-patriotismo-como-resultado"/>
     <w:p>
       <w:pPr>
         <w:pStyle w:val="Heading1"/>
@@ -30823,8 +32046,8 @@
         </w:pict>
       </w:r>
     </w:p>
-    <w:bookmarkEnd w:id="134"/>
-    <w:bookmarkStart w:id="138" w:name="hitos-de-credibilidad-política"/>
+    <w:bookmarkEnd w:id="141"/>
+    <w:bookmarkStart w:id="145" w:name="hitos-de-credibilidad-política"/>
     <w:p>
       <w:pPr>
         <w:pStyle w:val="Heading1"/>
@@ -30841,7 +32064,7 @@
         <w:t xml:space="preserve">Las victorias tempranas no tienen que ser las más grandes, tienen que ser las más irreversibles (y, ahora, las más legítimas).</w:t>
       </w:r>
     </w:p>
-    <w:bookmarkStart w:id="135" w:name="transición-mayo-julio-2026"/>
+    <w:bookmarkStart w:id="142" w:name="transición-mayo-julio-2026"/>
     <w:p>
       <w:pPr>
         <w:pStyle w:val="Heading2"/>
@@ -31094,8 +32317,8 @@
         </w:tc>
       </w:tr>
     </w:tbl>
-    <w:bookmarkEnd w:id="135"/>
-    <w:bookmarkStart w:id="136" w:name="X570d003b3f7a6d5463237df464eec852c2a2ca2"/>
+    <w:bookmarkEnd w:id="142"/>
+    <w:bookmarkStart w:id="143" w:name="X570d003b3f7a6d5463237df464eec852c2a2ca2"/>
     <w:p>
       <w:pPr>
         <w:pStyle w:val="Heading2"/>
@@ -31331,8 +32554,8 @@
         </w:tc>
       </w:tr>
     </w:tbl>
-    <w:bookmarkEnd w:id="136"/>
-    <w:bookmarkStart w:id="137" w:name="X6f4e29709717963d9784af7e46298c64eca3086"/>
+    <w:bookmarkEnd w:id="143"/>
+    <w:bookmarkStart w:id="144" w:name="X6f4e29709717963d9784af7e46298c64eca3086"/>
     <w:p>
       <w:pPr>
         <w:pStyle w:val="Heading2"/>
@@ -31782,9 +33005,9 @@
         </w:pict>
       </w:r>
     </w:p>
-    <w:bookmarkEnd w:id="137"/>
-    <w:bookmarkEnd w:id="138"/>
-    <w:bookmarkStart w:id="145" w:name="X812fbe57f7047e7cc2b3d123e211b38b27f1044"/>
+    <w:bookmarkEnd w:id="144"/>
+    <w:bookmarkEnd w:id="145"/>
+    <w:bookmarkStart w:id="152" w:name="X812fbe57f7047e7cc2b3d123e211b38b27f1044"/>
     <w:p>
       <w:pPr>
         <w:pStyle w:val="Heading1"/>
@@ -31877,7 +33100,7 @@
         <w:t xml:space="preserve">IRCTC, fundada en 1999 como subsidiaria de Ferrocarriles de la India, se convirtió en una de las plataformas de viajes más concurridas del mundo, con cientos de miles de reservas diarias. No compitió con Airbnb globalmente, dominó su propio mercado con acceso a infraestructura estatal que ningún privado podía tener. En 2019 salió a bolsa manteniendo el Estado la mayoría del capital. Ese es el modelo.</w:t>
       </w:r>
     </w:p>
-    <w:bookmarkStart w:id="139" w:name="X13e252fe4095065decc34bd8793323709d4f723"/>
+    <w:bookmarkStart w:id="146" w:name="X13e252fe4095065decc34bd8793323709d4f723"/>
     <w:p>
       <w:pPr>
         <w:pStyle w:val="Heading2"/>
@@ -32054,8 +33277,8 @@
         </w:tc>
       </w:tr>
     </w:tbl>
-    <w:bookmarkEnd w:id="139"/>
-    <w:bookmarkStart w:id="140" w:name="la-estructura-de-capital-mixto"/>
+    <w:bookmarkEnd w:id="146"/>
+    <w:bookmarkStart w:id="147" w:name="la-estructura-de-capital-mixto"/>
     <w:p>
       <w:pPr>
         <w:pStyle w:val="Heading2"/>
@@ -32281,8 +33504,8 @@
         </w:tc>
       </w:tr>
     </w:tbl>
-    <w:bookmarkEnd w:id="140"/>
-    <w:bookmarkStart w:id="141" w:name="Xc7cbb19aca36f8f2f8724853254f86e4657ef14"/>
+    <w:bookmarkEnd w:id="147"/>
+    <w:bookmarkStart w:id="148" w:name="Xc7cbb19aca36f8f2f8724853254f86e4657ef14"/>
     <w:p>
       <w:pPr>
         <w:pStyle w:val="Heading2"/>
@@ -32299,8 +33522,8 @@
         <w:t xml:space="preserve">Integración con infraestructura pública (disponibilidad de parques, estado de vías, permisos en territorios étnicos, alertas de seguridad por municipio desde la plataforma de trazabilidad), Airbnb no tiene acceso a esos datos. Verificación de calidad con consecuencias reales (el sello no es una estrella comprable sino certificación física del SENA; perderlo baja el ranking automáticamente). Comisión del 8% frente a 15-20% (la estructura de costos de Airbnb la obliga a comisiones altas; Colombia Viva no la tiene). Pagos sin fricción en moneda local (PSE, Nequi, Daviplata; integración con sistemas de Ecuador, Perú y Brasil), relaciones con el sistema financiero que a una empresa extranjera le toman años.</w:t>
       </w:r>
     </w:p>
-    <w:bookmarkEnd w:id="141"/>
-    <w:bookmarkStart w:id="142" w:name="el-modelo-financiero"/>
+    <w:bookmarkEnd w:id="148"/>
+    <w:bookmarkStart w:id="149" w:name="el-modelo-financiero"/>
     <w:p>
       <w:pPr>
         <w:pStyle w:val="Heading2"/>
@@ -32515,8 +33738,8 @@
         </w:tc>
       </w:tr>
     </w:tbl>
-    <w:bookmarkEnd w:id="142"/>
-    <w:bookmarkStart w:id="143" w:name="el-empleo-que-generaría"/>
+    <w:bookmarkEnd w:id="149"/>
+    <w:bookmarkStart w:id="150" w:name="el-empleo-que-generaría"/>
     <w:p>
       <w:pPr>
         <w:pStyle w:val="Heading2"/>
@@ -32739,8 +33962,8 @@
         </w:tc>
       </w:tr>
     </w:tbl>
-    <w:bookmarkEnd w:id="143"/>
-    <w:bookmarkStart w:id="144" w:name="riesgos-y-mitigaciones"/>
+    <w:bookmarkEnd w:id="150"/>
+    <w:bookmarkStart w:id="151" w:name="riesgos-y-mitigaciones"/>
     <w:p>
       <w:pPr>
         <w:pStyle w:val="Heading2"/>
@@ -32963,8 +34186,8 @@
         <w:t xml:space="preserve">Colombia Viva no es la plataforma que compite con Airbnb en San Francisco. Es la que dominaría el turismo colombiano y latinoamericano con ventajas inimitables: datos públicos integrados, certificación con consecuencias, comisiones a la mitad y operadores dueños de su canal. El modelo IRCTC demostró que funciona, la diferencia es que aquí sería en turismo, no en trenes.</w:t>
       </w:r>
     </w:p>
-    <w:bookmarkEnd w:id="144"/>
-    <w:bookmarkEnd w:id="145"/>
+    <w:bookmarkEnd w:id="151"/>
+    <w:bookmarkEnd w:id="152"/>
     <w:sectPr/>
   </w:body>
 </w:document>

</xml_diff>

<commit_message>
v1.7: proceso de build (docs/ como fuente de verdad genera markdown completo y Word) + GitHub Actions
</commit_message>
<xml_diff>
--- a/dist/estado-en-el-territorio.docx
+++ b/dist/estado-en-el-territorio.docx
@@ -7,7 +7,7 @@
         <w:pStyle w:val="Title"/>
       </w:pPr>
       <w:r>
-        <w:t xml:space="preserve">Programa de Gobierno: Estado en el Territorio</w:t>
+        <w:t xml:space="preserve">PROGRAMA DE GOBIERNO: ESTADO EN EL TERRITORIO</w:t>
       </w:r>
     </w:p>
     <w:p>
@@ -65,7 +65,7 @@
         <w:pStyle w:val="Date"/>
       </w:pPr>
       <w:r>
-        <w:t xml:space="preserve">Versión</w:t>
+        <w:t xml:space="preserve">Version</w:t>
       </w:r>
       <w:r>
         <w:t xml:space="preserve"> </w:t>
@@ -83,19 +83,7 @@
         <w:t xml:space="preserve"> </w:t>
       </w:r>
       <w:r>
-        <w:t xml:space="preserve">integrada,</w:t>
-      </w:r>
-      <w:r>
-        <w:t xml:space="preserve"> </w:t>
-      </w:r>
-      <w:r>
-        <w:t xml:space="preserve">Junio</w:t>
-      </w:r>
-      <w:r>
-        <w:t xml:space="preserve"> </w:t>
-      </w:r>
-      <w:r>
-        <w:t xml:space="preserve">2026</w:t>
+        <w:t xml:space="preserve">integrada</w:t>
       </w:r>
     </w:p>
     <w:sdt>

</xml_diff>